<commit_message>
Updated template-testing if template code will work while in the footer.
</commit_message>
<xml_diff>
--- a/docassemble/CR234OnlineSecuredCashBondPostingAgreement/data/templates/CR234_Online_Secured_Cash_Bond_Posting_Agreement.docx
+++ b/docassemble/CR234OnlineSecuredCashBondPostingAgreement/data/templates/CR234_Online_Secured_Cash_Bond_Posting_Agreement.docx
@@ -1,6 +1,6 @@
 
 <file path=word/document.xml><?xml version="1.0" encoding="utf-8"?>
-<w:document xmlns:wpc="http://schemas.microsoft.com/office/word/2010/wordprocessingCanvas" xmlns:cx="http://schemas.microsoft.com/office/drawing/2014/chartex" xmlns:cx1="http://schemas.microsoft.com/office/drawing/2015/9/8/chartex" xmlns:cx2="http://schemas.microsoft.com/office/drawing/2015/10/21/chartex" xmlns:cx3="http://schemas.microsoft.com/office/drawing/2016/5/9/chartex" xmlns:cx4="http://schemas.microsoft.com/office/drawing/2016/5/10/chartex" xmlns:cx5="http://schemas.microsoft.com/office/drawing/2016/5/11/chartex" xmlns:cx6="http://schemas.microsoft.com/office/drawing/2016/5/12/chartex" xmlns:cx7="http://schemas.microsoft.com/office/drawing/2016/5/13/chartex" xmlns:cx8="http://schemas.microsoft.com/office/drawing/2016/5/14/chartex" xmlns:mc="http://schemas.openxmlformats.org/markup-compatibility/2006" xmlns:aink="http://schemas.microsoft.com/office/drawing/2016/ink" xmlns:am3d="http://schemas.microsoft.com/office/drawing/2017/model3d" xmlns:o="urn:schemas-microsoft-com:office:office" xmlns:r="http://schemas.openxmlformats.org/officeDocument/2006/relationships" xmlns:m="http://schemas.openxmlformats.org/officeDocument/2006/math" xmlns:v="urn:schemas-microsoft-com:vml" xmlns:wp14="http://schemas.microsoft.com/office/word/2010/wordprocessingDrawing" xmlns:wp="http://schemas.openxmlformats.org/drawingml/2006/wordprocessingDrawing" xmlns:w10="urn:schemas-microsoft-com:office:word" xmlns:w="http://schemas.openxmlformats.org/wordprocessingml/2006/main" xmlns:w14="http://schemas.microsoft.com/office/word/2010/wordml" xmlns:w15="http://schemas.microsoft.com/office/word/2012/wordml" xmlns:w16cex="http://schemas.microsoft.com/office/word/2018/wordml/cex" xmlns:w16cid="http://schemas.microsoft.com/office/word/2016/wordml/cid" xmlns:w16="http://schemas.microsoft.com/office/word/2018/wordml" xmlns:w16sdtdh="http://schemas.microsoft.com/office/word/2020/wordml/sdtdatahash" xmlns:w16se="http://schemas.microsoft.com/office/word/2015/wordml/symex" xmlns:wpg="http://schemas.microsoft.com/office/word/2010/wordprocessingGroup" xmlns:wpi="http://schemas.microsoft.com/office/word/2010/wordprocessingInk" xmlns:wne="http://schemas.microsoft.com/office/word/2006/wordml" xmlns:wps="http://schemas.microsoft.com/office/word/2010/wordprocessingShape" mc:Ignorable="w14 w15 w16se w16cid w16 w16cex w16sdtdh wp14">
+<w:document xmlns:wpc="http://schemas.microsoft.com/office/word/2010/wordprocessingCanvas" xmlns:cx="http://schemas.microsoft.com/office/drawing/2014/chartex" xmlns:cx1="http://schemas.microsoft.com/office/drawing/2015/9/8/chartex" xmlns:cx2="http://schemas.microsoft.com/office/drawing/2015/10/21/chartex" xmlns:cx3="http://schemas.microsoft.com/office/drawing/2016/5/9/chartex" xmlns:cx4="http://schemas.microsoft.com/office/drawing/2016/5/10/chartex" xmlns:cx5="http://schemas.microsoft.com/office/drawing/2016/5/11/chartex" xmlns:cx6="http://schemas.microsoft.com/office/drawing/2016/5/12/chartex" xmlns:cx7="http://schemas.microsoft.com/office/drawing/2016/5/13/chartex" xmlns:cx8="http://schemas.microsoft.com/office/drawing/2016/5/14/chartex" xmlns:mc="http://schemas.openxmlformats.org/markup-compatibility/2006" xmlns:aink="http://schemas.microsoft.com/office/drawing/2016/ink" xmlns:am3d="http://schemas.microsoft.com/office/drawing/2017/model3d" xmlns:o="urn:schemas-microsoft-com:office:office" xmlns:r="http://schemas.openxmlformats.org/officeDocument/2006/relationships" xmlns:m="http://schemas.openxmlformats.org/officeDocument/2006/math" xmlns:v="urn:schemas-microsoft-com:vml" xmlns:wp14="http://schemas.microsoft.com/office/word/2010/wordprocessingDrawing" xmlns:wp="http://schemas.openxmlformats.org/drawingml/2006/wordprocessingDrawing" xmlns:w10="urn:schemas-microsoft-com:office:word" xmlns:w="http://schemas.openxmlformats.org/wordprocessingml/2006/main" xmlns:w14="http://schemas.microsoft.com/office/word/2010/wordml" xmlns:w15="http://schemas.microsoft.com/office/word/2012/wordml" xmlns:w16cid="http://schemas.microsoft.com/office/word/2016/wordml/cid" xmlns:w16se="http://schemas.microsoft.com/office/word/2015/wordml/symex" xmlns:wpg="http://schemas.microsoft.com/office/word/2010/wordprocessingGroup" xmlns:wpi="http://schemas.microsoft.com/office/word/2010/wordprocessingInk" xmlns:wne="http://schemas.microsoft.com/office/word/2006/wordml" xmlns:wps="http://schemas.microsoft.com/office/word/2010/wordprocessingShape" mc:Ignorable="w14 w15 w16se w16cid wp14">
   <w:body>
     <w:p>
       <w:pPr>
@@ -170,7 +170,25 @@
           <w:sz w:val="22"/>
           <w:szCs w:val="22"/>
         </w:rPr>
-        <w:t>{%p if person_filing == “defendant” %}</w:t>
+        <w:t xml:space="preserve">{%p if </w:t>
+      </w:r>
+      <w:proofErr w:type="spellStart"/>
+      <w:r>
+        <w:rPr>
+          <w:rFonts w:ascii="Tahoma" w:hAnsi="Tahoma" w:cs="Tahoma"/>
+          <w:sz w:val="22"/>
+          <w:szCs w:val="22"/>
+        </w:rPr>
+        <w:t>person_filing</w:t>
+      </w:r>
+      <w:proofErr w:type="spellEnd"/>
+      <w:r>
+        <w:rPr>
+          <w:rFonts w:ascii="Tahoma" w:hAnsi="Tahoma" w:cs="Tahoma"/>
+          <w:sz w:val="22"/>
+          <w:szCs w:val="22"/>
+        </w:rPr>
+        <w:t xml:space="preserve"> == “defendant” %}</w:t>
       </w:r>
     </w:p>
     <w:p>
@@ -642,7 +660,25 @@
           <w:sz w:val="22"/>
           <w:szCs w:val="22"/>
         </w:rPr>
-        <w:t>{% if person_filing == “defendant” %}</w:t>
+        <w:t xml:space="preserve">{% if </w:t>
+      </w:r>
+      <w:proofErr w:type="spellStart"/>
+      <w:r>
+        <w:rPr>
+          <w:rFonts w:ascii="Tahoma" w:hAnsi="Tahoma" w:cs="Tahoma"/>
+          <w:sz w:val="22"/>
+          <w:szCs w:val="22"/>
+        </w:rPr>
+        <w:t>person_filing</w:t>
+      </w:r>
+      <w:proofErr w:type="spellEnd"/>
+      <w:r>
+        <w:rPr>
+          <w:rFonts w:ascii="Tahoma" w:hAnsi="Tahoma" w:cs="Tahoma"/>
+          <w:sz w:val="22"/>
+          <w:szCs w:val="22"/>
+        </w:rPr>
+        <w:t xml:space="preserve"> == “defendant” %}</w:t>
       </w:r>
       <w:r>
         <w:rPr>
@@ -876,7 +912,25 @@
           <w:sz w:val="22"/>
           <w:szCs w:val="22"/>
         </w:rPr>
-        <w:t>{% if person_filing == “defendant” %}</w:t>
+        <w:t xml:space="preserve">{% if </w:t>
+      </w:r>
+      <w:proofErr w:type="spellStart"/>
+      <w:r>
+        <w:rPr>
+          <w:rFonts w:ascii="Tahoma" w:hAnsi="Tahoma" w:cs="Tahoma"/>
+          <w:sz w:val="22"/>
+          <w:szCs w:val="22"/>
+        </w:rPr>
+        <w:t>person_filing</w:t>
+      </w:r>
+      <w:proofErr w:type="spellEnd"/>
+      <w:r>
+        <w:rPr>
+          <w:rFonts w:ascii="Tahoma" w:hAnsi="Tahoma" w:cs="Tahoma"/>
+          <w:sz w:val="22"/>
+          <w:szCs w:val="22"/>
+        </w:rPr>
+        <w:t xml:space="preserve"> == “defendant” %}</w:t>
       </w:r>
       <w:r>
         <w:rPr>
@@ -1087,14 +1141,46 @@
           <w:sz w:val="24"/>
           <w:szCs w:val="24"/>
         </w:rPr>
-        <w:t xml:space="preserve">{% if person_filing == “defendant” </w:t>
-      </w:r>
-      <w:r>
-        <w:rPr>
-          <w:sz w:val="24"/>
-          <w:szCs w:val="24"/>
-        </w:rPr>
-        <w:t xml:space="preserve">and money_deposit == </w:t>
+        <w:t xml:space="preserve">{% if </w:t>
+      </w:r>
+      <w:proofErr w:type="spellStart"/>
+      <w:r>
+        <w:rPr>
+          <w:sz w:val="24"/>
+          <w:szCs w:val="24"/>
+        </w:rPr>
+        <w:t>person_filing</w:t>
+      </w:r>
+      <w:proofErr w:type="spellEnd"/>
+      <w:r>
+        <w:rPr>
+          <w:sz w:val="24"/>
+          <w:szCs w:val="24"/>
+        </w:rPr>
+        <w:t xml:space="preserve"> == “defendant” </w:t>
+      </w:r>
+      <w:r>
+        <w:rPr>
+          <w:sz w:val="24"/>
+          <w:szCs w:val="24"/>
+        </w:rPr>
+        <w:t xml:space="preserve">and </w:t>
+      </w:r>
+      <w:proofErr w:type="spellStart"/>
+      <w:r>
+        <w:rPr>
+          <w:sz w:val="24"/>
+          <w:szCs w:val="24"/>
+        </w:rPr>
+        <w:t>money_deposit</w:t>
+      </w:r>
+      <w:proofErr w:type="spellEnd"/>
+      <w:r>
+        <w:rPr>
+          <w:sz w:val="24"/>
+          <w:szCs w:val="24"/>
+        </w:rPr>
+        <w:t xml:space="preserve"> == </w:t>
       </w:r>
       <w:r>
         <w:rPr>
@@ -1129,7 +1215,55 @@
           <w:sz w:val="24"/>
           <w:szCs w:val="24"/>
         </w:rPr>
-        <w:t xml:space="preserve">The court may use the money I deposit to pay my fine, judgment, or costs.{% elif person_filing == “defendant” and money_deposit == </w:t>
+        <w:t xml:space="preserve">The court may use the money I deposit to pay my fine, judgment, or costs.{% </w:t>
+      </w:r>
+      <w:proofErr w:type="spellStart"/>
+      <w:r>
+        <w:rPr>
+          <w:sz w:val="24"/>
+          <w:szCs w:val="24"/>
+        </w:rPr>
+        <w:t>elif</w:t>
+      </w:r>
+      <w:proofErr w:type="spellEnd"/>
+      <w:r>
+        <w:rPr>
+          <w:sz w:val="24"/>
+          <w:szCs w:val="24"/>
+        </w:rPr>
+        <w:t xml:space="preserve"> </w:t>
+      </w:r>
+      <w:proofErr w:type="spellStart"/>
+      <w:r>
+        <w:rPr>
+          <w:sz w:val="24"/>
+          <w:szCs w:val="24"/>
+        </w:rPr>
+        <w:t>person_filing</w:t>
+      </w:r>
+      <w:proofErr w:type="spellEnd"/>
+      <w:r>
+        <w:rPr>
+          <w:sz w:val="24"/>
+          <w:szCs w:val="24"/>
+        </w:rPr>
+        <w:t xml:space="preserve"> == “defendant” and </w:t>
+      </w:r>
+      <w:proofErr w:type="spellStart"/>
+      <w:r>
+        <w:rPr>
+          <w:sz w:val="24"/>
+          <w:szCs w:val="24"/>
+        </w:rPr>
+        <w:t>money_deposit</w:t>
+      </w:r>
+      <w:proofErr w:type="spellEnd"/>
+      <w:r>
+        <w:rPr>
+          <w:sz w:val="24"/>
+          <w:szCs w:val="24"/>
+        </w:rPr>
+        <w:t xml:space="preserve"> == </w:t>
       </w:r>
       <w:r>
         <w:rPr>
@@ -1179,7 +1313,55 @@
           <w:sz w:val="24"/>
           <w:szCs w:val="24"/>
         </w:rPr>
-        <w:t xml:space="preserve">{% elif person_filing == “obo” and money_deposit == </w:t>
+        <w:t xml:space="preserve">{% </w:t>
+      </w:r>
+      <w:proofErr w:type="spellStart"/>
+      <w:r>
+        <w:rPr>
+          <w:sz w:val="24"/>
+          <w:szCs w:val="24"/>
+        </w:rPr>
+        <w:t>elif</w:t>
+      </w:r>
+      <w:proofErr w:type="spellEnd"/>
+      <w:r>
+        <w:rPr>
+          <w:sz w:val="24"/>
+          <w:szCs w:val="24"/>
+        </w:rPr>
+        <w:t xml:space="preserve"> </w:t>
+      </w:r>
+      <w:proofErr w:type="spellStart"/>
+      <w:r>
+        <w:rPr>
+          <w:sz w:val="24"/>
+          <w:szCs w:val="24"/>
+        </w:rPr>
+        <w:t>person_filing</w:t>
+      </w:r>
+      <w:proofErr w:type="spellEnd"/>
+      <w:r>
+        <w:rPr>
+          <w:sz w:val="24"/>
+          <w:szCs w:val="24"/>
+        </w:rPr>
+        <w:t xml:space="preserve"> == “obo” and </w:t>
+      </w:r>
+      <w:proofErr w:type="spellStart"/>
+      <w:r>
+        <w:rPr>
+          <w:sz w:val="24"/>
+          <w:szCs w:val="24"/>
+        </w:rPr>
+        <w:t>money_deposit</w:t>
+      </w:r>
+      <w:proofErr w:type="spellEnd"/>
+      <w:r>
+        <w:rPr>
+          <w:sz w:val="24"/>
+          <w:szCs w:val="24"/>
+        </w:rPr>
+        <w:t xml:space="preserve"> == </w:t>
       </w:r>
       <w:r>
         <w:rPr>
@@ -1200,14 +1382,30 @@
           <w:sz w:val="24"/>
           <w:szCs w:val="24"/>
         </w:rPr>
-        <w:t>defendants[0].name</w:t>
-      </w:r>
-      <w:r>
-        <w:rPr>
-          <w:sz w:val="24"/>
-          <w:szCs w:val="24"/>
-        </w:rPr>
-        <w:t xml:space="preserve">.first </w:t>
+        <w:t>defendants[0].</w:t>
+      </w:r>
+      <w:proofErr w:type="spellStart"/>
+      <w:r>
+        <w:rPr>
+          <w:sz w:val="24"/>
+          <w:szCs w:val="24"/>
+        </w:rPr>
+        <w:t>name</w:t>
+      </w:r>
+      <w:r>
+        <w:rPr>
+          <w:sz w:val="24"/>
+          <w:szCs w:val="24"/>
+        </w:rPr>
+        <w:t>.first</w:t>
+      </w:r>
+      <w:proofErr w:type="spellEnd"/>
+      <w:r>
+        <w:rPr>
+          <w:sz w:val="24"/>
+          <w:szCs w:val="24"/>
+        </w:rPr>
+        <w:t xml:space="preserve"> </w:t>
       </w:r>
       <w:r>
         <w:rPr>
@@ -1236,8 +1434,17 @@
           <w:sz w:val="24"/>
           <w:szCs w:val="24"/>
         </w:rPr>
-        <w:t>defendants[0].name.first</w:t>
-      </w:r>
+        <w:t>defendants[0].</w:t>
+      </w:r>
+      <w:proofErr w:type="spellStart"/>
+      <w:r>
+        <w:rPr>
+          <w:sz w:val="24"/>
+          <w:szCs w:val="24"/>
+        </w:rPr>
+        <w:t>name.first</w:t>
+      </w:r>
+      <w:proofErr w:type="spellEnd"/>
       <w:r>
         <w:rPr>
           <w:sz w:val="24"/>
@@ -1456,7 +1663,25 @@
           <w:sz w:val="22"/>
           <w:szCs w:val="22"/>
         </w:rPr>
-        <w:t>{% if person_filing == “defendant” %}</w:t>
+        <w:t xml:space="preserve">{% if </w:t>
+      </w:r>
+      <w:proofErr w:type="spellStart"/>
+      <w:r>
+        <w:rPr>
+          <w:rFonts w:ascii="Tahoma" w:hAnsi="Tahoma" w:cs="Tahoma"/>
+          <w:sz w:val="22"/>
+          <w:szCs w:val="22"/>
+        </w:rPr>
+        <w:t>person_filing</w:t>
+      </w:r>
+      <w:proofErr w:type="spellEnd"/>
+      <w:r>
+        <w:rPr>
+          <w:rFonts w:ascii="Tahoma" w:hAnsi="Tahoma" w:cs="Tahoma"/>
+          <w:sz w:val="22"/>
+          <w:szCs w:val="22"/>
+        </w:rPr>
+        <w:t xml:space="preserve"> == “defendant” %}</w:t>
       </w:r>
       <w:r>
         <w:rPr>
@@ -1663,7 +1888,25 @@
           <w:sz w:val="22"/>
           <w:szCs w:val="22"/>
         </w:rPr>
-        <w:t>{%p if person_filing == “defendant” %}</w:t>
+        <w:t xml:space="preserve">{%p if </w:t>
+      </w:r>
+      <w:proofErr w:type="spellStart"/>
+      <w:r>
+        <w:rPr>
+          <w:rFonts w:ascii="Tahoma" w:hAnsi="Tahoma" w:cs="Tahoma"/>
+          <w:sz w:val="22"/>
+          <w:szCs w:val="22"/>
+        </w:rPr>
+        <w:t>person_filing</w:t>
+      </w:r>
+      <w:proofErr w:type="spellEnd"/>
+      <w:r>
+        <w:rPr>
+          <w:rFonts w:ascii="Tahoma" w:hAnsi="Tahoma" w:cs="Tahoma"/>
+          <w:sz w:val="22"/>
+          <w:szCs w:val="22"/>
+        </w:rPr>
+        <w:t xml:space="preserve"> == “defendant” %}</w:t>
       </w:r>
     </w:p>
     <w:p>
@@ -1768,16 +2011,8 @@
           <w:sz w:val="22"/>
           <w:szCs w:val="22"/>
         </w:rPr>
-        <w:t xml:space="preserve">If the defendant is in custody, the jail will not release them until the full bond amount has been posted for every case that has a bond requirement.  The court will only notify the jail </w:t>
-      </w:r>
-      <w:r>
-        <w:rPr>
-          <w:rFonts w:ascii="Tahoma" w:hAnsi="Tahoma" w:cs="Tahoma"/>
-          <w:sz w:val="22"/>
-          <w:szCs w:val="22"/>
-        </w:rPr>
         <w:lastRenderedPageBreak/>
-        <w:t xml:space="preserve">of bond payments made during </w:t>
+        <w:t xml:space="preserve">If the defendant is in custody, the jail will not release them until the full bond amount has been posted for every case that has a bond requirement.  The court will only notify the jail of bond payments made during </w:t>
       </w:r>
       <w:hyperlink r:id="rId9" w:history="1">
         <w:r>
@@ -1954,6 +2189,15 @@
         </w:rPr>
         <w:t xml:space="preserve">Use form </w:t>
       </w:r>
+      <w:r>
+        <w:rPr>
+          <w:rFonts w:ascii="Tahoma" w:hAnsi="Tahoma" w:cs="Tahoma"/>
+          <w:i/>
+          <w:sz w:val="22"/>
+          <w:szCs w:val="22"/>
+        </w:rPr>
+        <w:t xml:space="preserve">TF-955, available at </w:t>
+      </w:r>
       <w:hyperlink r:id="rId10" w:history="1">
         <w:r>
           <w:rPr>
@@ -1963,7 +2207,7 @@
             <w:sz w:val="22"/>
             <w:szCs w:val="22"/>
           </w:rPr>
-          <w:t>TF-955</w:t>
+          <w:t>https://public.courts.alaska.gov/web/forms/docs/TF-955.pdf</w:t>
         </w:r>
       </w:hyperlink>
       <w:r>
@@ -2024,15 +2268,33 @@
           <w:szCs w:val="22"/>
           <w:u w:val="single"/>
         </w:rPr>
-        <w:t>users[0].signature</w:t>
-      </w:r>
-      <w:r>
-        <w:rPr>
-          <w:sz w:val="24"/>
-          <w:szCs w:val="22"/>
-          <w:u w:val="single"/>
-        </w:rPr>
-        <w:t>.show(width=</w:t>
+        <w:t>users[0].</w:t>
+      </w:r>
+      <w:proofErr w:type="spellStart"/>
+      <w:r>
+        <w:rPr>
+          <w:sz w:val="24"/>
+          <w:szCs w:val="22"/>
+          <w:u w:val="single"/>
+        </w:rPr>
+        <w:t>signature</w:t>
+      </w:r>
+      <w:r>
+        <w:rPr>
+          <w:sz w:val="24"/>
+          <w:szCs w:val="22"/>
+          <w:u w:val="single"/>
+        </w:rPr>
+        <w:t>.show</w:t>
+      </w:r>
+      <w:proofErr w:type="spellEnd"/>
+      <w:r>
+        <w:rPr>
+          <w:sz w:val="24"/>
+          <w:szCs w:val="22"/>
+          <w:u w:val="single"/>
+        </w:rPr>
+        <w:t>(width=</w:t>
       </w:r>
       <w:r>
         <w:rPr>
@@ -2093,7 +2355,27 @@
           <w:u w:val="single"/>
           <w:shd w:val="clear" w:color="auto" w:fill="FFFFFF"/>
         </w:rPr>
-        <w:t>{{ format_date(today()) }}</w:t>
+        <w:t xml:space="preserve">{{ </w:t>
+      </w:r>
+      <w:proofErr w:type="spellStart"/>
+      <w:r>
+        <w:rPr>
+          <w:sz w:val="24"/>
+          <w:szCs w:val="24"/>
+          <w:u w:val="single"/>
+          <w:shd w:val="clear" w:color="auto" w:fill="FFFFFF"/>
+        </w:rPr>
+        <w:t>format_date</w:t>
+      </w:r>
+      <w:proofErr w:type="spellEnd"/>
+      <w:r>
+        <w:rPr>
+          <w:sz w:val="24"/>
+          <w:szCs w:val="24"/>
+          <w:u w:val="single"/>
+          <w:shd w:val="clear" w:color="auto" w:fill="FFFFFF"/>
+        </w:rPr>
+        <w:t>(today()) }}</w:t>
       </w:r>
       <w:r>
         <w:rPr>
@@ -2323,7 +2605,25 @@
           <w:szCs w:val="24"/>
           <w:u w:val="single"/>
         </w:rPr>
-        <w:t xml:space="preserve">users[0].mailing_address.on_one_line </w:t>
+        <w:t>users[0].</w:t>
+      </w:r>
+      <w:proofErr w:type="spellStart"/>
+      <w:r>
+        <w:rPr>
+          <w:sz w:val="24"/>
+          <w:szCs w:val="24"/>
+          <w:u w:val="single"/>
+        </w:rPr>
+        <w:t>mailing_address.on_one_line</w:t>
+      </w:r>
+      <w:proofErr w:type="spellEnd"/>
+      <w:r>
+        <w:rPr>
+          <w:sz w:val="24"/>
+          <w:szCs w:val="24"/>
+          <w:u w:val="single"/>
+        </w:rPr>
+        <w:t xml:space="preserve"> </w:t>
       </w:r>
       <w:r>
         <w:rPr>
@@ -2472,7 +2772,16 @@
           <w:szCs w:val="24"/>
           <w:u w:val="single"/>
         </w:rPr>
-        <w:t>.w</w:t>
+        <w:t>.</w:t>
+      </w:r>
+      <w:proofErr w:type="spellStart"/>
+      <w:r>
+        <w:rPr>
+          <w:sz w:val="24"/>
+          <w:szCs w:val="24"/>
+          <w:u w:val="single"/>
+        </w:rPr>
+        <w:t>w</w:t>
       </w:r>
       <w:r>
         <w:rPr>
@@ -2482,6 +2791,7 @@
         </w:rPr>
         <w:t>ork_phone</w:t>
       </w:r>
+      <w:proofErr w:type="spellEnd"/>
       <w:r>
         <w:rPr>
           <w:sz w:val="24"/>
@@ -2553,6 +2863,7 @@
         </w:rPr>
         <w:t>.</w:t>
       </w:r>
+      <w:proofErr w:type="spellStart"/>
       <w:r>
         <w:rPr>
           <w:sz w:val="24"/>
@@ -2569,6 +2880,7 @@
         </w:rPr>
         <w:t>_number</w:t>
       </w:r>
+      <w:proofErr w:type="spellEnd"/>
       <w:r>
         <w:rPr>
           <w:sz w:val="24"/>
@@ -2620,8 +2932,18 @@
           <w:szCs w:val="24"/>
           <w:u w:val="single"/>
         </w:rPr>
-        <w:t>users[0].mobile_phone</w:t>
-      </w:r>
+        <w:t>users[0].</w:t>
+      </w:r>
+      <w:proofErr w:type="spellStart"/>
+      <w:r>
+        <w:rPr>
+          <w:sz w:val="24"/>
+          <w:szCs w:val="24"/>
+          <w:u w:val="single"/>
+        </w:rPr>
+        <w:t>mobile_phone</w:t>
+      </w:r>
+      <w:proofErr w:type="spellEnd"/>
       <w:r>
         <w:rPr>
           <w:sz w:val="24"/>
@@ -2637,6 +2959,26 @@
           <w:u w:val="single"/>
         </w:rPr>
         <w:t>}}</w:t>
+      </w:r>
+    </w:p>
+    <w:bookmarkEnd w:id="0"/>
+    <w:p>
+      <w:pPr>
+        <w:rPr>
+          <w:rFonts w:ascii="Tahoma" w:hAnsi="Tahoma" w:cs="Tahoma"/>
+          <w:b/>
+          <w:sz w:val="22"/>
+          <w:szCs w:val="22"/>
+        </w:rPr>
+      </w:pPr>
+      <w:r>
+        <w:rPr>
+          <w:rFonts w:ascii="Tahoma" w:hAnsi="Tahoma" w:cs="Tahoma"/>
+          <w:b/>
+          <w:sz w:val="22"/>
+          <w:szCs w:val="22"/>
+        </w:rPr>
+        <w:br w:type="page"/>
       </w:r>
     </w:p>
     <w:p>
@@ -2645,111 +2987,132 @@
         <w:tabs>
           <w:tab w:val="clear" w:pos="8640"/>
         </w:tabs>
-        <w:spacing w:line="220" w:lineRule="exact"/>
         <w:ind w:left="-274"/>
-        <w:rPr>
-          <w:rFonts w:ascii="Tahoma" w:hAnsi="Tahoma" w:cs="Tahoma"/>
-        </w:rPr>
-      </w:pPr>
-      <w:r>
-        <w:rPr>
-          <w:rFonts w:ascii="Tahoma" w:hAnsi="Tahoma" w:cs="Tahoma"/>
-        </w:rPr>
-        <w:t>[</w:t>
-      </w:r>
+        <w:jc w:val="center"/>
+        <w:rPr>
+          <w:rFonts w:ascii="Tahoma" w:hAnsi="Tahoma" w:cs="Tahoma"/>
+          <w:sz w:val="22"/>
+          <w:szCs w:val="22"/>
+        </w:rPr>
+      </w:pPr>
       <w:r>
         <w:rPr>
           <w:rFonts w:ascii="Tahoma" w:hAnsi="Tahoma" w:cs="Tahoma"/>
           <w:b/>
-        </w:rPr>
-        <w:t>Instructions to clerk:</w:t>
-      </w:r>
-      <w:r>
-        <w:rPr>
-          <w:rFonts w:ascii="Tahoma" w:hAnsi="Tahoma" w:cs="Tahoma"/>
-        </w:rPr>
-        <w:t xml:space="preserve"> </w:t>
-      </w:r>
-      <w:r>
-        <w:rPr>
-          <w:rFonts w:ascii="Tahoma" w:hAnsi="Tahoma" w:cs="Tahoma"/>
-        </w:rPr>
-        <w:t>See</w:t>
-      </w:r>
-      <w:r>
-        <w:rPr>
-          <w:rFonts w:ascii="Tahoma" w:hAnsi="Tahoma" w:cs="Tahoma"/>
-        </w:rPr>
-        <w:t xml:space="preserve"> the </w:t>
-      </w:r>
-      <w:r>
-        <w:rPr>
-          <w:rFonts w:ascii="Tahoma" w:hAnsi="Tahoma" w:cs="Tahoma"/>
-        </w:rPr>
-        <w:t xml:space="preserve">defendant’s </w:t>
-      </w:r>
-      <w:r>
-        <w:rPr>
-          <w:rFonts w:ascii="Tahoma" w:hAnsi="Tahoma" w:cs="Tahoma"/>
-        </w:rPr>
-        <w:t xml:space="preserve">CR-233 </w:t>
+          <w:sz w:val="22"/>
+          <w:szCs w:val="22"/>
+        </w:rPr>
+        <w:lastRenderedPageBreak/>
+        <w:t xml:space="preserve">Instructions to </w:t>
+      </w:r>
+      <w:r>
+        <w:rPr>
+          <w:rFonts w:ascii="Tahoma" w:hAnsi="Tahoma" w:cs="Tahoma"/>
+          <w:b/>
+          <w:sz w:val="22"/>
+          <w:szCs w:val="22"/>
+        </w:rPr>
+        <w:t>C</w:t>
+      </w:r>
+      <w:r>
+        <w:rPr>
+          <w:rFonts w:ascii="Tahoma" w:hAnsi="Tahoma" w:cs="Tahoma"/>
+          <w:b/>
+          <w:sz w:val="22"/>
+          <w:szCs w:val="22"/>
+        </w:rPr>
+        <w:t>lerk</w:t>
+      </w:r>
+    </w:p>
+    <w:p>
+      <w:pPr>
+        <w:pStyle w:val="Footer"/>
+        <w:tabs>
+          <w:tab w:val="clear" w:pos="8640"/>
+        </w:tabs>
+        <w:ind w:left="-274"/>
+        <w:rPr>
+          <w:rFonts w:ascii="Tahoma" w:hAnsi="Tahoma" w:cs="Tahoma"/>
+          <w:b/>
+          <w:sz w:val="22"/>
+          <w:szCs w:val="22"/>
+        </w:rPr>
+      </w:pPr>
+    </w:p>
+    <w:p>
+      <w:pPr>
+        <w:pStyle w:val="Footer"/>
+        <w:tabs>
+          <w:tab w:val="clear" w:pos="8640"/>
+        </w:tabs>
+        <w:rPr>
+          <w:rFonts w:ascii="Tahoma" w:hAnsi="Tahoma" w:cs="Tahoma"/>
+          <w:sz w:val="22"/>
+          <w:szCs w:val="22"/>
+        </w:rPr>
+      </w:pPr>
+      <w:r>
+        <w:rPr>
+          <w:rFonts w:ascii="Tahoma" w:hAnsi="Tahoma" w:cs="Tahoma"/>
+          <w:sz w:val="22"/>
+          <w:szCs w:val="22"/>
+        </w:rPr>
+        <w:t xml:space="preserve">See the defendant’s CR-233 </w:t>
       </w:r>
       <w:r>
         <w:rPr>
           <w:rFonts w:ascii="Tahoma" w:hAnsi="Tahoma" w:cs="Tahoma"/>
           <w:i/>
           <w:iCs/>
-        </w:rPr>
-        <w:t>Notice of Request to Post Secured Cash Bail Online</w:t>
-      </w:r>
-      <w:r>
-        <w:rPr>
-          <w:rFonts w:ascii="Tahoma" w:hAnsi="Tahoma" w:cs="Tahoma"/>
-        </w:rPr>
-        <w:t xml:space="preserve"> for court case and bond requirement details.  </w:t>
-      </w:r>
-      <w:r>
-        <w:rPr>
-          <w:rFonts w:ascii="Tahoma" w:hAnsi="Tahoma" w:cs="Tahoma"/>
-        </w:rPr>
-        <w:t xml:space="preserve">If </w:t>
-      </w:r>
-      <w:r>
-        <w:rPr>
-          <w:rFonts w:ascii="Tahoma" w:hAnsi="Tahoma" w:cs="Tahoma"/>
-          <w:i/>
-        </w:rPr>
-        <w:t>both</w:t>
-      </w:r>
-      <w:r>
-        <w:rPr>
-          <w:rFonts w:ascii="Tahoma" w:hAnsi="Tahoma" w:cs="Tahoma"/>
-        </w:rPr>
-        <w:t xml:space="preserve"> appearance and performance bonds are </w:t>
-      </w:r>
-      <w:r>
-        <w:rPr>
-          <w:rFonts w:ascii="Tahoma" w:hAnsi="Tahoma" w:cs="Tahoma"/>
-        </w:rPr>
-        <w:t>checked</w:t>
-      </w:r>
-      <w:r>
-        <w:rPr>
-          <w:rFonts w:ascii="Tahoma" w:hAnsi="Tahoma" w:cs="Tahoma"/>
-        </w:rPr>
-        <w:t xml:space="preserve"> and posted</w:t>
-      </w:r>
-      <w:r>
-        <w:rPr>
-          <w:rFonts w:ascii="Tahoma" w:hAnsi="Tahoma" w:cs="Tahoma"/>
-        </w:rPr>
-        <w:t>, add separate bond records for each in CourtView.</w:t>
-      </w:r>
-      <w:r>
-        <w:rPr>
-          <w:rFonts w:ascii="Tahoma" w:hAnsi="Tahoma" w:cs="Tahoma"/>
-        </w:rPr>
-        <w:t>]</w:t>
+          <w:sz w:val="22"/>
+          <w:szCs w:val="22"/>
+        </w:rPr>
+        <w:t>Online Secured Cash Bond Posting Summary</w:t>
+      </w:r>
+      <w:r>
+        <w:rPr>
+          <w:rFonts w:ascii="Tahoma" w:hAnsi="Tahoma" w:cs="Tahoma"/>
+          <w:sz w:val="22"/>
+          <w:szCs w:val="22"/>
+        </w:rPr>
+        <w:t xml:space="preserve"> for court case and bond requirement details.  If </w:t>
+      </w:r>
+      <w:r>
+        <w:rPr>
+          <w:rFonts w:ascii="Tahoma" w:hAnsi="Tahoma" w:cs="Tahoma"/>
+          <w:b/>
+          <w:bCs/>
+          <w:iCs/>
+          <w:sz w:val="22"/>
+          <w:szCs w:val="22"/>
+        </w:rPr>
+        <w:t xml:space="preserve">both </w:t>
+      </w:r>
+      <w:r>
+        <w:rPr>
+          <w:rFonts w:ascii="Tahoma" w:hAnsi="Tahoma" w:cs="Tahoma"/>
+          <w:sz w:val="22"/>
+          <w:szCs w:val="22"/>
+        </w:rPr>
+        <w:t xml:space="preserve">appearance and performance bonds are checked and posted, add separate bond records for each in </w:t>
+      </w:r>
+      <w:proofErr w:type="spellStart"/>
+      <w:r>
+        <w:rPr>
+          <w:rFonts w:ascii="Tahoma" w:hAnsi="Tahoma" w:cs="Tahoma"/>
+          <w:sz w:val="22"/>
+          <w:szCs w:val="22"/>
+        </w:rPr>
+        <w:t>CourtView</w:t>
+      </w:r>
+      <w:proofErr w:type="spellEnd"/>
+      <w:r>
+        <w:rPr>
+          <w:rFonts w:ascii="Tahoma" w:hAnsi="Tahoma" w:cs="Tahoma"/>
+          <w:sz w:val="22"/>
+          <w:szCs w:val="22"/>
+        </w:rPr>
+        <w:t>.</w:t>
       </w:r>
     </w:p>
     <w:p>
@@ -2766,21 +3129,1060 @@
           <w:szCs w:val="22"/>
         </w:rPr>
       </w:pPr>
-      <w:r>
-        <w:rPr>
-          <w:rFonts w:ascii="Tahoma" w:hAnsi="Tahoma" w:cs="Tahoma"/>
-        </w:rPr>
-        <w:t>Distribution: (1) Court (2) Def. (3) Person depositing money (4) Jail, if Def. in custody (5) PED, if ordered</w:t>
-      </w:r>
-      <w:bookmarkEnd w:id="0"/>
+    </w:p>
+    <w:p>
+      <w:pPr>
+        <w:pStyle w:val="Footer"/>
+        <w:tabs>
+          <w:tab w:val="clear" w:pos="8640"/>
+        </w:tabs>
+        <w:spacing w:before="120" w:line="220" w:lineRule="exact"/>
+        <w:jc w:val="center"/>
+        <w:rPr>
+          <w:rFonts w:ascii="Tahoma" w:hAnsi="Tahoma" w:cs="Tahoma"/>
+          <w:b/>
+          <w:bCs/>
+          <w:sz w:val="22"/>
+          <w:szCs w:val="22"/>
+        </w:rPr>
+      </w:pPr>
+      <w:r>
+        <w:rPr>
+          <w:rFonts w:ascii="Tahoma" w:hAnsi="Tahoma" w:cs="Tahoma"/>
+          <w:b/>
+          <w:bCs/>
+          <w:sz w:val="22"/>
+          <w:szCs w:val="22"/>
+        </w:rPr>
+        <w:t xml:space="preserve">Distribution Instructions for </w:t>
+      </w:r>
+      <w:r>
+        <w:rPr>
+          <w:rFonts w:ascii="Tahoma" w:hAnsi="Tahoma" w:cs="Tahoma"/>
+          <w:b/>
+          <w:bCs/>
+          <w:sz w:val="22"/>
+          <w:szCs w:val="22"/>
+        </w:rPr>
+        <w:t>t</w:t>
+      </w:r>
+      <w:r>
+        <w:rPr>
+          <w:rFonts w:ascii="Tahoma" w:hAnsi="Tahoma" w:cs="Tahoma"/>
+          <w:b/>
+          <w:bCs/>
+          <w:sz w:val="22"/>
+          <w:szCs w:val="22"/>
+        </w:rPr>
+        <w:t>his Form</w:t>
+      </w:r>
+    </w:p>
+    <w:p>
+      <w:pPr>
+        <w:pStyle w:val="Footer"/>
+        <w:tabs>
+          <w:tab w:val="clear" w:pos="8640"/>
+        </w:tabs>
+        <w:spacing w:before="120" w:line="220" w:lineRule="exact"/>
+        <w:rPr>
+          <w:rFonts w:ascii="Tahoma" w:hAnsi="Tahoma" w:cs="Tahoma"/>
+          <w:bCs/>
+          <w:sz w:val="22"/>
+          <w:szCs w:val="22"/>
+        </w:rPr>
+      </w:pPr>
+      <w:bookmarkStart w:id="4" w:name="_Hlk193959420"/>
+      <w:r>
+        <w:rPr>
+          <w:rFonts w:ascii="Tahoma" w:hAnsi="Tahoma" w:cs="Tahoma"/>
+          <w:sz w:val="22"/>
+          <w:szCs w:val="22"/>
+        </w:rPr>
+        <w:t xml:space="preserve">{%p if </w:t>
+      </w:r>
+      <w:proofErr w:type="spellStart"/>
+      <w:r>
+        <w:rPr>
+          <w:rFonts w:ascii="Tahoma" w:hAnsi="Tahoma" w:cs="Tahoma"/>
+          <w:sz w:val="22"/>
+          <w:szCs w:val="22"/>
+        </w:rPr>
+        <w:t>person_filing</w:t>
+      </w:r>
+      <w:proofErr w:type="spellEnd"/>
+      <w:r>
+        <w:rPr>
+          <w:rFonts w:ascii="Tahoma" w:hAnsi="Tahoma" w:cs="Tahoma"/>
+          <w:sz w:val="22"/>
+          <w:szCs w:val="22"/>
+        </w:rPr>
+        <w:t xml:space="preserve"> == “defendant” %}</w:t>
+      </w:r>
+      <w:bookmarkEnd w:id="4"/>
+    </w:p>
+    <w:p>
+      <w:pPr>
+        <w:pStyle w:val="Footer"/>
+        <w:tabs>
+          <w:tab w:val="clear" w:pos="8640"/>
+          <w:tab w:val="right" w:pos="9450"/>
+        </w:tabs>
+        <w:spacing w:before="120"/>
+        <w:rPr>
+          <w:rFonts w:ascii="Tahoma" w:hAnsi="Tahoma" w:cs="Tahoma"/>
+          <w:sz w:val="22"/>
+          <w:szCs w:val="22"/>
+        </w:rPr>
+      </w:pPr>
+      <w:bookmarkStart w:id="5" w:name="_Hlk193049304"/>
+      <w:bookmarkStart w:id="6" w:name="_Hlk192677134"/>
+      <w:r>
+        <w:rPr>
+          <w:rFonts w:ascii="Tahoma" w:hAnsi="Tahoma" w:cs="Tahoma"/>
+          <w:sz w:val="22"/>
+          <w:szCs w:val="22"/>
+          <w:highlight w:val="yellow"/>
+          <w:u w:val="single"/>
+        </w:rPr>
+        <w:t>Online bail clerk</w:t>
+      </w:r>
+      <w:r>
+        <w:rPr>
+          <w:rFonts w:ascii="Tahoma" w:hAnsi="Tahoma" w:cs="Tahoma"/>
+          <w:sz w:val="22"/>
+          <w:szCs w:val="22"/>
+          <w:highlight w:val="yellow"/>
+          <w:u w:val="single"/>
+        </w:rPr>
+        <w:t xml:space="preserve"> (only show up for defendant posting on their own behalf)</w:t>
+      </w:r>
+    </w:p>
+    <w:p>
+      <w:pPr>
+        <w:pStyle w:val="Footer"/>
+        <w:tabs>
+          <w:tab w:val="clear" w:pos="8640"/>
+          <w:tab w:val="right" w:pos="9450"/>
+        </w:tabs>
+        <w:spacing w:before="120"/>
+        <w:rPr>
+          <w:rFonts w:ascii="Tahoma" w:hAnsi="Tahoma" w:cs="Tahoma"/>
+          <w:sz w:val="22"/>
+          <w:szCs w:val="22"/>
+        </w:rPr>
+      </w:pPr>
+      <w:bookmarkStart w:id="7" w:name="_Hlk193048742"/>
+      <w:r>
+        <w:rPr>
+          <w:rFonts w:ascii="Tahoma" w:hAnsi="Tahoma" w:cs="Tahoma"/>
+          <w:sz w:val="22"/>
+          <w:szCs w:val="22"/>
+        </w:rPr>
+        <w:t xml:space="preserve">Email a copy to the trial court for upload into OnBase when </w:t>
+      </w:r>
+    </w:p>
+    <w:p>
+      <w:pPr>
+        <w:pStyle w:val="Footer"/>
+        <w:numPr>
+          <w:ilvl w:val="0"/>
+          <w:numId w:val="8"/>
+        </w:numPr>
+        <w:tabs>
+          <w:tab w:val="clear" w:pos="8640"/>
+          <w:tab w:val="right" w:pos="9450"/>
+        </w:tabs>
+        <w:spacing w:before="20"/>
+        <w:rPr>
+          <w:rFonts w:ascii="Tahoma" w:hAnsi="Tahoma" w:cs="Tahoma"/>
+          <w:sz w:val="22"/>
+          <w:szCs w:val="22"/>
+        </w:rPr>
+      </w:pPr>
+      <w:r>
+        <w:rPr>
+          <w:rFonts w:ascii="Tahoma" w:hAnsi="Tahoma" w:cs="Tahoma"/>
+          <w:sz w:val="22"/>
+          <w:szCs w:val="22"/>
+        </w:rPr>
+        <w:t>a full b</w:t>
+      </w:r>
+      <w:r>
+        <w:rPr>
+          <w:rFonts w:ascii="Tahoma" w:hAnsi="Tahoma" w:cs="Tahoma"/>
+          <w:sz w:val="22"/>
+          <w:szCs w:val="22"/>
+        </w:rPr>
+        <w:t>ond</w:t>
+      </w:r>
+      <w:r>
+        <w:rPr>
+          <w:rFonts w:ascii="Tahoma" w:hAnsi="Tahoma" w:cs="Tahoma"/>
+          <w:sz w:val="22"/>
+          <w:szCs w:val="22"/>
+        </w:rPr>
+        <w:t xml:space="preserve"> payment is made</w:t>
+      </w:r>
+      <w:r>
+        <w:rPr>
+          <w:rFonts w:ascii="Tahoma" w:hAnsi="Tahoma" w:cs="Tahoma"/>
+          <w:sz w:val="22"/>
+          <w:szCs w:val="22"/>
+        </w:rPr>
+        <w:t>,</w:t>
+      </w:r>
+      <w:r>
+        <w:rPr>
+          <w:rFonts w:ascii="Tahoma" w:hAnsi="Tahoma" w:cs="Tahoma"/>
+          <w:sz w:val="22"/>
+          <w:szCs w:val="22"/>
+        </w:rPr>
+        <w:t xml:space="preserve"> </w:t>
+      </w:r>
+      <w:r>
+        <w:rPr>
+          <w:rFonts w:ascii="Tahoma" w:hAnsi="Tahoma" w:cs="Tahoma"/>
+          <w:b/>
+          <w:bCs/>
+          <w:sz w:val="22"/>
+          <w:szCs w:val="22"/>
+        </w:rPr>
+        <w:t>or</w:t>
+      </w:r>
+      <w:r>
+        <w:rPr>
+          <w:rFonts w:ascii="Tahoma" w:hAnsi="Tahoma" w:cs="Tahoma"/>
+          <w:sz w:val="22"/>
+          <w:szCs w:val="22"/>
+        </w:rPr>
+        <w:t xml:space="preserve"> </w:t>
+      </w:r>
+    </w:p>
+    <w:p>
+      <w:pPr>
+        <w:pStyle w:val="Footer"/>
+        <w:numPr>
+          <w:ilvl w:val="0"/>
+          <w:numId w:val="8"/>
+        </w:numPr>
+        <w:tabs>
+          <w:tab w:val="clear" w:pos="8640"/>
+          <w:tab w:val="right" w:pos="9450"/>
+        </w:tabs>
+        <w:spacing w:before="20"/>
+        <w:rPr>
+          <w:rFonts w:ascii="Tahoma" w:hAnsi="Tahoma" w:cs="Tahoma"/>
+          <w:sz w:val="22"/>
+          <w:szCs w:val="22"/>
+        </w:rPr>
+      </w:pPr>
+      <w:r>
+        <w:rPr>
+          <w:rFonts w:ascii="Tahoma" w:hAnsi="Tahoma" w:cs="Tahoma"/>
+          <w:sz w:val="22"/>
+          <w:szCs w:val="22"/>
+        </w:rPr>
+        <w:t xml:space="preserve">a partial bond payment is made </w:t>
+      </w:r>
+      <w:r>
+        <w:rPr>
+          <w:rFonts w:ascii="Tahoma" w:hAnsi="Tahoma" w:cs="Tahoma"/>
+          <w:b/>
+          <w:bCs/>
+          <w:sz w:val="22"/>
+          <w:szCs w:val="22"/>
+        </w:rPr>
+        <w:t>and the due date for posting b</w:t>
+      </w:r>
+      <w:r>
+        <w:rPr>
+          <w:rFonts w:ascii="Tahoma" w:hAnsi="Tahoma" w:cs="Tahoma"/>
+          <w:b/>
+          <w:bCs/>
+          <w:sz w:val="22"/>
+          <w:szCs w:val="22"/>
+        </w:rPr>
+        <w:t>ond</w:t>
+      </w:r>
+      <w:r>
+        <w:rPr>
+          <w:rFonts w:ascii="Tahoma" w:hAnsi="Tahoma" w:cs="Tahoma"/>
+          <w:b/>
+          <w:bCs/>
+          <w:sz w:val="22"/>
+          <w:szCs w:val="22"/>
+        </w:rPr>
+        <w:t xml:space="preserve"> has passed</w:t>
+      </w:r>
+      <w:r>
+        <w:rPr>
+          <w:rFonts w:ascii="Tahoma" w:hAnsi="Tahoma" w:cs="Tahoma"/>
+          <w:b/>
+          <w:bCs/>
+          <w:sz w:val="22"/>
+          <w:szCs w:val="22"/>
+        </w:rPr>
+        <w:t>.</w:t>
+      </w:r>
+    </w:p>
+    <w:bookmarkEnd w:id="5"/>
+    <w:bookmarkEnd w:id="7"/>
+    <w:p>
+      <w:pPr>
+        <w:pStyle w:val="Footer"/>
+        <w:tabs>
+          <w:tab w:val="clear" w:pos="8640"/>
+          <w:tab w:val="right" w:pos="9450"/>
+        </w:tabs>
+        <w:spacing w:before="120"/>
+        <w:rPr>
+          <w:rFonts w:ascii="Tahoma" w:hAnsi="Tahoma" w:cs="Tahoma"/>
+          <w:sz w:val="22"/>
+          <w:szCs w:val="22"/>
+        </w:rPr>
+      </w:pPr>
+      <w:r>
+        <w:rPr>
+          <w:rFonts w:ascii="Tahoma" w:hAnsi="Tahoma" w:cs="Tahoma"/>
+          <w:sz w:val="22"/>
+          <w:szCs w:val="22"/>
+          <w:u w:val="single"/>
+        </w:rPr>
+        <w:t>Trial court clerk</w:t>
+      </w:r>
+    </w:p>
+    <w:p>
+      <w:pPr>
+        <w:pStyle w:val="Footer"/>
+        <w:tabs>
+          <w:tab w:val="clear" w:pos="8640"/>
+          <w:tab w:val="right" w:pos="9450"/>
+        </w:tabs>
+        <w:spacing w:before="120"/>
+        <w:rPr>
+          <w:rFonts w:ascii="Tahoma" w:hAnsi="Tahoma" w:cs="Tahoma"/>
+          <w:sz w:val="22"/>
+          <w:szCs w:val="22"/>
+        </w:rPr>
+      </w:pPr>
+      <w:r>
+        <w:rPr>
+          <w:rFonts w:ascii="Tahoma" w:hAnsi="Tahoma" w:cs="Tahoma"/>
+          <w:sz w:val="22"/>
+          <w:szCs w:val="22"/>
+        </w:rPr>
+        <w:t xml:space="preserve">Only when </w:t>
+      </w:r>
+      <w:r>
+        <w:rPr>
+          <w:rFonts w:ascii="Tahoma" w:hAnsi="Tahoma" w:cs="Tahoma"/>
+          <w:b/>
+          <w:bCs/>
+          <w:sz w:val="22"/>
+          <w:szCs w:val="22"/>
+        </w:rPr>
+        <w:t>full bond has been posted</w:t>
+      </w:r>
+      <w:r>
+        <w:rPr>
+          <w:rFonts w:ascii="Tahoma" w:hAnsi="Tahoma" w:cs="Tahoma"/>
+          <w:sz w:val="22"/>
+          <w:szCs w:val="22"/>
+        </w:rPr>
+        <w:t>, distribute as follows:</w:t>
+      </w:r>
+    </w:p>
+    <w:p>
+      <w:pPr>
+        <w:pStyle w:val="ListParagraph"/>
+        <w:numPr>
+          <w:ilvl w:val="0"/>
+          <w:numId w:val="7"/>
+        </w:numPr>
+        <w:spacing w:before="60"/>
+        <w:contextualSpacing w:val="0"/>
+        <w:rPr>
+          <w:rFonts w:ascii="Tahoma" w:hAnsi="Tahoma" w:cs="Tahoma"/>
+        </w:rPr>
+      </w:pPr>
+      <w:r>
+        <w:rPr>
+          <w:rFonts w:ascii="Tahoma" w:hAnsi="Tahoma" w:cs="Tahoma"/>
+        </w:rPr>
+        <w:t>If the defendant has an attorney, email a copy to the attorney.</w:t>
+      </w:r>
+    </w:p>
+    <w:p>
+      <w:pPr>
+        <w:pStyle w:val="ListParagraph"/>
+        <w:numPr>
+          <w:ilvl w:val="0"/>
+          <w:numId w:val="7"/>
+        </w:numPr>
+        <w:spacing w:before="60"/>
+        <w:contextualSpacing w:val="0"/>
+        <w:rPr>
+          <w:rFonts w:ascii="Tahoma" w:hAnsi="Tahoma" w:cs="Tahoma"/>
+        </w:rPr>
+      </w:pPr>
+      <w:r>
+        <w:rPr>
+          <w:rFonts w:ascii="Tahoma" w:hAnsi="Tahoma" w:cs="Tahoma"/>
+        </w:rPr>
+        <w:t>If self-represented, email a copy to the defendant.  If the defendant has not provided an email address, use regular mail instead.</w:t>
+      </w:r>
+    </w:p>
+    <w:p>
+      <w:pPr>
+        <w:pStyle w:val="ListParagraph"/>
+        <w:numPr>
+          <w:ilvl w:val="0"/>
+          <w:numId w:val="7"/>
+        </w:numPr>
+        <w:spacing w:before="60"/>
+        <w:contextualSpacing w:val="0"/>
+        <w:rPr>
+          <w:rFonts w:ascii="Tahoma" w:hAnsi="Tahoma" w:cs="Tahoma"/>
+        </w:rPr>
+      </w:pPr>
+      <w:r>
+        <w:rPr>
+          <w:rFonts w:ascii="Tahoma" w:hAnsi="Tahoma" w:cs="Tahoma"/>
+        </w:rPr>
+        <w:t>Email a copy to Pretrial Enforcement Division (PED).</w:t>
+      </w:r>
+      <w:bookmarkEnd w:id="6"/>
+    </w:p>
+    <w:p>
+      <w:pPr>
+        <w:tabs>
+          <w:tab w:val="left" w:pos="4680"/>
+          <w:tab w:val="left" w:pos="9270"/>
+        </w:tabs>
+        <w:spacing w:before="120" w:after="120"/>
+        <w:rPr>
+          <w:rFonts w:ascii="Tahoma" w:hAnsi="Tahoma" w:cs="Tahoma"/>
+          <w:sz w:val="22"/>
+          <w:szCs w:val="22"/>
+        </w:rPr>
+      </w:pPr>
+      <w:r>
+        <w:rPr>
+          <w:rFonts w:ascii="Tahoma" w:hAnsi="Tahoma" w:cs="Tahoma"/>
+          <w:sz w:val="22"/>
+          <w:szCs w:val="22"/>
+        </w:rPr>
+        <w:t>{%p else %}</w:t>
+      </w:r>
+    </w:p>
+    <w:p>
+      <w:pPr>
+        <w:pStyle w:val="Footer"/>
+        <w:tabs>
+          <w:tab w:val="clear" w:pos="8640"/>
+          <w:tab w:val="right" w:pos="9450"/>
+        </w:tabs>
+        <w:spacing w:before="120"/>
+        <w:rPr>
+          <w:rFonts w:ascii="Tahoma" w:hAnsi="Tahoma" w:cs="Tahoma"/>
+          <w:sz w:val="22"/>
+          <w:szCs w:val="22"/>
+        </w:rPr>
+      </w:pPr>
+      <w:bookmarkStart w:id="8" w:name="_Hlk193049359"/>
+      <w:r>
+        <w:rPr>
+          <w:rFonts w:ascii="Tahoma" w:hAnsi="Tahoma" w:cs="Tahoma"/>
+          <w:sz w:val="22"/>
+          <w:szCs w:val="22"/>
+          <w:highlight w:val="yellow"/>
+          <w:u w:val="single"/>
+        </w:rPr>
+        <w:t>Online bail clerk</w:t>
+      </w:r>
+      <w:r>
+        <w:rPr>
+          <w:rFonts w:ascii="Tahoma" w:hAnsi="Tahoma" w:cs="Tahoma"/>
+          <w:sz w:val="22"/>
+          <w:szCs w:val="22"/>
+          <w:highlight w:val="yellow"/>
+          <w:u w:val="single"/>
+        </w:rPr>
+        <w:t xml:space="preserve"> </w:t>
+      </w:r>
+      <w:r>
+        <w:rPr>
+          <w:rFonts w:ascii="Tahoma" w:hAnsi="Tahoma" w:cs="Tahoma"/>
+          <w:sz w:val="22"/>
+          <w:szCs w:val="22"/>
+          <w:highlight w:val="yellow"/>
+          <w:u w:val="single"/>
+        </w:rPr>
+        <w:t>(only show up for</w:t>
+      </w:r>
+      <w:r>
+        <w:rPr>
+          <w:rFonts w:ascii="Tahoma" w:hAnsi="Tahoma" w:cs="Tahoma"/>
+          <w:sz w:val="22"/>
+          <w:szCs w:val="22"/>
+          <w:highlight w:val="yellow"/>
+          <w:u w:val="single"/>
+        </w:rPr>
+        <w:t xml:space="preserve"> third party, obo</w:t>
+      </w:r>
+      <w:r>
+        <w:rPr>
+          <w:rFonts w:ascii="Tahoma" w:hAnsi="Tahoma" w:cs="Tahoma"/>
+          <w:sz w:val="22"/>
+          <w:szCs w:val="22"/>
+          <w:highlight w:val="yellow"/>
+          <w:u w:val="single"/>
+        </w:rPr>
+        <w:t>)</w:t>
+      </w:r>
+    </w:p>
+    <w:p>
+      <w:pPr>
+        <w:pStyle w:val="Footer"/>
+        <w:tabs>
+          <w:tab w:val="clear" w:pos="8640"/>
+          <w:tab w:val="right" w:pos="9450"/>
+        </w:tabs>
+        <w:spacing w:before="60"/>
+        <w:ind w:left="720" w:hanging="360"/>
+        <w:rPr>
+          <w:rFonts w:ascii="Tahoma" w:hAnsi="Tahoma" w:cs="Tahoma"/>
+          <w:sz w:val="22"/>
+          <w:szCs w:val="22"/>
+        </w:rPr>
+      </w:pPr>
+      <w:r>
+        <w:rPr>
+          <w:rFonts w:ascii="Tahoma" w:hAnsi="Tahoma" w:cs="Tahoma"/>
+          <w:sz w:val="22"/>
+          <w:szCs w:val="22"/>
+        </w:rPr>
+        <w:t xml:space="preserve">(1) If the defendant is in custody </w:t>
+      </w:r>
+      <w:r>
+        <w:rPr>
+          <w:rFonts w:ascii="Tahoma" w:hAnsi="Tahoma" w:cs="Tahoma"/>
+          <w:b/>
+          <w:bCs/>
+          <w:sz w:val="22"/>
+          <w:szCs w:val="22"/>
+        </w:rPr>
+        <w:t>and</w:t>
+      </w:r>
+      <w:r>
+        <w:rPr>
+          <w:rFonts w:ascii="Tahoma" w:hAnsi="Tahoma" w:cs="Tahoma"/>
+          <w:sz w:val="22"/>
+          <w:szCs w:val="22"/>
+        </w:rPr>
+        <w:t xml:space="preserve"> full bond was paid, email a copy to DOC or jail for timely notification.  </w:t>
+      </w:r>
+    </w:p>
+    <w:p>
+      <w:pPr>
+        <w:pStyle w:val="Footer"/>
+        <w:tabs>
+          <w:tab w:val="clear" w:pos="8640"/>
+          <w:tab w:val="right" w:pos="9450"/>
+        </w:tabs>
+        <w:spacing w:before="120"/>
+        <w:ind w:left="720" w:hanging="360"/>
+        <w:rPr>
+          <w:rFonts w:ascii="Tahoma" w:hAnsi="Tahoma" w:cs="Tahoma"/>
+          <w:sz w:val="22"/>
+          <w:szCs w:val="22"/>
+        </w:rPr>
+      </w:pPr>
+      <w:r>
+        <w:rPr>
+          <w:rFonts w:ascii="Tahoma" w:hAnsi="Tahoma" w:cs="Tahoma"/>
+          <w:sz w:val="22"/>
+          <w:szCs w:val="22"/>
+        </w:rPr>
+        <w:t xml:space="preserve">(2) </w:t>
+      </w:r>
+      <w:r>
+        <w:rPr>
+          <w:rFonts w:ascii="Tahoma" w:hAnsi="Tahoma" w:cs="Tahoma"/>
+          <w:sz w:val="22"/>
+          <w:szCs w:val="22"/>
+        </w:rPr>
+        <w:t xml:space="preserve">Email a copy to the trial court for upload into OnBase when </w:t>
+      </w:r>
+    </w:p>
+    <w:p>
+      <w:pPr>
+        <w:pStyle w:val="Footer"/>
+        <w:numPr>
+          <w:ilvl w:val="0"/>
+          <w:numId w:val="8"/>
+        </w:numPr>
+        <w:tabs>
+          <w:tab w:val="clear" w:pos="8640"/>
+          <w:tab w:val="right" w:pos="9450"/>
+        </w:tabs>
+        <w:spacing w:before="20"/>
+        <w:ind w:left="1080"/>
+        <w:rPr>
+          <w:rFonts w:ascii="Tahoma" w:hAnsi="Tahoma" w:cs="Tahoma"/>
+          <w:sz w:val="22"/>
+          <w:szCs w:val="22"/>
+        </w:rPr>
+      </w:pPr>
+      <w:r>
+        <w:rPr>
+          <w:rFonts w:ascii="Tahoma" w:hAnsi="Tahoma" w:cs="Tahoma"/>
+          <w:sz w:val="22"/>
+          <w:szCs w:val="22"/>
+        </w:rPr>
+        <w:t>a full b</w:t>
+      </w:r>
+      <w:r>
+        <w:rPr>
+          <w:rFonts w:ascii="Tahoma" w:hAnsi="Tahoma" w:cs="Tahoma"/>
+          <w:sz w:val="22"/>
+          <w:szCs w:val="22"/>
+        </w:rPr>
+        <w:t>ond</w:t>
+      </w:r>
+      <w:r>
+        <w:rPr>
+          <w:rFonts w:ascii="Tahoma" w:hAnsi="Tahoma" w:cs="Tahoma"/>
+          <w:sz w:val="22"/>
+          <w:szCs w:val="22"/>
+        </w:rPr>
+        <w:t xml:space="preserve"> payment is made</w:t>
+      </w:r>
+      <w:r>
+        <w:rPr>
+          <w:rFonts w:ascii="Tahoma" w:hAnsi="Tahoma" w:cs="Tahoma"/>
+          <w:sz w:val="22"/>
+          <w:szCs w:val="22"/>
+        </w:rPr>
+        <w:t>,</w:t>
+      </w:r>
+      <w:r>
+        <w:rPr>
+          <w:rFonts w:ascii="Tahoma" w:hAnsi="Tahoma" w:cs="Tahoma"/>
+          <w:sz w:val="22"/>
+          <w:szCs w:val="22"/>
+        </w:rPr>
+        <w:t xml:space="preserve"> </w:t>
+      </w:r>
+      <w:r>
+        <w:rPr>
+          <w:rFonts w:ascii="Tahoma" w:hAnsi="Tahoma" w:cs="Tahoma"/>
+          <w:b/>
+          <w:bCs/>
+          <w:sz w:val="22"/>
+          <w:szCs w:val="22"/>
+        </w:rPr>
+        <w:t>or</w:t>
+      </w:r>
+      <w:r>
+        <w:rPr>
+          <w:rFonts w:ascii="Tahoma" w:hAnsi="Tahoma" w:cs="Tahoma"/>
+          <w:sz w:val="22"/>
+          <w:szCs w:val="22"/>
+        </w:rPr>
+        <w:t xml:space="preserve"> </w:t>
+      </w:r>
+    </w:p>
+    <w:p>
+      <w:pPr>
+        <w:pStyle w:val="Footer"/>
+        <w:numPr>
+          <w:ilvl w:val="0"/>
+          <w:numId w:val="8"/>
+        </w:numPr>
+        <w:tabs>
+          <w:tab w:val="clear" w:pos="8640"/>
+          <w:tab w:val="right" w:pos="9450"/>
+        </w:tabs>
+        <w:spacing w:before="20"/>
+        <w:ind w:left="1080"/>
+        <w:rPr>
+          <w:rFonts w:ascii="Tahoma" w:hAnsi="Tahoma" w:cs="Tahoma"/>
+          <w:sz w:val="22"/>
+          <w:szCs w:val="22"/>
+        </w:rPr>
+      </w:pPr>
+      <w:r>
+        <w:rPr>
+          <w:rFonts w:ascii="Tahoma" w:hAnsi="Tahoma" w:cs="Tahoma"/>
+          <w:sz w:val="22"/>
+          <w:szCs w:val="22"/>
+        </w:rPr>
+        <w:t xml:space="preserve">a partial bond payment is made </w:t>
+      </w:r>
+      <w:r>
+        <w:rPr>
+          <w:rFonts w:ascii="Tahoma" w:hAnsi="Tahoma" w:cs="Tahoma"/>
+          <w:b/>
+          <w:bCs/>
+          <w:sz w:val="22"/>
+          <w:szCs w:val="22"/>
+        </w:rPr>
+        <w:t>and the due date for posting b</w:t>
+      </w:r>
+      <w:r>
+        <w:rPr>
+          <w:rFonts w:ascii="Tahoma" w:hAnsi="Tahoma" w:cs="Tahoma"/>
+          <w:b/>
+          <w:bCs/>
+          <w:sz w:val="22"/>
+          <w:szCs w:val="22"/>
+        </w:rPr>
+        <w:t>ond</w:t>
+      </w:r>
+      <w:r>
+        <w:rPr>
+          <w:rFonts w:ascii="Tahoma" w:hAnsi="Tahoma" w:cs="Tahoma"/>
+          <w:b/>
+          <w:bCs/>
+          <w:sz w:val="22"/>
+          <w:szCs w:val="22"/>
+        </w:rPr>
+        <w:t xml:space="preserve"> has passed</w:t>
+      </w:r>
+      <w:r>
+        <w:rPr>
+          <w:rFonts w:ascii="Tahoma" w:hAnsi="Tahoma" w:cs="Tahoma"/>
+          <w:b/>
+          <w:bCs/>
+          <w:sz w:val="22"/>
+          <w:szCs w:val="22"/>
+        </w:rPr>
+        <w:t>.</w:t>
+      </w:r>
+    </w:p>
+    <w:bookmarkEnd w:id="8"/>
+    <w:p>
+      <w:pPr>
+        <w:pStyle w:val="Footer"/>
+        <w:tabs>
+          <w:tab w:val="clear" w:pos="8640"/>
+          <w:tab w:val="right" w:pos="9450"/>
+        </w:tabs>
+        <w:rPr>
+          <w:rFonts w:ascii="Tahoma" w:hAnsi="Tahoma" w:cs="Tahoma"/>
+          <w:b/>
+          <w:bCs/>
+          <w:sz w:val="22"/>
+          <w:szCs w:val="22"/>
+        </w:rPr>
+      </w:pPr>
+    </w:p>
+    <w:p>
+      <w:pPr>
+        <w:pStyle w:val="Footer"/>
+        <w:tabs>
+          <w:tab w:val="clear" w:pos="8640"/>
+          <w:tab w:val="right" w:pos="9450"/>
+        </w:tabs>
+        <w:rPr>
+          <w:rFonts w:ascii="Tahoma" w:hAnsi="Tahoma" w:cs="Tahoma"/>
+          <w:sz w:val="22"/>
+          <w:szCs w:val="22"/>
+        </w:rPr>
+      </w:pPr>
+      <w:r>
+        <w:rPr>
+          <w:rFonts w:ascii="Tahoma" w:hAnsi="Tahoma" w:cs="Tahoma"/>
+          <w:b/>
+          <w:bCs/>
+          <w:sz w:val="22"/>
+          <w:szCs w:val="22"/>
+        </w:rPr>
+        <w:t>If the defendant is in custody</w:t>
+      </w:r>
+      <w:r>
+        <w:rPr>
+          <w:rFonts w:ascii="Tahoma" w:hAnsi="Tahoma" w:cs="Tahoma"/>
+          <w:sz w:val="22"/>
+          <w:szCs w:val="22"/>
+        </w:rPr>
+        <w:t xml:space="preserve">, </w:t>
+      </w:r>
+      <w:r>
+        <w:rPr>
+          <w:rFonts w:ascii="Tahoma" w:hAnsi="Tahoma" w:cs="Tahoma"/>
+          <w:sz w:val="22"/>
+          <w:szCs w:val="22"/>
+          <w:u w:val="single"/>
+        </w:rPr>
+        <w:t>jail or DOC staff</w:t>
+      </w:r>
+      <w:r>
+        <w:rPr>
+          <w:rFonts w:ascii="Tahoma" w:hAnsi="Tahoma" w:cs="Tahoma"/>
+          <w:sz w:val="22"/>
+          <w:szCs w:val="22"/>
+        </w:rPr>
+        <w:t xml:space="preserve"> </w:t>
+      </w:r>
+      <w:r>
+        <w:rPr>
+          <w:rFonts w:ascii="Tahoma" w:hAnsi="Tahoma" w:cs="Tahoma"/>
+          <w:sz w:val="22"/>
+          <w:szCs w:val="22"/>
+        </w:rPr>
+        <w:t>distribute</w:t>
+      </w:r>
+      <w:r>
+        <w:rPr>
+          <w:rFonts w:ascii="Tahoma" w:hAnsi="Tahoma" w:cs="Tahoma"/>
+          <w:sz w:val="22"/>
+          <w:szCs w:val="22"/>
+        </w:rPr>
+        <w:t xml:space="preserve"> as follows:</w:t>
+      </w:r>
+    </w:p>
+    <w:p>
+      <w:pPr>
+        <w:pStyle w:val="ListParagraph"/>
+        <w:numPr>
+          <w:ilvl w:val="0"/>
+          <w:numId w:val="9"/>
+        </w:numPr>
+        <w:spacing w:before="60"/>
+        <w:contextualSpacing w:val="0"/>
+        <w:rPr>
+          <w:rFonts w:ascii="Tahoma" w:hAnsi="Tahoma" w:cs="Tahoma"/>
+        </w:rPr>
+      </w:pPr>
+      <w:r>
+        <w:rPr>
+          <w:rFonts w:ascii="Tahoma" w:hAnsi="Tahoma" w:cs="Tahoma"/>
+        </w:rPr>
+        <w:t>Give a copy to the defendant prior to release.</w:t>
+      </w:r>
+    </w:p>
+    <w:p>
+      <w:pPr>
+        <w:pStyle w:val="ListParagraph"/>
+        <w:numPr>
+          <w:ilvl w:val="0"/>
+          <w:numId w:val="9"/>
+        </w:numPr>
+        <w:spacing w:before="60"/>
+        <w:contextualSpacing w:val="0"/>
+        <w:rPr>
+          <w:rFonts w:ascii="Tahoma" w:hAnsi="Tahoma" w:cs="Tahoma"/>
+        </w:rPr>
+      </w:pPr>
+      <w:r>
+        <w:rPr>
+          <w:rFonts w:ascii="Tahoma" w:hAnsi="Tahoma" w:cs="Tahoma"/>
+        </w:rPr>
+        <w:t>Give a copy to Pretrial Enforcement Division (PED).</w:t>
+      </w:r>
+    </w:p>
+    <w:p>
+      <w:pPr>
+        <w:pStyle w:val="Footer"/>
+        <w:tabs>
+          <w:tab w:val="clear" w:pos="8640"/>
+          <w:tab w:val="right" w:pos="9450"/>
+        </w:tabs>
+        <w:rPr>
+          <w:rFonts w:ascii="Tahoma" w:hAnsi="Tahoma" w:cs="Tahoma"/>
+          <w:b/>
+          <w:bCs/>
+          <w:sz w:val="22"/>
+          <w:szCs w:val="22"/>
+        </w:rPr>
+      </w:pPr>
+    </w:p>
+    <w:p>
+      <w:pPr>
+        <w:pStyle w:val="Footer"/>
+        <w:tabs>
+          <w:tab w:val="clear" w:pos="8640"/>
+          <w:tab w:val="right" w:pos="9450"/>
+        </w:tabs>
+        <w:rPr>
+          <w:rFonts w:ascii="Tahoma" w:hAnsi="Tahoma" w:cs="Tahoma"/>
+          <w:sz w:val="22"/>
+          <w:szCs w:val="22"/>
+        </w:rPr>
+      </w:pPr>
+      <w:r>
+        <w:rPr>
+          <w:rFonts w:ascii="Tahoma" w:hAnsi="Tahoma" w:cs="Tahoma"/>
+          <w:b/>
+          <w:bCs/>
+          <w:sz w:val="22"/>
+          <w:szCs w:val="22"/>
+        </w:rPr>
+        <w:t xml:space="preserve">If the defendant is </w:t>
+      </w:r>
+      <w:r>
+        <w:rPr>
+          <w:rFonts w:ascii="Tahoma" w:hAnsi="Tahoma" w:cs="Tahoma"/>
+          <w:b/>
+          <w:bCs/>
+          <w:sz w:val="22"/>
+          <w:szCs w:val="22"/>
+        </w:rPr>
+        <w:t>not</w:t>
+      </w:r>
+      <w:r>
+        <w:rPr>
+          <w:rFonts w:ascii="Tahoma" w:hAnsi="Tahoma" w:cs="Tahoma"/>
+          <w:b/>
+          <w:bCs/>
+          <w:sz w:val="22"/>
+          <w:szCs w:val="22"/>
+        </w:rPr>
+        <w:t xml:space="preserve"> in custody</w:t>
+      </w:r>
+      <w:r>
+        <w:rPr>
+          <w:rFonts w:ascii="Tahoma" w:hAnsi="Tahoma" w:cs="Tahoma"/>
+          <w:sz w:val="22"/>
+          <w:szCs w:val="22"/>
+        </w:rPr>
+        <w:t xml:space="preserve">, </w:t>
+      </w:r>
+      <w:r>
+        <w:rPr>
+          <w:rFonts w:ascii="Tahoma" w:hAnsi="Tahoma" w:cs="Tahoma"/>
+          <w:sz w:val="22"/>
+          <w:szCs w:val="22"/>
+          <w:u w:val="single"/>
+        </w:rPr>
+        <w:t>trial court</w:t>
+      </w:r>
+      <w:r>
+        <w:rPr>
+          <w:rFonts w:ascii="Tahoma" w:hAnsi="Tahoma" w:cs="Tahoma"/>
+          <w:sz w:val="22"/>
+          <w:szCs w:val="22"/>
+          <w:u w:val="single"/>
+        </w:rPr>
+        <w:t xml:space="preserve"> clerk</w:t>
+      </w:r>
+      <w:r>
+        <w:rPr>
+          <w:rFonts w:ascii="Tahoma" w:hAnsi="Tahoma" w:cs="Tahoma"/>
+          <w:sz w:val="22"/>
+          <w:szCs w:val="22"/>
+        </w:rPr>
+        <w:t xml:space="preserve"> </w:t>
+      </w:r>
+      <w:r>
+        <w:rPr>
+          <w:rFonts w:ascii="Tahoma" w:hAnsi="Tahoma" w:cs="Tahoma"/>
+          <w:sz w:val="22"/>
+          <w:szCs w:val="22"/>
+        </w:rPr>
+        <w:t>distribute</w:t>
+      </w:r>
+      <w:r>
+        <w:rPr>
+          <w:rFonts w:ascii="Tahoma" w:hAnsi="Tahoma" w:cs="Tahoma"/>
+          <w:sz w:val="22"/>
+          <w:szCs w:val="22"/>
+        </w:rPr>
+        <w:t xml:space="preserve"> as follows:</w:t>
+      </w:r>
+    </w:p>
+    <w:p>
+      <w:pPr>
+        <w:pStyle w:val="ListParagraph"/>
+        <w:numPr>
+          <w:ilvl w:val="0"/>
+          <w:numId w:val="7"/>
+        </w:numPr>
+        <w:spacing w:before="60"/>
+        <w:contextualSpacing w:val="0"/>
+        <w:rPr>
+          <w:rFonts w:ascii="Tahoma" w:hAnsi="Tahoma" w:cs="Tahoma"/>
+        </w:rPr>
+      </w:pPr>
+      <w:r>
+        <w:rPr>
+          <w:rFonts w:ascii="Tahoma" w:hAnsi="Tahoma" w:cs="Tahoma"/>
+        </w:rPr>
+        <w:t>If the defendant has an attorney, email a copy to the attorney.</w:t>
+      </w:r>
+    </w:p>
+    <w:p>
+      <w:pPr>
+        <w:pStyle w:val="ListParagraph"/>
+        <w:numPr>
+          <w:ilvl w:val="0"/>
+          <w:numId w:val="7"/>
+        </w:numPr>
+        <w:spacing w:before="60"/>
+        <w:contextualSpacing w:val="0"/>
+        <w:rPr>
+          <w:rFonts w:ascii="Tahoma" w:hAnsi="Tahoma" w:cs="Tahoma"/>
+        </w:rPr>
+      </w:pPr>
+      <w:r>
+        <w:rPr>
+          <w:rFonts w:ascii="Tahoma" w:hAnsi="Tahoma" w:cs="Tahoma"/>
+        </w:rPr>
+        <w:t>If self-represented, email a copy to the defendant.  If the defendant has not provided an email address, use regular mail instead.</w:t>
+      </w:r>
+    </w:p>
+    <w:p>
+      <w:pPr>
+        <w:pStyle w:val="ListParagraph"/>
+        <w:numPr>
+          <w:ilvl w:val="0"/>
+          <w:numId w:val="7"/>
+        </w:numPr>
+        <w:spacing w:before="60"/>
+        <w:contextualSpacing w:val="0"/>
+        <w:rPr>
+          <w:rFonts w:ascii="Tahoma" w:hAnsi="Tahoma" w:cs="Tahoma"/>
+        </w:rPr>
+      </w:pPr>
+      <w:r>
+        <w:rPr>
+          <w:rFonts w:ascii="Tahoma" w:hAnsi="Tahoma" w:cs="Tahoma"/>
+        </w:rPr>
+        <w:t>Email a copy to Pretrial Enforcement Division (PED).</w:t>
+      </w:r>
+    </w:p>
+    <w:p>
+      <w:pPr>
+        <w:tabs>
+          <w:tab w:val="left" w:pos="4680"/>
+          <w:tab w:val="left" w:pos="9270"/>
+        </w:tabs>
+        <w:spacing w:before="120" w:after="120"/>
+        <w:ind w:left="360"/>
+        <w:rPr>
+          <w:rFonts w:ascii="Tahoma" w:hAnsi="Tahoma" w:cs="Tahoma"/>
+          <w:sz w:val="22"/>
+          <w:szCs w:val="22"/>
+        </w:rPr>
+      </w:pPr>
+      <w:r>
+        <w:rPr>
+          <w:rFonts w:ascii="Tahoma" w:hAnsi="Tahoma" w:cs="Tahoma"/>
+          <w:sz w:val="22"/>
+          <w:szCs w:val="22"/>
+        </w:rPr>
+        <w:t>{%p endif %}</w:t>
+      </w:r>
+      <w:bookmarkStart w:id="9" w:name="_GoBack"/>
+      <w:bookmarkEnd w:id="9"/>
     </w:p>
     <w:sectPr>
-      <w:headerReference w:type="even" r:id="rId11"/>
-      <w:headerReference w:type="default" r:id="rId12"/>
-      <w:footerReference w:type="even" r:id="rId13"/>
-      <w:footerReference w:type="default" r:id="rId14"/>
-      <w:headerReference w:type="first" r:id="rId15"/>
-      <w:footerReference w:type="first" r:id="rId16"/>
+      <w:headerReference w:type="default" r:id="rId11"/>
+      <w:footerReference w:type="default" r:id="rId12"/>
+      <w:headerReference w:type="first" r:id="rId13"/>
+      <w:footerReference w:type="first" r:id="rId14"/>
       <w:pgSz w:w="12240" w:h="15840" w:code="1"/>
       <w:pgMar w:top="990" w:right="1440" w:bottom="720" w:left="1440" w:header="720" w:footer="432" w:gutter="0"/>
       <w:cols w:space="720"/>
@@ -2792,7 +4194,7 @@
 </file>
 
 <file path=word/endnotes.xml><?xml version="1.0" encoding="utf-8"?>
-<w:endnotes xmlns:wpc="http://schemas.microsoft.com/office/word/2010/wordprocessingCanvas" xmlns:cx="http://schemas.microsoft.com/office/drawing/2014/chartex" xmlns:cx1="http://schemas.microsoft.com/office/drawing/2015/9/8/chartex" xmlns:cx2="http://schemas.microsoft.com/office/drawing/2015/10/21/chartex" xmlns:cx3="http://schemas.microsoft.com/office/drawing/2016/5/9/chartex" xmlns:cx4="http://schemas.microsoft.com/office/drawing/2016/5/10/chartex" xmlns:cx5="http://schemas.microsoft.com/office/drawing/2016/5/11/chartex" xmlns:cx6="http://schemas.microsoft.com/office/drawing/2016/5/12/chartex" xmlns:cx7="http://schemas.microsoft.com/office/drawing/2016/5/13/chartex" xmlns:cx8="http://schemas.microsoft.com/office/drawing/2016/5/14/chartex" xmlns:mc="http://schemas.openxmlformats.org/markup-compatibility/2006" xmlns:aink="http://schemas.microsoft.com/office/drawing/2016/ink" xmlns:am3d="http://schemas.microsoft.com/office/drawing/2017/model3d" xmlns:o="urn:schemas-microsoft-com:office:office" xmlns:r="http://schemas.openxmlformats.org/officeDocument/2006/relationships" xmlns:m="http://schemas.openxmlformats.org/officeDocument/2006/math" xmlns:v="urn:schemas-microsoft-com:vml" xmlns:wp14="http://schemas.microsoft.com/office/word/2010/wordprocessingDrawing" xmlns:wp="http://schemas.openxmlformats.org/drawingml/2006/wordprocessingDrawing" xmlns:w10="urn:schemas-microsoft-com:office:word" xmlns:w="http://schemas.openxmlformats.org/wordprocessingml/2006/main" xmlns:w14="http://schemas.microsoft.com/office/word/2010/wordml" xmlns:w15="http://schemas.microsoft.com/office/word/2012/wordml" xmlns:w16cex="http://schemas.microsoft.com/office/word/2018/wordml/cex" xmlns:w16cid="http://schemas.microsoft.com/office/word/2016/wordml/cid" xmlns:w16="http://schemas.microsoft.com/office/word/2018/wordml" xmlns:w16sdtdh="http://schemas.microsoft.com/office/word/2020/wordml/sdtdatahash" xmlns:w16se="http://schemas.microsoft.com/office/word/2015/wordml/symex" xmlns:wpg="http://schemas.microsoft.com/office/word/2010/wordprocessingGroup" xmlns:wpi="http://schemas.microsoft.com/office/word/2010/wordprocessingInk" xmlns:wne="http://schemas.microsoft.com/office/word/2006/wordml" xmlns:wps="http://schemas.microsoft.com/office/word/2010/wordprocessingShape" mc:Ignorable="w14 w15 w16se w16cid w16 w16cex w16sdtdh wp14">
+<w:endnotes xmlns:wpc="http://schemas.microsoft.com/office/word/2010/wordprocessingCanvas" xmlns:cx="http://schemas.microsoft.com/office/drawing/2014/chartex" xmlns:cx1="http://schemas.microsoft.com/office/drawing/2015/9/8/chartex" xmlns:cx2="http://schemas.microsoft.com/office/drawing/2015/10/21/chartex" xmlns:cx3="http://schemas.microsoft.com/office/drawing/2016/5/9/chartex" xmlns:cx4="http://schemas.microsoft.com/office/drawing/2016/5/10/chartex" xmlns:cx5="http://schemas.microsoft.com/office/drawing/2016/5/11/chartex" xmlns:cx6="http://schemas.microsoft.com/office/drawing/2016/5/12/chartex" xmlns:cx7="http://schemas.microsoft.com/office/drawing/2016/5/13/chartex" xmlns:cx8="http://schemas.microsoft.com/office/drawing/2016/5/14/chartex" xmlns:mc="http://schemas.openxmlformats.org/markup-compatibility/2006" xmlns:aink="http://schemas.microsoft.com/office/drawing/2016/ink" xmlns:am3d="http://schemas.microsoft.com/office/drawing/2017/model3d" xmlns:o="urn:schemas-microsoft-com:office:office" xmlns:r="http://schemas.openxmlformats.org/officeDocument/2006/relationships" xmlns:m="http://schemas.openxmlformats.org/officeDocument/2006/math" xmlns:v="urn:schemas-microsoft-com:vml" xmlns:wp14="http://schemas.microsoft.com/office/word/2010/wordprocessingDrawing" xmlns:wp="http://schemas.openxmlformats.org/drawingml/2006/wordprocessingDrawing" xmlns:w10="urn:schemas-microsoft-com:office:word" xmlns:w="http://schemas.openxmlformats.org/wordprocessingml/2006/main" xmlns:w14="http://schemas.microsoft.com/office/word/2010/wordml" xmlns:w15="http://schemas.microsoft.com/office/word/2012/wordml" xmlns:w16cid="http://schemas.microsoft.com/office/word/2016/wordml/cid" xmlns:w16se="http://schemas.microsoft.com/office/word/2015/wordml/symex" xmlns:wpg="http://schemas.microsoft.com/office/word/2010/wordprocessingGroup" xmlns:wpi="http://schemas.microsoft.com/office/word/2010/wordprocessingInk" xmlns:wne="http://schemas.microsoft.com/office/word/2006/wordml" xmlns:wps="http://schemas.microsoft.com/office/word/2010/wordprocessingShape" mc:Ignorable="w14 w15 w16se w16cid wp14">
   <w:endnote w:type="separator" w:id="-1">
     <w:p>
       <w:r>
@@ -2811,17 +4213,128 @@
 </file>
 
 <file path=word/footer1.xml><?xml version="1.0" encoding="utf-8"?>
-<w:ftr xmlns:wpc="http://schemas.microsoft.com/office/word/2010/wordprocessingCanvas" xmlns:cx="http://schemas.microsoft.com/office/drawing/2014/chartex" xmlns:cx1="http://schemas.microsoft.com/office/drawing/2015/9/8/chartex" xmlns:cx2="http://schemas.microsoft.com/office/drawing/2015/10/21/chartex" xmlns:cx3="http://schemas.microsoft.com/office/drawing/2016/5/9/chartex" xmlns:cx4="http://schemas.microsoft.com/office/drawing/2016/5/10/chartex" xmlns:cx5="http://schemas.microsoft.com/office/drawing/2016/5/11/chartex" xmlns:cx6="http://schemas.microsoft.com/office/drawing/2016/5/12/chartex" xmlns:cx7="http://schemas.microsoft.com/office/drawing/2016/5/13/chartex" xmlns:cx8="http://schemas.microsoft.com/office/drawing/2016/5/14/chartex" xmlns:mc="http://schemas.openxmlformats.org/markup-compatibility/2006" xmlns:aink="http://schemas.microsoft.com/office/drawing/2016/ink" xmlns:am3d="http://schemas.microsoft.com/office/drawing/2017/model3d" xmlns:o="urn:schemas-microsoft-com:office:office" xmlns:r="http://schemas.openxmlformats.org/officeDocument/2006/relationships" xmlns:m="http://schemas.openxmlformats.org/officeDocument/2006/math" xmlns:v="urn:schemas-microsoft-com:vml" xmlns:wp14="http://schemas.microsoft.com/office/word/2010/wordprocessingDrawing" xmlns:wp="http://schemas.openxmlformats.org/drawingml/2006/wordprocessingDrawing" xmlns:w10="urn:schemas-microsoft-com:office:word" xmlns:w="http://schemas.openxmlformats.org/wordprocessingml/2006/main" xmlns:w14="http://schemas.microsoft.com/office/word/2010/wordml" xmlns:w15="http://schemas.microsoft.com/office/word/2012/wordml" xmlns:w16cex="http://schemas.microsoft.com/office/word/2018/wordml/cex" xmlns:w16cid="http://schemas.microsoft.com/office/word/2016/wordml/cid" xmlns:w16="http://schemas.microsoft.com/office/word/2018/wordml" xmlns:w16sdtdh="http://schemas.microsoft.com/office/word/2020/wordml/sdtdatahash" xmlns:w16se="http://schemas.microsoft.com/office/word/2015/wordml/symex" xmlns:wpg="http://schemas.microsoft.com/office/word/2010/wordprocessingGroup" xmlns:wpi="http://schemas.microsoft.com/office/word/2010/wordprocessingInk" xmlns:wne="http://schemas.microsoft.com/office/word/2006/wordml" xmlns:wps="http://schemas.microsoft.com/office/word/2010/wordprocessingShape" mc:Ignorable="w14 w15 w16se w16cid w16 w16cex w16sdtdh wp14">
-  <w:p>
-    <w:pPr>
-      <w:pStyle w:val="Footer"/>
-    </w:pPr>
-  </w:p>
-</w:ftr>
-</file>
-
-<file path=word/footer2.xml><?xml version="1.0" encoding="utf-8"?>
-<w:ftr xmlns:wpc="http://schemas.microsoft.com/office/word/2010/wordprocessingCanvas" xmlns:cx="http://schemas.microsoft.com/office/drawing/2014/chartex" xmlns:cx1="http://schemas.microsoft.com/office/drawing/2015/9/8/chartex" xmlns:cx2="http://schemas.microsoft.com/office/drawing/2015/10/21/chartex" xmlns:cx3="http://schemas.microsoft.com/office/drawing/2016/5/9/chartex" xmlns:cx4="http://schemas.microsoft.com/office/drawing/2016/5/10/chartex" xmlns:cx5="http://schemas.microsoft.com/office/drawing/2016/5/11/chartex" xmlns:cx6="http://schemas.microsoft.com/office/drawing/2016/5/12/chartex" xmlns:cx7="http://schemas.microsoft.com/office/drawing/2016/5/13/chartex" xmlns:cx8="http://schemas.microsoft.com/office/drawing/2016/5/14/chartex" xmlns:mc="http://schemas.openxmlformats.org/markup-compatibility/2006" xmlns:aink="http://schemas.microsoft.com/office/drawing/2016/ink" xmlns:am3d="http://schemas.microsoft.com/office/drawing/2017/model3d" xmlns:o="urn:schemas-microsoft-com:office:office" xmlns:r="http://schemas.openxmlformats.org/officeDocument/2006/relationships" xmlns:m="http://schemas.openxmlformats.org/officeDocument/2006/math" xmlns:v="urn:schemas-microsoft-com:vml" xmlns:wp14="http://schemas.microsoft.com/office/word/2010/wordprocessingDrawing" xmlns:wp="http://schemas.openxmlformats.org/drawingml/2006/wordprocessingDrawing" xmlns:w10="urn:schemas-microsoft-com:office:word" xmlns:w="http://schemas.openxmlformats.org/wordprocessingml/2006/main" xmlns:w14="http://schemas.microsoft.com/office/word/2010/wordml" xmlns:w15="http://schemas.microsoft.com/office/word/2012/wordml" xmlns:w16cex="http://schemas.microsoft.com/office/word/2018/wordml/cex" xmlns:w16cid="http://schemas.microsoft.com/office/word/2016/wordml/cid" xmlns:w16="http://schemas.microsoft.com/office/word/2018/wordml" xmlns:w16sdtdh="http://schemas.microsoft.com/office/word/2020/wordml/sdtdatahash" xmlns:w16se="http://schemas.microsoft.com/office/word/2015/wordml/symex" xmlns:wpg="http://schemas.microsoft.com/office/word/2010/wordprocessingGroup" xmlns:wpi="http://schemas.microsoft.com/office/word/2010/wordprocessingInk" xmlns:wne="http://schemas.microsoft.com/office/word/2006/wordml" xmlns:wps="http://schemas.microsoft.com/office/word/2010/wordprocessingShape" mc:Ignorable="w14 w15 w16se w16cid w16 w16cex w16sdtdh wp14">
+<w:ftr xmlns:wpc="http://schemas.microsoft.com/office/word/2010/wordprocessingCanvas" xmlns:cx="http://schemas.microsoft.com/office/drawing/2014/chartex" xmlns:cx1="http://schemas.microsoft.com/office/drawing/2015/9/8/chartex" xmlns:cx2="http://schemas.microsoft.com/office/drawing/2015/10/21/chartex" xmlns:cx3="http://schemas.microsoft.com/office/drawing/2016/5/9/chartex" xmlns:cx4="http://schemas.microsoft.com/office/drawing/2016/5/10/chartex" xmlns:cx5="http://schemas.microsoft.com/office/drawing/2016/5/11/chartex" xmlns:cx6="http://schemas.microsoft.com/office/drawing/2016/5/12/chartex" xmlns:cx7="http://schemas.microsoft.com/office/drawing/2016/5/13/chartex" xmlns:cx8="http://schemas.microsoft.com/office/drawing/2016/5/14/chartex" xmlns:mc="http://schemas.openxmlformats.org/markup-compatibility/2006" xmlns:aink="http://schemas.microsoft.com/office/drawing/2016/ink" xmlns:am3d="http://schemas.microsoft.com/office/drawing/2017/model3d" xmlns:o="urn:schemas-microsoft-com:office:office" xmlns:r="http://schemas.openxmlformats.org/officeDocument/2006/relationships" xmlns:m="http://schemas.openxmlformats.org/officeDocument/2006/math" xmlns:v="urn:schemas-microsoft-com:vml" xmlns:wp14="http://schemas.microsoft.com/office/word/2010/wordprocessingDrawing" xmlns:wp="http://schemas.openxmlformats.org/drawingml/2006/wordprocessingDrawing" xmlns:w10="urn:schemas-microsoft-com:office:word" xmlns:w="http://schemas.openxmlformats.org/wordprocessingml/2006/main" xmlns:w14="http://schemas.microsoft.com/office/word/2010/wordml" xmlns:w15="http://schemas.microsoft.com/office/word/2012/wordml" xmlns:w16cid="http://schemas.microsoft.com/office/word/2016/wordml/cid" xmlns:w16se="http://schemas.microsoft.com/office/word/2015/wordml/symex" xmlns:wpg="http://schemas.microsoft.com/office/word/2010/wordprocessingGroup" xmlns:wpi="http://schemas.microsoft.com/office/word/2010/wordprocessingInk" xmlns:wne="http://schemas.microsoft.com/office/word/2006/wordml" xmlns:wps="http://schemas.microsoft.com/office/word/2010/wordprocessingShape" mc:Ignorable="w14 w15 w16se w16cid wp14">
+  <w:sdt>
+    <w:sdtPr>
+      <w:id w:val="2088504538"/>
+      <w:docPartObj>
+        <w:docPartGallery w:val="Page Numbers (Bottom of Page)"/>
+        <w:docPartUnique/>
+      </w:docPartObj>
+    </w:sdtPr>
+    <w:sdtContent>
+      <w:sdt>
+        <w:sdtPr>
+          <w:id w:val="-1705238520"/>
+          <w:docPartObj>
+            <w:docPartGallery w:val="Page Numbers (Top of Page)"/>
+            <w:docPartUnique/>
+          </w:docPartObj>
+        </w:sdtPr>
+        <w:sdtContent>
+          <w:p>
+            <w:pPr>
+              <w:pStyle w:val="Footer"/>
+            </w:pPr>
+            <w:r>
+              <w:rPr>
+                <w:rFonts w:ascii="Tahoma" w:hAnsi="Tahoma" w:cs="Tahoma"/>
+              </w:rPr>
+              <w:t xml:space="preserve">Page </w:t>
+            </w:r>
+            <w:r>
+              <w:rPr>
+                <w:rFonts w:ascii="Tahoma" w:hAnsi="Tahoma" w:cs="Tahoma"/>
+                <w:b/>
+                <w:bCs/>
+              </w:rPr>
+              <w:fldChar w:fldCharType="begin"/>
+            </w:r>
+            <w:r>
+              <w:rPr>
+                <w:rFonts w:ascii="Tahoma" w:hAnsi="Tahoma" w:cs="Tahoma"/>
+                <w:b/>
+                <w:bCs/>
+              </w:rPr>
+              <w:instrText xml:space="preserve"> PAGE </w:instrText>
+            </w:r>
+            <w:r>
+              <w:rPr>
+                <w:rFonts w:ascii="Tahoma" w:hAnsi="Tahoma" w:cs="Tahoma"/>
+                <w:b/>
+                <w:bCs/>
+              </w:rPr>
+              <w:fldChar w:fldCharType="separate"/>
+            </w:r>
+            <w:r>
+              <w:rPr>
+                <w:rFonts w:ascii="Tahoma" w:hAnsi="Tahoma" w:cs="Tahoma"/>
+                <w:b/>
+                <w:bCs/>
+                <w:noProof/>
+              </w:rPr>
+              <w:t>2</w:t>
+            </w:r>
+            <w:r>
+              <w:rPr>
+                <w:rFonts w:ascii="Tahoma" w:hAnsi="Tahoma" w:cs="Tahoma"/>
+                <w:b/>
+                <w:bCs/>
+              </w:rPr>
+              <w:fldChar w:fldCharType="end"/>
+            </w:r>
+            <w:r>
+              <w:rPr>
+                <w:rFonts w:ascii="Tahoma" w:hAnsi="Tahoma" w:cs="Tahoma"/>
+              </w:rPr>
+              <w:t xml:space="preserve"> of </w:t>
+            </w:r>
+            <w:r>
+              <w:rPr>
+                <w:rFonts w:ascii="Tahoma" w:hAnsi="Tahoma" w:cs="Tahoma"/>
+                <w:b/>
+                <w:bCs/>
+              </w:rPr>
+              <w:fldChar w:fldCharType="begin"/>
+            </w:r>
+            <w:r>
+              <w:rPr>
+                <w:rFonts w:ascii="Tahoma" w:hAnsi="Tahoma" w:cs="Tahoma"/>
+                <w:b/>
+                <w:bCs/>
+              </w:rPr>
+              <w:instrText xml:space="preserve"> NUMPAGES  </w:instrText>
+            </w:r>
+            <w:r>
+              <w:rPr>
+                <w:rFonts w:ascii="Tahoma" w:hAnsi="Tahoma" w:cs="Tahoma"/>
+                <w:b/>
+                <w:bCs/>
+              </w:rPr>
+              <w:fldChar w:fldCharType="separate"/>
+            </w:r>
+            <w:r>
+              <w:rPr>
+                <w:rFonts w:ascii="Tahoma" w:hAnsi="Tahoma" w:cs="Tahoma"/>
+                <w:b/>
+                <w:bCs/>
+                <w:noProof/>
+              </w:rPr>
+              <w:t>2</w:t>
+            </w:r>
+            <w:r>
+              <w:rPr>
+                <w:rFonts w:ascii="Tahoma" w:hAnsi="Tahoma" w:cs="Tahoma"/>
+                <w:b/>
+                <w:bCs/>
+              </w:rPr>
+              <w:fldChar w:fldCharType="end"/>
+            </w:r>
+          </w:p>
+        </w:sdtContent>
+      </w:sdt>
+    </w:sdtContent>
+  </w:sdt>
   <w:p>
     <w:pPr>
       <w:pStyle w:val="Footer"/>
@@ -2847,35 +4360,7 @@
         <w:rStyle w:val="PageNumber"/>
         <w:rFonts w:ascii="Tahoma" w:hAnsi="Tahoma" w:cs="Tahoma"/>
       </w:rPr>
-      <w:t>234A (</w:t>
-    </w:r>
-    <w:r>
-      <w:rPr>
-        <w:rStyle w:val="PageNumber"/>
-        <w:rFonts w:ascii="Tahoma" w:hAnsi="Tahoma" w:cs="Tahoma"/>
-      </w:rPr>
-      <w:t>9</w:t>
-    </w:r>
-    <w:r>
-      <w:rPr>
-        <w:rStyle w:val="PageNumber"/>
-        <w:rFonts w:ascii="Tahoma" w:hAnsi="Tahoma" w:cs="Tahoma"/>
-      </w:rPr>
-      <w:t>/2</w:t>
-    </w:r>
-    <w:r>
-      <w:rPr>
-        <w:rStyle w:val="PageNumber"/>
-        <w:rFonts w:ascii="Tahoma" w:hAnsi="Tahoma" w:cs="Tahoma"/>
-      </w:rPr>
-      <w:t>6</w:t>
-    </w:r>
-    <w:r>
-      <w:rPr>
-        <w:rStyle w:val="PageNumber"/>
-        <w:rFonts w:ascii="Tahoma" w:hAnsi="Tahoma" w:cs="Tahoma"/>
-      </w:rPr>
-      <w:t>)</w:t>
+      <w:t>234A (3/25)</w:t>
     </w:r>
     <w:r>
       <w:rPr>
@@ -2966,6 +4451,7 @@
       </w:tabs>
       <w:spacing w:line="220" w:lineRule="exact"/>
       <w:rPr>
+        <w:rStyle w:val="Hyperlink"/>
         <w:rFonts w:ascii="Tahoma" w:hAnsi="Tahoma" w:cs="Tahoma"/>
       </w:rPr>
     </w:pPr>
@@ -2999,12 +4485,67 @@
         <w:t>Administrative Bulletin 93</w:t>
       </w:r>
     </w:hyperlink>
+  </w:p>
+  <w:p>
+    <w:pPr>
+      <w:tabs>
+        <w:tab w:val="left" w:pos="4680"/>
+        <w:tab w:val="left" w:pos="9270"/>
+      </w:tabs>
+      <w:rPr>
+        <w:rFonts w:ascii="Tahoma" w:hAnsi="Tahoma" w:cs="Tahoma"/>
+      </w:rPr>
+    </w:pPr>
+    <w:r>
+      <w:rPr>
+        <w:rFonts w:ascii="Tahoma" w:hAnsi="Tahoma" w:cs="Tahoma"/>
+      </w:rPr>
+      <w:t xml:space="preserve">{%p if </w:t>
+    </w:r>
+    <w:proofErr w:type="spellStart"/>
+    <w:r>
+      <w:rPr>
+        <w:rFonts w:ascii="Tahoma" w:hAnsi="Tahoma" w:cs="Tahoma"/>
+      </w:rPr>
+      <w:t>person_filing</w:t>
+    </w:r>
+    <w:proofErr w:type="spellEnd"/>
+    <w:r>
+      <w:rPr>
+        <w:rFonts w:ascii="Tahoma" w:hAnsi="Tahoma" w:cs="Tahoma"/>
+      </w:rPr>
+      <w:t xml:space="preserve"> == “defendant” %} </w:t>
+    </w:r>
+    <w:r>
+      <w:rPr>
+        <w:rFonts w:ascii="Tahoma" w:hAnsi="Tahoma" w:cs="Tahoma"/>
+      </w:rPr>
+      <w:t>(Defendant Posting Own Bail)</w:t>
+    </w:r>
+    <w:r>
+      <w:rPr>
+        <w:rFonts w:ascii="Tahoma" w:hAnsi="Tahoma" w:cs="Tahoma"/>
+      </w:rPr>
+      <w:t>{%p else %}</w:t>
+    </w:r>
+    <w:r>
+      <w:rPr>
+        <w:rFonts w:ascii="Tahoma" w:hAnsi="Tahoma" w:cs="Tahoma"/>
+      </w:rPr>
+      <w:t>(Third Person Poster)</w:t>
+    </w:r>
+    <w:r>
+      <w:rPr>
+        <w:rFonts w:ascii="Tahoma" w:hAnsi="Tahoma" w:cs="Tahoma"/>
+      </w:rPr>
+      <w:t>{% endif %}</w:t>
+    </w:r>
   </w:p>
 </w:ftr>
 </file>
 
-<file path=word/footer3.xml><?xml version="1.0" encoding="utf-8"?>
-<w:ftr xmlns:wpc="http://schemas.microsoft.com/office/word/2010/wordprocessingCanvas" xmlns:cx="http://schemas.microsoft.com/office/drawing/2014/chartex" xmlns:cx1="http://schemas.microsoft.com/office/drawing/2015/9/8/chartex" xmlns:cx2="http://schemas.microsoft.com/office/drawing/2015/10/21/chartex" xmlns:cx3="http://schemas.microsoft.com/office/drawing/2016/5/9/chartex" xmlns:cx4="http://schemas.microsoft.com/office/drawing/2016/5/10/chartex" xmlns:cx5="http://schemas.microsoft.com/office/drawing/2016/5/11/chartex" xmlns:cx6="http://schemas.microsoft.com/office/drawing/2016/5/12/chartex" xmlns:cx7="http://schemas.microsoft.com/office/drawing/2016/5/13/chartex" xmlns:cx8="http://schemas.microsoft.com/office/drawing/2016/5/14/chartex" xmlns:mc="http://schemas.openxmlformats.org/markup-compatibility/2006" xmlns:aink="http://schemas.microsoft.com/office/drawing/2016/ink" xmlns:am3d="http://schemas.microsoft.com/office/drawing/2017/model3d" xmlns:o="urn:schemas-microsoft-com:office:office" xmlns:r="http://schemas.openxmlformats.org/officeDocument/2006/relationships" xmlns:m="http://schemas.openxmlformats.org/officeDocument/2006/math" xmlns:v="urn:schemas-microsoft-com:vml" xmlns:wp14="http://schemas.microsoft.com/office/word/2010/wordprocessingDrawing" xmlns:wp="http://schemas.openxmlformats.org/drawingml/2006/wordprocessingDrawing" xmlns:w10="urn:schemas-microsoft-com:office:word" xmlns:w="http://schemas.openxmlformats.org/wordprocessingml/2006/main" xmlns:w14="http://schemas.microsoft.com/office/word/2010/wordml" xmlns:w15="http://schemas.microsoft.com/office/word/2012/wordml" xmlns:w16cex="http://schemas.microsoft.com/office/word/2018/wordml/cex" xmlns:w16cid="http://schemas.microsoft.com/office/word/2016/wordml/cid" xmlns:w16="http://schemas.microsoft.com/office/word/2018/wordml" xmlns:w16sdtdh="http://schemas.microsoft.com/office/word/2020/wordml/sdtdatahash" xmlns:w16se="http://schemas.microsoft.com/office/word/2015/wordml/symex" xmlns:wpg="http://schemas.microsoft.com/office/word/2010/wordprocessingGroup" xmlns:wpi="http://schemas.microsoft.com/office/word/2010/wordprocessingInk" xmlns:wne="http://schemas.microsoft.com/office/word/2006/wordml" xmlns:wps="http://schemas.microsoft.com/office/word/2010/wordprocessingShape" mc:Ignorable="w14 w15 w16se w16cid w16 w16cex w16sdtdh wp14">
+<file path=word/footer2.xml><?xml version="1.0" encoding="utf-8"?>
+<w:ftr xmlns:wpc="http://schemas.microsoft.com/office/word/2010/wordprocessingCanvas" xmlns:cx="http://schemas.microsoft.com/office/drawing/2014/chartex" xmlns:cx1="http://schemas.microsoft.com/office/drawing/2015/9/8/chartex" xmlns:cx2="http://schemas.microsoft.com/office/drawing/2015/10/21/chartex" xmlns:cx3="http://schemas.microsoft.com/office/drawing/2016/5/9/chartex" xmlns:cx4="http://schemas.microsoft.com/office/drawing/2016/5/10/chartex" xmlns:cx5="http://schemas.microsoft.com/office/drawing/2016/5/11/chartex" xmlns:cx6="http://schemas.microsoft.com/office/drawing/2016/5/12/chartex" xmlns:cx7="http://schemas.microsoft.com/office/drawing/2016/5/13/chartex" xmlns:cx8="http://schemas.microsoft.com/office/drawing/2016/5/14/chartex" xmlns:mc="http://schemas.openxmlformats.org/markup-compatibility/2006" xmlns:aink="http://schemas.microsoft.com/office/drawing/2016/ink" xmlns:am3d="http://schemas.microsoft.com/office/drawing/2017/model3d" xmlns:o="urn:schemas-microsoft-com:office:office" xmlns:r="http://schemas.openxmlformats.org/officeDocument/2006/relationships" xmlns:m="http://schemas.openxmlformats.org/officeDocument/2006/math" xmlns:v="urn:schemas-microsoft-com:vml" xmlns:wp14="http://schemas.microsoft.com/office/word/2010/wordprocessingDrawing" xmlns:wp="http://schemas.openxmlformats.org/drawingml/2006/wordprocessingDrawing" xmlns:w10="urn:schemas-microsoft-com:office:word" xmlns:w="http://schemas.openxmlformats.org/wordprocessingml/2006/main" xmlns:w14="http://schemas.microsoft.com/office/word/2010/wordml" xmlns:w15="http://schemas.microsoft.com/office/word/2012/wordml" xmlns:w16cid="http://schemas.microsoft.com/office/word/2016/wordml/cid" xmlns:w16se="http://schemas.microsoft.com/office/word/2015/wordml/symex" xmlns:wpg="http://schemas.microsoft.com/office/word/2010/wordprocessingGroup" xmlns:wpi="http://schemas.microsoft.com/office/word/2010/wordprocessingInk" xmlns:wne="http://schemas.microsoft.com/office/word/2006/wordml" xmlns:wps="http://schemas.microsoft.com/office/word/2010/wordprocessingShape" mc:Ignorable="w14 w15 w16se w16cid wp14">
   <w:p>
     <w:pPr>
       <w:pStyle w:val="Footer"/>
@@ -3019,54 +4560,103 @@
         <w:rFonts w:ascii="Tahoma" w:hAnsi="Tahoma" w:cs="Tahoma"/>
       </w:rPr>
     </w:pPr>
+  </w:p>
+  <w:p>
+    <w:pPr>
+      <w:pStyle w:val="Footer"/>
+      <w:tabs>
+        <w:tab w:val="clear" w:pos="8640"/>
+        <w:tab w:val="right" w:pos="9450"/>
+      </w:tabs>
+      <w:spacing w:line="220" w:lineRule="exact"/>
+      <w:rPr>
+        <w:rFonts w:ascii="Tahoma" w:hAnsi="Tahoma" w:cs="Tahoma"/>
+        <w:snapToGrid w:val="0"/>
+      </w:rPr>
+    </w:pPr>
     <w:r>
+      <w:rPr>
+        <w:rFonts w:ascii="Tahoma" w:hAnsi="Tahoma" w:cs="Tahoma"/>
+        <w:snapToGrid w:val="0"/>
+      </w:rPr>
+      <w:t xml:space="preserve">Page </w:t>
+    </w:r>
+    <w:r>
+      <w:rPr>
+        <w:rFonts w:ascii="Tahoma" w:hAnsi="Tahoma" w:cs="Tahoma"/>
+        <w:snapToGrid w:val="0"/>
+      </w:rPr>
+      <w:fldChar w:fldCharType="begin"/>
+    </w:r>
+    <w:r>
+      <w:rPr>
+        <w:rFonts w:ascii="Tahoma" w:hAnsi="Tahoma" w:cs="Tahoma"/>
+        <w:snapToGrid w:val="0"/>
+      </w:rPr>
+      <w:instrText xml:space="preserve"> PAGE </w:instrText>
+    </w:r>
+    <w:r>
+      <w:rPr>
+        <w:rFonts w:ascii="Tahoma" w:hAnsi="Tahoma" w:cs="Tahoma"/>
+        <w:snapToGrid w:val="0"/>
+      </w:rPr>
+      <w:fldChar w:fldCharType="separate"/>
+    </w:r>
+    <w:r>
+      <w:rPr>
+        <w:rFonts w:ascii="Tahoma" w:hAnsi="Tahoma" w:cs="Tahoma"/>
+        <w:snapToGrid w:val="0"/>
+      </w:rPr>
+      <w:t>1</w:t>
+    </w:r>
+    <w:r>
+      <w:rPr>
+        <w:rFonts w:ascii="Tahoma" w:hAnsi="Tahoma" w:cs="Tahoma"/>
+        <w:snapToGrid w:val="0"/>
+      </w:rPr>
+      <w:fldChar w:fldCharType="end"/>
+    </w:r>
+    <w:r>
+      <w:rPr>
+        <w:rFonts w:ascii="Tahoma" w:hAnsi="Tahoma" w:cs="Tahoma"/>
+        <w:snapToGrid w:val="0"/>
+      </w:rPr>
+      <w:t xml:space="preserve"> of 2</w:t>
+    </w:r>
+  </w:p>
+  <w:p>
+    <w:pPr>
+      <w:pStyle w:val="Footer"/>
+      <w:tabs>
+        <w:tab w:val="clear" w:pos="8640"/>
+        <w:tab w:val="right" w:pos="9450"/>
+      </w:tabs>
+      <w:spacing w:line="220" w:lineRule="exact"/>
       <w:rPr>
         <w:rStyle w:val="PageNumber"/>
         <w:rFonts w:ascii="Tahoma" w:hAnsi="Tahoma" w:cs="Tahoma"/>
       </w:rPr>
-      <w:t>C</w:t>
+    </w:pPr>
+    <w:r>
+      <w:rPr>
+        <w:rStyle w:val="PageNumber"/>
+        <w:rFonts w:ascii="Tahoma" w:hAnsi="Tahoma" w:cs="Tahoma"/>
+      </w:rPr>
+      <w:t>CR-</w:t>
     </w:r>
     <w:r>
       <w:rPr>
         <w:rStyle w:val="PageNumber"/>
         <w:rFonts w:ascii="Tahoma" w:hAnsi="Tahoma" w:cs="Tahoma"/>
       </w:rPr>
-      <w:t>R-</w:t>
+      <w:t>234A (3/25)</w:t>
     </w:r>
     <w:r>
       <w:rPr>
         <w:rStyle w:val="PageNumber"/>
         <w:rFonts w:ascii="Tahoma" w:hAnsi="Tahoma" w:cs="Tahoma"/>
       </w:rPr>
-      <w:t>234 (</w:t>
-    </w:r>
-    <w:r>
-      <w:rPr>
-        <w:rStyle w:val="PageNumber"/>
-        <w:rFonts w:ascii="Tahoma" w:hAnsi="Tahoma" w:cs="Tahoma"/>
-      </w:rPr>
-      <w:t>9</w:t>
-    </w:r>
-    <w:r>
-      <w:rPr>
-        <w:rStyle w:val="PageNumber"/>
-        <w:rFonts w:ascii="Tahoma" w:hAnsi="Tahoma" w:cs="Tahoma"/>
-      </w:rPr>
-      <w:t>/2</w:t>
-    </w:r>
-    <w:r>
-      <w:rPr>
-        <w:rStyle w:val="PageNumber"/>
-        <w:rFonts w:ascii="Tahoma" w:hAnsi="Tahoma" w:cs="Tahoma"/>
-      </w:rPr>
-      <w:t>6</w:t>
-    </w:r>
-    <w:r>
-      <w:rPr>
-        <w:rStyle w:val="PageNumber"/>
-        <w:rFonts w:ascii="Tahoma" w:hAnsi="Tahoma" w:cs="Tahoma"/>
-      </w:rPr>
-      <w:t>)</w:t>
+      <w:tab/>
     </w:r>
     <w:r>
       <w:rPr>
@@ -3109,14 +4699,7 @@
         <w:rStyle w:val="PageNumber"/>
         <w:rFonts w:ascii="Tahoma" w:hAnsi="Tahoma" w:cs="Tahoma"/>
       </w:rPr>
-      <w:t>75</w:t>
-    </w:r>
-    <w:r>
-      <w:rPr>
-        <w:rStyle w:val="PageNumber"/>
-        <w:rFonts w:ascii="Tahoma" w:hAnsi="Tahoma" w:cs="Tahoma"/>
-      </w:rPr>
-      <w:t xml:space="preserve">, </w:t>
+      <w:t xml:space="preserve">75, </w:t>
     </w:r>
     <w:r>
       <w:rPr>
@@ -3158,6 +4741,8 @@
       <w:spacing w:line="220" w:lineRule="exact"/>
       <w:rPr>
         <w:rFonts w:ascii="Tahoma" w:hAnsi="Tahoma" w:cs="Tahoma"/>
+        <w:color w:val="0000FF" w:themeColor="hyperlink"/>
+        <w:u w:val="single"/>
       </w:rPr>
     </w:pPr>
     <w:r>
@@ -3165,21 +4750,7 @@
         <w:rStyle w:val="PageNumber"/>
         <w:rFonts w:ascii="Tahoma" w:hAnsi="Tahoma" w:cs="Tahoma"/>
       </w:rPr>
-      <w:t xml:space="preserve">ONLINE </w:t>
-    </w:r>
-    <w:r>
-      <w:rPr>
-        <w:rStyle w:val="PageNumber"/>
-        <w:rFonts w:ascii="Tahoma" w:hAnsi="Tahoma" w:cs="Tahoma"/>
-      </w:rPr>
-      <w:t>SECURED CASH BOND</w:t>
-    </w:r>
-    <w:r>
-      <w:rPr>
-        <w:rStyle w:val="PageNumber"/>
-        <w:rFonts w:ascii="Tahoma" w:hAnsi="Tahoma" w:cs="Tahoma"/>
-      </w:rPr>
-      <w:t xml:space="preserve"> POSTING </w:t>
+      <w:t xml:space="preserve">ONLINE SECURED CASH BOND POSTING </w:t>
     </w:r>
     <w:r>
       <w:rPr>
@@ -3209,7 +4780,7 @@
 </file>
 
 <file path=word/footnotes.xml><?xml version="1.0" encoding="utf-8"?>
-<w:footnotes xmlns:wpc="http://schemas.microsoft.com/office/word/2010/wordprocessingCanvas" xmlns:cx="http://schemas.microsoft.com/office/drawing/2014/chartex" xmlns:cx1="http://schemas.microsoft.com/office/drawing/2015/9/8/chartex" xmlns:cx2="http://schemas.microsoft.com/office/drawing/2015/10/21/chartex" xmlns:cx3="http://schemas.microsoft.com/office/drawing/2016/5/9/chartex" xmlns:cx4="http://schemas.microsoft.com/office/drawing/2016/5/10/chartex" xmlns:cx5="http://schemas.microsoft.com/office/drawing/2016/5/11/chartex" xmlns:cx6="http://schemas.microsoft.com/office/drawing/2016/5/12/chartex" xmlns:cx7="http://schemas.microsoft.com/office/drawing/2016/5/13/chartex" xmlns:cx8="http://schemas.microsoft.com/office/drawing/2016/5/14/chartex" xmlns:mc="http://schemas.openxmlformats.org/markup-compatibility/2006" xmlns:aink="http://schemas.microsoft.com/office/drawing/2016/ink" xmlns:am3d="http://schemas.microsoft.com/office/drawing/2017/model3d" xmlns:o="urn:schemas-microsoft-com:office:office" xmlns:r="http://schemas.openxmlformats.org/officeDocument/2006/relationships" xmlns:m="http://schemas.openxmlformats.org/officeDocument/2006/math" xmlns:v="urn:schemas-microsoft-com:vml" xmlns:wp14="http://schemas.microsoft.com/office/word/2010/wordprocessingDrawing" xmlns:wp="http://schemas.openxmlformats.org/drawingml/2006/wordprocessingDrawing" xmlns:w10="urn:schemas-microsoft-com:office:word" xmlns:w="http://schemas.openxmlformats.org/wordprocessingml/2006/main" xmlns:w14="http://schemas.microsoft.com/office/word/2010/wordml" xmlns:w15="http://schemas.microsoft.com/office/word/2012/wordml" xmlns:w16cex="http://schemas.microsoft.com/office/word/2018/wordml/cex" xmlns:w16cid="http://schemas.microsoft.com/office/word/2016/wordml/cid" xmlns:w16="http://schemas.microsoft.com/office/word/2018/wordml" xmlns:w16sdtdh="http://schemas.microsoft.com/office/word/2020/wordml/sdtdatahash" xmlns:w16se="http://schemas.microsoft.com/office/word/2015/wordml/symex" xmlns:wpg="http://schemas.microsoft.com/office/word/2010/wordprocessingGroup" xmlns:wpi="http://schemas.microsoft.com/office/word/2010/wordprocessingInk" xmlns:wne="http://schemas.microsoft.com/office/word/2006/wordml" xmlns:wps="http://schemas.microsoft.com/office/word/2010/wordprocessingShape" mc:Ignorable="w14 w15 w16se w16cid w16 w16cex w16sdtdh wp14">
+<w:footnotes xmlns:wpc="http://schemas.microsoft.com/office/word/2010/wordprocessingCanvas" xmlns:cx="http://schemas.microsoft.com/office/drawing/2014/chartex" xmlns:cx1="http://schemas.microsoft.com/office/drawing/2015/9/8/chartex" xmlns:cx2="http://schemas.microsoft.com/office/drawing/2015/10/21/chartex" xmlns:cx3="http://schemas.microsoft.com/office/drawing/2016/5/9/chartex" xmlns:cx4="http://schemas.microsoft.com/office/drawing/2016/5/10/chartex" xmlns:cx5="http://schemas.microsoft.com/office/drawing/2016/5/11/chartex" xmlns:cx6="http://schemas.microsoft.com/office/drawing/2016/5/12/chartex" xmlns:cx7="http://schemas.microsoft.com/office/drawing/2016/5/13/chartex" xmlns:cx8="http://schemas.microsoft.com/office/drawing/2016/5/14/chartex" xmlns:mc="http://schemas.openxmlformats.org/markup-compatibility/2006" xmlns:aink="http://schemas.microsoft.com/office/drawing/2016/ink" xmlns:am3d="http://schemas.microsoft.com/office/drawing/2017/model3d" xmlns:o="urn:schemas-microsoft-com:office:office" xmlns:r="http://schemas.openxmlformats.org/officeDocument/2006/relationships" xmlns:m="http://schemas.openxmlformats.org/officeDocument/2006/math" xmlns:v="urn:schemas-microsoft-com:vml" xmlns:wp14="http://schemas.microsoft.com/office/word/2010/wordprocessingDrawing" xmlns:wp="http://schemas.openxmlformats.org/drawingml/2006/wordprocessingDrawing" xmlns:w10="urn:schemas-microsoft-com:office:word" xmlns:w="http://schemas.openxmlformats.org/wordprocessingml/2006/main" xmlns:w14="http://schemas.microsoft.com/office/word/2010/wordml" xmlns:w15="http://schemas.microsoft.com/office/word/2012/wordml" xmlns:w16cid="http://schemas.microsoft.com/office/word/2016/wordml/cid" xmlns:w16se="http://schemas.microsoft.com/office/word/2015/wordml/symex" xmlns:wpg="http://schemas.microsoft.com/office/word/2010/wordprocessingGroup" xmlns:wpi="http://schemas.microsoft.com/office/word/2010/wordprocessingInk" xmlns:wne="http://schemas.microsoft.com/office/word/2006/wordml" xmlns:wps="http://schemas.microsoft.com/office/word/2010/wordprocessingShape" mc:Ignorable="w14 w15 w16se w16cid wp14">
   <w:footnote w:type="separator" w:id="-1">
     <w:p>
       <w:r>
@@ -3228,33 +4799,23 @@
 </file>
 
 <file path=word/header1.xml><?xml version="1.0" encoding="utf-8"?>
-<w:hdr xmlns:wpc="http://schemas.microsoft.com/office/word/2010/wordprocessingCanvas" xmlns:cx="http://schemas.microsoft.com/office/drawing/2014/chartex" xmlns:cx1="http://schemas.microsoft.com/office/drawing/2015/9/8/chartex" xmlns:cx2="http://schemas.microsoft.com/office/drawing/2015/10/21/chartex" xmlns:cx3="http://schemas.microsoft.com/office/drawing/2016/5/9/chartex" xmlns:cx4="http://schemas.microsoft.com/office/drawing/2016/5/10/chartex" xmlns:cx5="http://schemas.microsoft.com/office/drawing/2016/5/11/chartex" xmlns:cx6="http://schemas.microsoft.com/office/drawing/2016/5/12/chartex" xmlns:cx7="http://schemas.microsoft.com/office/drawing/2016/5/13/chartex" xmlns:cx8="http://schemas.microsoft.com/office/drawing/2016/5/14/chartex" xmlns:mc="http://schemas.openxmlformats.org/markup-compatibility/2006" xmlns:aink="http://schemas.microsoft.com/office/drawing/2016/ink" xmlns:am3d="http://schemas.microsoft.com/office/drawing/2017/model3d" xmlns:o="urn:schemas-microsoft-com:office:office" xmlns:r="http://schemas.openxmlformats.org/officeDocument/2006/relationships" xmlns:m="http://schemas.openxmlformats.org/officeDocument/2006/math" xmlns:v="urn:schemas-microsoft-com:vml" xmlns:wp14="http://schemas.microsoft.com/office/word/2010/wordprocessingDrawing" xmlns:wp="http://schemas.openxmlformats.org/drawingml/2006/wordprocessingDrawing" xmlns:w10="urn:schemas-microsoft-com:office:word" xmlns:w="http://schemas.openxmlformats.org/wordprocessingml/2006/main" xmlns:w14="http://schemas.microsoft.com/office/word/2010/wordml" xmlns:w15="http://schemas.microsoft.com/office/word/2012/wordml" xmlns:w16cex="http://schemas.microsoft.com/office/word/2018/wordml/cex" xmlns:w16cid="http://schemas.microsoft.com/office/word/2016/wordml/cid" xmlns:w16="http://schemas.microsoft.com/office/word/2018/wordml" xmlns:w16sdtdh="http://schemas.microsoft.com/office/word/2020/wordml/sdtdatahash" xmlns:w16se="http://schemas.microsoft.com/office/word/2015/wordml/symex" xmlns:wpg="http://schemas.microsoft.com/office/word/2010/wordprocessingGroup" xmlns:wpi="http://schemas.microsoft.com/office/word/2010/wordprocessingInk" xmlns:wne="http://schemas.microsoft.com/office/word/2006/wordml" xmlns:wps="http://schemas.microsoft.com/office/word/2010/wordprocessingShape" mc:Ignorable="w14 w15 w16se w16cid w16 w16cex w16sdtdh wp14">
+<w:hdr xmlns:wpc="http://schemas.microsoft.com/office/word/2010/wordprocessingCanvas" xmlns:cx="http://schemas.microsoft.com/office/drawing/2014/chartex" xmlns:cx1="http://schemas.microsoft.com/office/drawing/2015/9/8/chartex" xmlns:cx2="http://schemas.microsoft.com/office/drawing/2015/10/21/chartex" xmlns:cx3="http://schemas.microsoft.com/office/drawing/2016/5/9/chartex" xmlns:cx4="http://schemas.microsoft.com/office/drawing/2016/5/10/chartex" xmlns:cx5="http://schemas.microsoft.com/office/drawing/2016/5/11/chartex" xmlns:cx6="http://schemas.microsoft.com/office/drawing/2016/5/12/chartex" xmlns:cx7="http://schemas.microsoft.com/office/drawing/2016/5/13/chartex" xmlns:cx8="http://schemas.microsoft.com/office/drawing/2016/5/14/chartex" xmlns:mc="http://schemas.openxmlformats.org/markup-compatibility/2006" xmlns:aink="http://schemas.microsoft.com/office/drawing/2016/ink" xmlns:am3d="http://schemas.microsoft.com/office/drawing/2017/model3d" xmlns:o="urn:schemas-microsoft-com:office:office" xmlns:r="http://schemas.openxmlformats.org/officeDocument/2006/relationships" xmlns:m="http://schemas.openxmlformats.org/officeDocument/2006/math" xmlns:v="urn:schemas-microsoft-com:vml" xmlns:wp14="http://schemas.microsoft.com/office/word/2010/wordprocessingDrawing" xmlns:wp="http://schemas.openxmlformats.org/drawingml/2006/wordprocessingDrawing" xmlns:w10="urn:schemas-microsoft-com:office:word" xmlns:w="http://schemas.openxmlformats.org/wordprocessingml/2006/main" xmlns:w14="http://schemas.microsoft.com/office/word/2010/wordml" xmlns:w15="http://schemas.microsoft.com/office/word/2012/wordml" xmlns:w16cid="http://schemas.microsoft.com/office/word/2016/wordml/cid" xmlns:w16se="http://schemas.microsoft.com/office/word/2015/wordml/symex" xmlns:wpg="http://schemas.microsoft.com/office/word/2010/wordprocessingGroup" xmlns:wpi="http://schemas.microsoft.com/office/word/2010/wordprocessingInk" xmlns:wne="http://schemas.microsoft.com/office/word/2006/wordml" xmlns:wps="http://schemas.microsoft.com/office/word/2010/wordprocessingShape" mc:Ignorable="w14 w15 w16se w16cid wp14">
   <w:p>
     <w:pPr>
-      <w:pStyle w:val="Header"/>
+      <w:tabs>
+        <w:tab w:val="right" w:pos="9360"/>
+      </w:tabs>
+      <w:rPr>
+        <w:rFonts w:ascii="Tahoma" w:hAnsi="Tahoma" w:cs="Tahoma"/>
+        <w:sz w:val="18"/>
+      </w:rPr>
     </w:pPr>
   </w:p>
 </w:hdr>
 </file>
 
 <file path=word/header2.xml><?xml version="1.0" encoding="utf-8"?>
-<w:hdr xmlns:wpc="http://schemas.microsoft.com/office/word/2010/wordprocessingCanvas" xmlns:cx="http://schemas.microsoft.com/office/drawing/2014/chartex" xmlns:cx1="http://schemas.microsoft.com/office/drawing/2015/9/8/chartex" xmlns:cx2="http://schemas.microsoft.com/office/drawing/2015/10/21/chartex" xmlns:cx3="http://schemas.microsoft.com/office/drawing/2016/5/9/chartex" xmlns:cx4="http://schemas.microsoft.com/office/drawing/2016/5/10/chartex" xmlns:cx5="http://schemas.microsoft.com/office/drawing/2016/5/11/chartex" xmlns:cx6="http://schemas.microsoft.com/office/drawing/2016/5/12/chartex" xmlns:cx7="http://schemas.microsoft.com/office/drawing/2016/5/13/chartex" xmlns:cx8="http://schemas.microsoft.com/office/drawing/2016/5/14/chartex" xmlns:mc="http://schemas.openxmlformats.org/markup-compatibility/2006" xmlns:aink="http://schemas.microsoft.com/office/drawing/2016/ink" xmlns:am3d="http://schemas.microsoft.com/office/drawing/2017/model3d" xmlns:o="urn:schemas-microsoft-com:office:office" xmlns:r="http://schemas.openxmlformats.org/officeDocument/2006/relationships" xmlns:m="http://schemas.openxmlformats.org/officeDocument/2006/math" xmlns:v="urn:schemas-microsoft-com:vml" xmlns:wp14="http://schemas.microsoft.com/office/word/2010/wordprocessingDrawing" xmlns:wp="http://schemas.openxmlformats.org/drawingml/2006/wordprocessingDrawing" xmlns:w10="urn:schemas-microsoft-com:office:word" xmlns:w="http://schemas.openxmlformats.org/wordprocessingml/2006/main" xmlns:w14="http://schemas.microsoft.com/office/word/2010/wordml" xmlns:w15="http://schemas.microsoft.com/office/word/2012/wordml" xmlns:w16cex="http://schemas.microsoft.com/office/word/2018/wordml/cex" xmlns:w16cid="http://schemas.microsoft.com/office/word/2016/wordml/cid" xmlns:w16="http://schemas.microsoft.com/office/word/2018/wordml" xmlns:w16sdtdh="http://schemas.microsoft.com/office/word/2020/wordml/sdtdatahash" xmlns:w16se="http://schemas.microsoft.com/office/word/2015/wordml/symex" xmlns:wpg="http://schemas.microsoft.com/office/word/2010/wordprocessingGroup" xmlns:wpi="http://schemas.microsoft.com/office/word/2010/wordprocessingInk" xmlns:wne="http://schemas.microsoft.com/office/word/2006/wordml" xmlns:wps="http://schemas.microsoft.com/office/word/2010/wordprocessingShape" mc:Ignorable="w14 w15 w16se w16cid w16 w16cex w16sdtdh wp14">
-  <w:p>
-    <w:pPr>
-      <w:tabs>
-        <w:tab w:val="right" w:pos="9360"/>
-      </w:tabs>
-      <w:rPr>
-        <w:rFonts w:ascii="Tahoma" w:hAnsi="Tahoma" w:cs="Tahoma"/>
-        <w:sz w:val="18"/>
-      </w:rPr>
-    </w:pPr>
-  </w:p>
-</w:hdr>
-</file>
-
-<file path=word/header3.xml><?xml version="1.0" encoding="utf-8"?>
-<w:hdr xmlns:wpc="http://schemas.microsoft.com/office/word/2010/wordprocessingCanvas" xmlns:cx="http://schemas.microsoft.com/office/drawing/2014/chartex" xmlns:cx1="http://schemas.microsoft.com/office/drawing/2015/9/8/chartex" xmlns:cx2="http://schemas.microsoft.com/office/drawing/2015/10/21/chartex" xmlns:cx3="http://schemas.microsoft.com/office/drawing/2016/5/9/chartex" xmlns:cx4="http://schemas.microsoft.com/office/drawing/2016/5/10/chartex" xmlns:cx5="http://schemas.microsoft.com/office/drawing/2016/5/11/chartex" xmlns:cx6="http://schemas.microsoft.com/office/drawing/2016/5/12/chartex" xmlns:cx7="http://schemas.microsoft.com/office/drawing/2016/5/13/chartex" xmlns:cx8="http://schemas.microsoft.com/office/drawing/2016/5/14/chartex" xmlns:mc="http://schemas.openxmlformats.org/markup-compatibility/2006" xmlns:aink="http://schemas.microsoft.com/office/drawing/2016/ink" xmlns:am3d="http://schemas.microsoft.com/office/drawing/2017/model3d" xmlns:o="urn:schemas-microsoft-com:office:office" xmlns:r="http://schemas.openxmlformats.org/officeDocument/2006/relationships" xmlns:m="http://schemas.openxmlformats.org/officeDocument/2006/math" xmlns:v="urn:schemas-microsoft-com:vml" xmlns:wp14="http://schemas.microsoft.com/office/word/2010/wordprocessingDrawing" xmlns:wp="http://schemas.openxmlformats.org/drawingml/2006/wordprocessingDrawing" xmlns:w10="urn:schemas-microsoft-com:office:word" xmlns:w="http://schemas.openxmlformats.org/wordprocessingml/2006/main" xmlns:w14="http://schemas.microsoft.com/office/word/2010/wordml" xmlns:w15="http://schemas.microsoft.com/office/word/2012/wordml" xmlns:w16cex="http://schemas.microsoft.com/office/word/2018/wordml/cex" xmlns:w16cid="http://schemas.microsoft.com/office/word/2016/wordml/cid" xmlns:w16="http://schemas.microsoft.com/office/word/2018/wordml" xmlns:w16sdtdh="http://schemas.microsoft.com/office/word/2020/wordml/sdtdatahash" xmlns:w16se="http://schemas.microsoft.com/office/word/2015/wordml/symex" xmlns:wpg="http://schemas.microsoft.com/office/word/2010/wordprocessingGroup" xmlns:wpi="http://schemas.microsoft.com/office/word/2010/wordprocessingInk" xmlns:wne="http://schemas.microsoft.com/office/word/2006/wordml" xmlns:wps="http://schemas.microsoft.com/office/word/2010/wordprocessingShape" mc:Ignorable="w14 w15 w16se w16cid w16 w16cex w16sdtdh wp14">
+<w:hdr xmlns:wpc="http://schemas.microsoft.com/office/word/2010/wordprocessingCanvas" xmlns:cx="http://schemas.microsoft.com/office/drawing/2014/chartex" xmlns:cx1="http://schemas.microsoft.com/office/drawing/2015/9/8/chartex" xmlns:cx2="http://schemas.microsoft.com/office/drawing/2015/10/21/chartex" xmlns:cx3="http://schemas.microsoft.com/office/drawing/2016/5/9/chartex" xmlns:cx4="http://schemas.microsoft.com/office/drawing/2016/5/10/chartex" xmlns:cx5="http://schemas.microsoft.com/office/drawing/2016/5/11/chartex" xmlns:cx6="http://schemas.microsoft.com/office/drawing/2016/5/12/chartex" xmlns:cx7="http://schemas.microsoft.com/office/drawing/2016/5/13/chartex" xmlns:cx8="http://schemas.microsoft.com/office/drawing/2016/5/14/chartex" xmlns:mc="http://schemas.openxmlformats.org/markup-compatibility/2006" xmlns:aink="http://schemas.microsoft.com/office/drawing/2016/ink" xmlns:am3d="http://schemas.microsoft.com/office/drawing/2017/model3d" xmlns:o="urn:schemas-microsoft-com:office:office" xmlns:r="http://schemas.openxmlformats.org/officeDocument/2006/relationships" xmlns:m="http://schemas.openxmlformats.org/officeDocument/2006/math" xmlns:v="urn:schemas-microsoft-com:vml" xmlns:wp14="http://schemas.microsoft.com/office/word/2010/wordprocessingDrawing" xmlns:wp="http://schemas.openxmlformats.org/drawingml/2006/wordprocessingDrawing" xmlns:w10="urn:schemas-microsoft-com:office:word" xmlns:w="http://schemas.openxmlformats.org/wordprocessingml/2006/main" xmlns:w14="http://schemas.microsoft.com/office/word/2010/wordml" xmlns:w15="http://schemas.microsoft.com/office/word/2012/wordml" xmlns:w16cid="http://schemas.microsoft.com/office/word/2016/wordml/cid" xmlns:w16se="http://schemas.microsoft.com/office/word/2015/wordml/symex" xmlns:wpg="http://schemas.microsoft.com/office/word/2010/wordprocessingGroup" xmlns:wpi="http://schemas.microsoft.com/office/word/2010/wordprocessingInk" xmlns:wne="http://schemas.microsoft.com/office/word/2006/wordml" xmlns:wps="http://schemas.microsoft.com/office/word/2010/wordprocessingShape" mc:Ignorable="w14 w15 w16se w16cid wp14">
   <w:p>
     <w:pPr>
       <w:tabs>
@@ -3276,8 +4837,121 @@
 </file>
 
 <file path=word/numbering.xml><?xml version="1.0" encoding="utf-8"?>
-<w:numbering xmlns:wpc="http://schemas.microsoft.com/office/word/2010/wordprocessingCanvas" xmlns:cx="http://schemas.microsoft.com/office/drawing/2014/chartex" xmlns:cx1="http://schemas.microsoft.com/office/drawing/2015/9/8/chartex" xmlns:cx2="http://schemas.microsoft.com/office/drawing/2015/10/21/chartex" xmlns:cx3="http://schemas.microsoft.com/office/drawing/2016/5/9/chartex" xmlns:cx4="http://schemas.microsoft.com/office/drawing/2016/5/10/chartex" xmlns:cx5="http://schemas.microsoft.com/office/drawing/2016/5/11/chartex" xmlns:cx6="http://schemas.microsoft.com/office/drawing/2016/5/12/chartex" xmlns:cx7="http://schemas.microsoft.com/office/drawing/2016/5/13/chartex" xmlns:cx8="http://schemas.microsoft.com/office/drawing/2016/5/14/chartex" xmlns:mc="http://schemas.openxmlformats.org/markup-compatibility/2006" xmlns:aink="http://schemas.microsoft.com/office/drawing/2016/ink" xmlns:am3d="http://schemas.microsoft.com/office/drawing/2017/model3d" xmlns:o="urn:schemas-microsoft-com:office:office" xmlns:r="http://schemas.openxmlformats.org/officeDocument/2006/relationships" xmlns:m="http://schemas.openxmlformats.org/officeDocument/2006/math" xmlns:v="urn:schemas-microsoft-com:vml" xmlns:wp14="http://schemas.microsoft.com/office/word/2010/wordprocessingDrawing" xmlns:wp="http://schemas.openxmlformats.org/drawingml/2006/wordprocessingDrawing" xmlns:w10="urn:schemas-microsoft-com:office:word" xmlns:w="http://schemas.openxmlformats.org/wordprocessingml/2006/main" xmlns:w14="http://schemas.microsoft.com/office/word/2010/wordml" xmlns:w15="http://schemas.microsoft.com/office/word/2012/wordml" xmlns:w16cex="http://schemas.microsoft.com/office/word/2018/wordml/cex" xmlns:w16cid="http://schemas.microsoft.com/office/word/2016/wordml/cid" xmlns:w16="http://schemas.microsoft.com/office/word/2018/wordml" xmlns:w16sdtdh="http://schemas.microsoft.com/office/word/2020/wordml/sdtdatahash" xmlns:w16se="http://schemas.microsoft.com/office/word/2015/wordml/symex" xmlns:wpg="http://schemas.microsoft.com/office/word/2010/wordprocessingGroup" xmlns:wpi="http://schemas.microsoft.com/office/word/2010/wordprocessingInk" xmlns:wne="http://schemas.microsoft.com/office/word/2006/wordml" xmlns:wps="http://schemas.microsoft.com/office/word/2010/wordprocessingShape" mc:Ignorable="w14 w15 w16se w16cid w16 w16cex w16sdtdh wp14">
+<w:numbering xmlns:wpc="http://schemas.microsoft.com/office/word/2010/wordprocessingCanvas" xmlns:cx="http://schemas.microsoft.com/office/drawing/2014/chartex" xmlns:cx1="http://schemas.microsoft.com/office/drawing/2015/9/8/chartex" xmlns:cx2="http://schemas.microsoft.com/office/drawing/2015/10/21/chartex" xmlns:cx3="http://schemas.microsoft.com/office/drawing/2016/5/9/chartex" xmlns:cx4="http://schemas.microsoft.com/office/drawing/2016/5/10/chartex" xmlns:cx5="http://schemas.microsoft.com/office/drawing/2016/5/11/chartex" xmlns:cx6="http://schemas.microsoft.com/office/drawing/2016/5/12/chartex" xmlns:cx7="http://schemas.microsoft.com/office/drawing/2016/5/13/chartex" xmlns:cx8="http://schemas.microsoft.com/office/drawing/2016/5/14/chartex" xmlns:mc="http://schemas.openxmlformats.org/markup-compatibility/2006" xmlns:aink="http://schemas.microsoft.com/office/drawing/2016/ink" xmlns:am3d="http://schemas.microsoft.com/office/drawing/2017/model3d" xmlns:o="urn:schemas-microsoft-com:office:office" xmlns:r="http://schemas.openxmlformats.org/officeDocument/2006/relationships" xmlns:m="http://schemas.openxmlformats.org/officeDocument/2006/math" xmlns:v="urn:schemas-microsoft-com:vml" xmlns:wp14="http://schemas.microsoft.com/office/word/2010/wordprocessingDrawing" xmlns:wp="http://schemas.openxmlformats.org/drawingml/2006/wordprocessingDrawing" xmlns:w10="urn:schemas-microsoft-com:office:word" xmlns:w="http://schemas.openxmlformats.org/wordprocessingml/2006/main" xmlns:w14="http://schemas.microsoft.com/office/word/2010/wordml" xmlns:w15="http://schemas.microsoft.com/office/word/2012/wordml" xmlns:w16cid="http://schemas.microsoft.com/office/word/2016/wordml/cid" xmlns:w16se="http://schemas.microsoft.com/office/word/2015/wordml/symex" xmlns:wpg="http://schemas.microsoft.com/office/word/2010/wordprocessingGroup" xmlns:wpi="http://schemas.microsoft.com/office/word/2010/wordprocessingInk" xmlns:wne="http://schemas.microsoft.com/office/word/2006/wordml" xmlns:wps="http://schemas.microsoft.com/office/word/2010/wordprocessingShape" mc:Ignorable="w14 w15 w16se w16cid wp14">
   <w:abstractNum w:abstractNumId="0" w15:restartNumberingAfterBreak="0">
+    <w:nsid w:val="032140CF"/>
+    <w:multiLevelType w:val="hybridMultilevel"/>
+    <w:tmpl w:val="5A3C22F4"/>
+    <w:lvl w:ilvl="0" w:tplc="E48A1D74">
+      <w:start w:val="1"/>
+      <w:numFmt w:val="decimal"/>
+      <w:lvlText w:val="(%1)"/>
+      <w:lvlJc w:val="left"/>
+      <w:pPr>
+        <w:ind w:left="720" w:hanging="360"/>
+      </w:pPr>
+      <w:rPr>
+        <w:rFonts w:hint="default"/>
+      </w:rPr>
+    </w:lvl>
+    <w:lvl w:ilvl="1" w:tplc="04090003">
+      <w:start w:val="1"/>
+      <w:numFmt w:val="bullet"/>
+      <w:lvlText w:val="o"/>
+      <w:lvlJc w:val="left"/>
+      <w:pPr>
+        <w:ind w:left="1440" w:hanging="360"/>
+      </w:pPr>
+      <w:rPr>
+        <w:rFonts w:ascii="Courier New" w:hAnsi="Courier New" w:cs="Courier New" w:hint="default"/>
+      </w:rPr>
+    </w:lvl>
+    <w:lvl w:ilvl="2" w:tplc="04090005">
+      <w:start w:val="1"/>
+      <w:numFmt w:val="bullet"/>
+      <w:lvlText w:val=""/>
+      <w:lvlJc w:val="left"/>
+      <w:pPr>
+        <w:ind w:left="2160" w:hanging="360"/>
+      </w:pPr>
+      <w:rPr>
+        <w:rFonts w:ascii="Wingdings" w:hAnsi="Wingdings" w:hint="default"/>
+      </w:rPr>
+    </w:lvl>
+    <w:lvl w:ilvl="3" w:tplc="04090001">
+      <w:start w:val="1"/>
+      <w:numFmt w:val="bullet"/>
+      <w:lvlText w:val=""/>
+      <w:lvlJc w:val="left"/>
+      <w:pPr>
+        <w:ind w:left="2880" w:hanging="360"/>
+      </w:pPr>
+      <w:rPr>
+        <w:rFonts w:ascii="Symbol" w:hAnsi="Symbol" w:hint="default"/>
+      </w:rPr>
+    </w:lvl>
+    <w:lvl w:ilvl="4" w:tplc="04090003">
+      <w:start w:val="1"/>
+      <w:numFmt w:val="bullet"/>
+      <w:lvlText w:val="o"/>
+      <w:lvlJc w:val="left"/>
+      <w:pPr>
+        <w:ind w:left="3600" w:hanging="360"/>
+      </w:pPr>
+      <w:rPr>
+        <w:rFonts w:ascii="Courier New" w:hAnsi="Courier New" w:cs="Courier New" w:hint="default"/>
+      </w:rPr>
+    </w:lvl>
+    <w:lvl w:ilvl="5" w:tplc="04090005">
+      <w:start w:val="1"/>
+      <w:numFmt w:val="bullet"/>
+      <w:lvlText w:val=""/>
+      <w:lvlJc w:val="left"/>
+      <w:pPr>
+        <w:ind w:left="4320" w:hanging="360"/>
+      </w:pPr>
+      <w:rPr>
+        <w:rFonts w:ascii="Wingdings" w:hAnsi="Wingdings" w:hint="default"/>
+      </w:rPr>
+    </w:lvl>
+    <w:lvl w:ilvl="6" w:tplc="04090001">
+      <w:start w:val="1"/>
+      <w:numFmt w:val="bullet"/>
+      <w:lvlText w:val=""/>
+      <w:lvlJc w:val="left"/>
+      <w:pPr>
+        <w:ind w:left="5040" w:hanging="360"/>
+      </w:pPr>
+      <w:rPr>
+        <w:rFonts w:ascii="Symbol" w:hAnsi="Symbol" w:hint="default"/>
+      </w:rPr>
+    </w:lvl>
+    <w:lvl w:ilvl="7" w:tplc="04090003">
+      <w:start w:val="1"/>
+      <w:numFmt w:val="bullet"/>
+      <w:lvlText w:val="o"/>
+      <w:lvlJc w:val="left"/>
+      <w:pPr>
+        <w:ind w:left="5760" w:hanging="360"/>
+      </w:pPr>
+      <w:rPr>
+        <w:rFonts w:ascii="Courier New" w:hAnsi="Courier New" w:cs="Courier New" w:hint="default"/>
+      </w:rPr>
+    </w:lvl>
+    <w:lvl w:ilvl="8" w:tplc="04090005">
+      <w:start w:val="1"/>
+      <w:numFmt w:val="bullet"/>
+      <w:lvlText w:val=""/>
+      <w:lvlJc w:val="left"/>
+      <w:pPr>
+        <w:ind w:left="6480" w:hanging="360"/>
+      </w:pPr>
+      <w:rPr>
+        <w:rFonts w:ascii="Wingdings" w:hAnsi="Wingdings" w:hint="default"/>
+      </w:rPr>
+    </w:lvl>
+  </w:abstractNum>
+  <w:abstractNum w:abstractNumId="1" w15:restartNumberingAfterBreak="0">
     <w:nsid w:val="1A0273B0"/>
     <w:multiLevelType w:val="singleLevel"/>
     <w:tmpl w:val="D89219D6"/>
@@ -3297,7 +4971,7 @@
       </w:rPr>
     </w:lvl>
   </w:abstractNum>
-  <w:abstractNum w:abstractNumId="1" w15:restartNumberingAfterBreak="0">
+  <w:abstractNum w:abstractNumId="2" w15:restartNumberingAfterBreak="0">
     <w:nsid w:val="1DCA00E3"/>
     <w:multiLevelType w:val="singleLevel"/>
     <w:tmpl w:val="87B8320E"/>
@@ -3317,7 +4991,120 @@
       </w:rPr>
     </w:lvl>
   </w:abstractNum>
-  <w:abstractNum w:abstractNumId="2" w15:restartNumberingAfterBreak="0">
+  <w:abstractNum w:abstractNumId="3" w15:restartNumberingAfterBreak="0">
+    <w:nsid w:val="28243028"/>
+    <w:multiLevelType w:val="hybridMultilevel"/>
+    <w:tmpl w:val="CE2274FA"/>
+    <w:lvl w:ilvl="0" w:tplc="04090001">
+      <w:start w:val="1"/>
+      <w:numFmt w:val="bullet"/>
+      <w:lvlText w:val=""/>
+      <w:lvlJc w:val="left"/>
+      <w:pPr>
+        <w:ind w:left="720" w:hanging="360"/>
+      </w:pPr>
+      <w:rPr>
+        <w:rFonts w:ascii="Symbol" w:hAnsi="Symbol" w:hint="default"/>
+      </w:rPr>
+    </w:lvl>
+    <w:lvl w:ilvl="1" w:tplc="04090003" w:tentative="1">
+      <w:start w:val="1"/>
+      <w:numFmt w:val="bullet"/>
+      <w:lvlText w:val="o"/>
+      <w:lvlJc w:val="left"/>
+      <w:pPr>
+        <w:ind w:left="1440" w:hanging="360"/>
+      </w:pPr>
+      <w:rPr>
+        <w:rFonts w:ascii="Courier New" w:hAnsi="Courier New" w:cs="Courier New" w:hint="default"/>
+      </w:rPr>
+    </w:lvl>
+    <w:lvl w:ilvl="2" w:tplc="04090005" w:tentative="1">
+      <w:start w:val="1"/>
+      <w:numFmt w:val="bullet"/>
+      <w:lvlText w:val=""/>
+      <w:lvlJc w:val="left"/>
+      <w:pPr>
+        <w:ind w:left="2160" w:hanging="360"/>
+      </w:pPr>
+      <w:rPr>
+        <w:rFonts w:ascii="Wingdings" w:hAnsi="Wingdings" w:hint="default"/>
+      </w:rPr>
+    </w:lvl>
+    <w:lvl w:ilvl="3" w:tplc="04090001" w:tentative="1">
+      <w:start w:val="1"/>
+      <w:numFmt w:val="bullet"/>
+      <w:lvlText w:val=""/>
+      <w:lvlJc w:val="left"/>
+      <w:pPr>
+        <w:ind w:left="2880" w:hanging="360"/>
+      </w:pPr>
+      <w:rPr>
+        <w:rFonts w:ascii="Symbol" w:hAnsi="Symbol" w:hint="default"/>
+      </w:rPr>
+    </w:lvl>
+    <w:lvl w:ilvl="4" w:tplc="04090003" w:tentative="1">
+      <w:start w:val="1"/>
+      <w:numFmt w:val="bullet"/>
+      <w:lvlText w:val="o"/>
+      <w:lvlJc w:val="left"/>
+      <w:pPr>
+        <w:ind w:left="3600" w:hanging="360"/>
+      </w:pPr>
+      <w:rPr>
+        <w:rFonts w:ascii="Courier New" w:hAnsi="Courier New" w:cs="Courier New" w:hint="default"/>
+      </w:rPr>
+    </w:lvl>
+    <w:lvl w:ilvl="5" w:tplc="04090005" w:tentative="1">
+      <w:start w:val="1"/>
+      <w:numFmt w:val="bullet"/>
+      <w:lvlText w:val=""/>
+      <w:lvlJc w:val="left"/>
+      <w:pPr>
+        <w:ind w:left="4320" w:hanging="360"/>
+      </w:pPr>
+      <w:rPr>
+        <w:rFonts w:ascii="Wingdings" w:hAnsi="Wingdings" w:hint="default"/>
+      </w:rPr>
+    </w:lvl>
+    <w:lvl w:ilvl="6" w:tplc="04090001" w:tentative="1">
+      <w:start w:val="1"/>
+      <w:numFmt w:val="bullet"/>
+      <w:lvlText w:val=""/>
+      <w:lvlJc w:val="left"/>
+      <w:pPr>
+        <w:ind w:left="5040" w:hanging="360"/>
+      </w:pPr>
+      <w:rPr>
+        <w:rFonts w:ascii="Symbol" w:hAnsi="Symbol" w:hint="default"/>
+      </w:rPr>
+    </w:lvl>
+    <w:lvl w:ilvl="7" w:tplc="04090003" w:tentative="1">
+      <w:start w:val="1"/>
+      <w:numFmt w:val="bullet"/>
+      <w:lvlText w:val="o"/>
+      <w:lvlJc w:val="left"/>
+      <w:pPr>
+        <w:ind w:left="5760" w:hanging="360"/>
+      </w:pPr>
+      <w:rPr>
+        <w:rFonts w:ascii="Courier New" w:hAnsi="Courier New" w:cs="Courier New" w:hint="default"/>
+      </w:rPr>
+    </w:lvl>
+    <w:lvl w:ilvl="8" w:tplc="04090005" w:tentative="1">
+      <w:start w:val="1"/>
+      <w:numFmt w:val="bullet"/>
+      <w:lvlText w:val=""/>
+      <w:lvlJc w:val="left"/>
+      <w:pPr>
+        <w:ind w:left="6480" w:hanging="360"/>
+      </w:pPr>
+      <w:rPr>
+        <w:rFonts w:ascii="Wingdings" w:hAnsi="Wingdings" w:hint="default"/>
+      </w:rPr>
+    </w:lvl>
+  </w:abstractNum>
+  <w:abstractNum w:abstractNumId="4" w15:restartNumberingAfterBreak="0">
     <w:nsid w:val="3569344F"/>
     <w:multiLevelType w:val="hybridMultilevel"/>
     <w:tmpl w:val="E0AA90A0"/>
@@ -3403,7 +5190,7 @@
       </w:pPr>
     </w:lvl>
   </w:abstractNum>
-  <w:abstractNum w:abstractNumId="3" w15:restartNumberingAfterBreak="0">
+  <w:abstractNum w:abstractNumId="5" w15:restartNumberingAfterBreak="0">
     <w:nsid w:val="40500DA5"/>
     <w:multiLevelType w:val="hybridMultilevel"/>
     <w:tmpl w:val="088E80BC"/>
@@ -3489,7 +5276,7 @@
       </w:pPr>
     </w:lvl>
   </w:abstractNum>
-  <w:abstractNum w:abstractNumId="4" w15:restartNumberingAfterBreak="0">
+  <w:abstractNum w:abstractNumId="6" w15:restartNumberingAfterBreak="0">
     <w:nsid w:val="5EB47059"/>
     <w:multiLevelType w:val="hybridMultilevel"/>
     <w:tmpl w:val="68504EB6"/>
@@ -3575,7 +5362,7 @@
       </w:pPr>
     </w:lvl>
   </w:abstractNum>
-  <w:abstractNum w:abstractNumId="5" w15:restartNumberingAfterBreak="0">
+  <w:abstractNum w:abstractNumId="7" w15:restartNumberingAfterBreak="0">
     <w:nsid w:val="60415A0F"/>
     <w:multiLevelType w:val="hybridMultilevel"/>
     <w:tmpl w:val="B74EDE38"/>
@@ -3664,23 +5451,136 @@
       </w:pPr>
     </w:lvl>
   </w:abstractNum>
+  <w:abstractNum w:abstractNumId="8" w15:restartNumberingAfterBreak="0">
+    <w:nsid w:val="78D96756"/>
+    <w:multiLevelType w:val="hybridMultilevel"/>
+    <w:tmpl w:val="5A3C22F4"/>
+    <w:lvl w:ilvl="0" w:tplc="E48A1D74">
+      <w:start w:val="1"/>
+      <w:numFmt w:val="decimal"/>
+      <w:lvlText w:val="(%1)"/>
+      <w:lvlJc w:val="left"/>
+      <w:pPr>
+        <w:ind w:left="720" w:hanging="360"/>
+      </w:pPr>
+      <w:rPr>
+        <w:rFonts w:hint="default"/>
+      </w:rPr>
+    </w:lvl>
+    <w:lvl w:ilvl="1" w:tplc="04090003">
+      <w:start w:val="1"/>
+      <w:numFmt w:val="bullet"/>
+      <w:lvlText w:val="o"/>
+      <w:lvlJc w:val="left"/>
+      <w:pPr>
+        <w:ind w:left="1440" w:hanging="360"/>
+      </w:pPr>
+      <w:rPr>
+        <w:rFonts w:ascii="Courier New" w:hAnsi="Courier New" w:cs="Courier New" w:hint="default"/>
+      </w:rPr>
+    </w:lvl>
+    <w:lvl w:ilvl="2" w:tplc="04090005">
+      <w:start w:val="1"/>
+      <w:numFmt w:val="bullet"/>
+      <w:lvlText w:val=""/>
+      <w:lvlJc w:val="left"/>
+      <w:pPr>
+        <w:ind w:left="2160" w:hanging="360"/>
+      </w:pPr>
+      <w:rPr>
+        <w:rFonts w:ascii="Wingdings" w:hAnsi="Wingdings" w:hint="default"/>
+      </w:rPr>
+    </w:lvl>
+    <w:lvl w:ilvl="3" w:tplc="04090001">
+      <w:start w:val="1"/>
+      <w:numFmt w:val="bullet"/>
+      <w:lvlText w:val=""/>
+      <w:lvlJc w:val="left"/>
+      <w:pPr>
+        <w:ind w:left="2880" w:hanging="360"/>
+      </w:pPr>
+      <w:rPr>
+        <w:rFonts w:ascii="Symbol" w:hAnsi="Symbol" w:hint="default"/>
+      </w:rPr>
+    </w:lvl>
+    <w:lvl w:ilvl="4" w:tplc="04090003">
+      <w:start w:val="1"/>
+      <w:numFmt w:val="bullet"/>
+      <w:lvlText w:val="o"/>
+      <w:lvlJc w:val="left"/>
+      <w:pPr>
+        <w:ind w:left="3600" w:hanging="360"/>
+      </w:pPr>
+      <w:rPr>
+        <w:rFonts w:ascii="Courier New" w:hAnsi="Courier New" w:cs="Courier New" w:hint="default"/>
+      </w:rPr>
+    </w:lvl>
+    <w:lvl w:ilvl="5" w:tplc="04090005">
+      <w:start w:val="1"/>
+      <w:numFmt w:val="bullet"/>
+      <w:lvlText w:val=""/>
+      <w:lvlJc w:val="left"/>
+      <w:pPr>
+        <w:ind w:left="4320" w:hanging="360"/>
+      </w:pPr>
+      <w:rPr>
+        <w:rFonts w:ascii="Wingdings" w:hAnsi="Wingdings" w:hint="default"/>
+      </w:rPr>
+    </w:lvl>
+    <w:lvl w:ilvl="6" w:tplc="04090001">
+      <w:start w:val="1"/>
+      <w:numFmt w:val="bullet"/>
+      <w:lvlText w:val=""/>
+      <w:lvlJc w:val="left"/>
+      <w:pPr>
+        <w:ind w:left="5040" w:hanging="360"/>
+      </w:pPr>
+      <w:rPr>
+        <w:rFonts w:ascii="Symbol" w:hAnsi="Symbol" w:hint="default"/>
+      </w:rPr>
+    </w:lvl>
+    <w:lvl w:ilvl="7" w:tplc="04090003">
+      <w:start w:val="1"/>
+      <w:numFmt w:val="bullet"/>
+      <w:lvlText w:val="o"/>
+      <w:lvlJc w:val="left"/>
+      <w:pPr>
+        <w:ind w:left="5760" w:hanging="360"/>
+      </w:pPr>
+      <w:rPr>
+        <w:rFonts w:ascii="Courier New" w:hAnsi="Courier New" w:cs="Courier New" w:hint="default"/>
+      </w:rPr>
+    </w:lvl>
+    <w:lvl w:ilvl="8" w:tplc="04090005">
+      <w:start w:val="1"/>
+      <w:numFmt w:val="bullet"/>
+      <w:lvlText w:val=""/>
+      <w:lvlJc w:val="left"/>
+      <w:pPr>
+        <w:ind w:left="6480" w:hanging="360"/>
+      </w:pPr>
+      <w:rPr>
+        <w:rFonts w:ascii="Wingdings" w:hAnsi="Wingdings" w:hint="default"/>
+      </w:rPr>
+    </w:lvl>
+  </w:abstractNum>
   <w:num w:numId="1">
-    <w:abstractNumId w:val="0"/>
+    <w:abstractNumId w:val="1"/>
   </w:num>
   <w:num w:numId="2">
-    <w:abstractNumId w:val="1"/>
+    <w:abstractNumId w:val="2"/>
   </w:num>
   <w:num w:numId="3">
+    <w:abstractNumId w:val="6"/>
+  </w:num>
+  <w:num w:numId="4">
     <w:abstractNumId w:val="4"/>
   </w:num>
-  <w:num w:numId="4">
-    <w:abstractNumId w:val="2"/>
-  </w:num>
   <w:num w:numId="5">
-    <w:abstractNumId w:val="5"/>
+    <w:abstractNumId w:val="7"/>
   </w:num>
   <w:num w:numId="6">
-    <w:abstractNumId w:val="3"/>
+    <w:abstractNumId w:val="5"/>
     <w:lvlOverride w:ilvl="0">
       <w:startOverride w:val="1"/>
     </w:lvlOverride>
@@ -3709,11 +5609,20 @@
       <w:startOverride w:val="1"/>
     </w:lvlOverride>
   </w:num>
+  <w:num w:numId="7">
+    <w:abstractNumId w:val="8"/>
+  </w:num>
+  <w:num w:numId="8">
+    <w:abstractNumId w:val="3"/>
+  </w:num>
+  <w:num w:numId="9">
+    <w:abstractNumId w:val="0"/>
+  </w:num>
 </w:numbering>
 </file>
 
 <file path=word/styles.xml><?xml version="1.0" encoding="utf-8"?>
-<w:styles xmlns:mc="http://schemas.openxmlformats.org/markup-compatibility/2006" xmlns:r="http://schemas.openxmlformats.org/officeDocument/2006/relationships" xmlns:w="http://schemas.openxmlformats.org/wordprocessingml/2006/main" xmlns:w14="http://schemas.microsoft.com/office/word/2010/wordml" xmlns:w15="http://schemas.microsoft.com/office/word/2012/wordml" xmlns:w16cex="http://schemas.microsoft.com/office/word/2018/wordml/cex" xmlns:w16cid="http://schemas.microsoft.com/office/word/2016/wordml/cid" xmlns:w16="http://schemas.microsoft.com/office/word/2018/wordml" xmlns:w16sdtdh="http://schemas.microsoft.com/office/word/2020/wordml/sdtdatahash" xmlns:w16se="http://schemas.microsoft.com/office/word/2015/wordml/symex" mc:Ignorable="w14 w15 w16se w16cid w16 w16cex w16sdtdh">
+<w:styles xmlns:mc="http://schemas.openxmlformats.org/markup-compatibility/2006" xmlns:r="http://schemas.openxmlformats.org/officeDocument/2006/relationships" xmlns:w="http://schemas.openxmlformats.org/wordprocessingml/2006/main" xmlns:w14="http://schemas.microsoft.com/office/word/2010/wordml" xmlns:w15="http://schemas.microsoft.com/office/word/2012/wordml" xmlns:w16cid="http://schemas.microsoft.com/office/word/2016/wordml/cid" xmlns:w16se="http://schemas.microsoft.com/office/word/2015/wordml/symex" mc:Ignorable="w14 w15 w16se w16cid">
   <w:docDefaults>
     <w:rPrDefault>
       <w:rPr>
@@ -3723,7 +5632,7 @@
     </w:rPrDefault>
     <w:pPrDefault/>
   </w:docDefaults>
-  <w:latentStyles w:defLockedState="0" w:defUIPriority="0" w:defSemiHidden="0" w:defUnhideWhenUsed="0" w:defQFormat="0" w:count="376">
+  <w:latentStyles w:defLockedState="0" w:defUIPriority="0" w:defSemiHidden="0" w:defUnhideWhenUsed="0" w:defQFormat="0" w:count="375">
     <w:lsdException w:name="Normal" w:qFormat="1"/>
     <w:lsdException w:name="heading 1" w:qFormat="1"/>
     <w:lsdException w:name="heading 2" w:semiHidden="1" w:unhideWhenUsed="1" w:qFormat="1"/>
@@ -3756,7 +5665,7 @@
     <w:lsdException w:name="footnote text" w:semiHidden="1" w:unhideWhenUsed="1"/>
     <w:lsdException w:name="annotation text" w:semiHidden="1" w:unhideWhenUsed="1"/>
     <w:lsdException w:name="header" w:semiHidden="1" w:unhideWhenUsed="1"/>
-    <w:lsdException w:name="footer" w:semiHidden="1" w:unhideWhenUsed="1"/>
+    <w:lsdException w:name="footer" w:semiHidden="1" w:uiPriority="99" w:unhideWhenUsed="1"/>
     <w:lsdException w:name="index heading" w:semiHidden="1" w:unhideWhenUsed="1"/>
     <w:lsdException w:name="caption" w:semiHidden="1" w:unhideWhenUsed="1" w:qFormat="1"/>
     <w:lsdException w:name="table of figures" w:semiHidden="1" w:unhideWhenUsed="1"/>
@@ -3822,6 +5731,7 @@
     <w:lsdException w:name="HTML Sample" w:semiHidden="1" w:unhideWhenUsed="1"/>
     <w:lsdException w:name="HTML Typewriter" w:semiHidden="1" w:unhideWhenUsed="1"/>
     <w:lsdException w:name="HTML Variable" w:semiHidden="1" w:unhideWhenUsed="1"/>
+    <w:lsdException w:name="Normal Table" w:semiHidden="1" w:unhideWhenUsed="1"/>
     <w:lsdException w:name="annotation subject" w:semiHidden="1" w:unhideWhenUsed="1"/>
     <w:lsdException w:name="No List" w:semiHidden="1" w:unhideWhenUsed="1"/>
     <w:lsdException w:name="Outline List 1" w:semiHidden="1" w:unhideWhenUsed="1"/>
@@ -3868,7 +5778,9 @@
     <w:lsdException w:name="Table Subtle 2" w:semiHidden="1" w:unhideWhenUsed="1"/>
     <w:lsdException w:name="Table Web 1" w:semiHidden="1" w:unhideWhenUsed="1"/>
     <w:lsdException w:name="Table Web 2" w:semiHidden="1" w:unhideWhenUsed="1"/>
+    <w:lsdException w:name="Table Web 3" w:semiHidden="1" w:unhideWhenUsed="1"/>
     <w:lsdException w:name="Balloon Text" w:semiHidden="1" w:unhideWhenUsed="1"/>
+    <w:lsdException w:name="Table Theme" w:semiHidden="1" w:unhideWhenUsed="1"/>
     <w:lsdException w:name="Placeholder Text" w:semiHidden="1" w:uiPriority="99"/>
     <w:lsdException w:name="No Spacing" w:uiPriority="1" w:qFormat="1"/>
     <w:lsdException w:name="Light Shading" w:uiPriority="60"/>
@@ -4088,7 +6000,6 @@
     <w:lsdException w:name="Smart Hyperlink" w:semiHidden="1" w:uiPriority="99" w:unhideWhenUsed="1"/>
     <w:lsdException w:name="Hashtag" w:semiHidden="1" w:uiPriority="99" w:unhideWhenUsed="1"/>
     <w:lsdException w:name="Unresolved Mention" w:semiHidden="1" w:uiPriority="99" w:unhideWhenUsed="1"/>
-    <w:lsdException w:name="Smart Link" w:semiHidden="1" w:uiPriority="99" w:unhideWhenUsed="1"/>
   </w:latentStyles>
   <w:style w:type="paragraph" w:default="1" w:styleId="Normal">
     <w:name w:val="Normal"/>
@@ -4159,6 +6070,8 @@
   <w:style w:type="paragraph" w:styleId="Footer">
     <w:name w:val="footer"/>
     <w:basedOn w:val="Normal"/>
+    <w:link w:val="FooterChar"/>
+    <w:uiPriority w:val="99"/>
     <w:pPr>
       <w:tabs>
         <w:tab w:val="center" w:pos="4320"/>
@@ -4299,6 +6212,13 @@
       <w:ind w:left="720"/>
       <w:contextualSpacing/>
     </w:pPr>
+  </w:style>
+  <w:style w:type="character" w:customStyle="1" w:styleId="FooterChar">
+    <w:name w:val="Footer Char"/>
+    <w:basedOn w:val="DefaultParagraphFont"/>
+    <w:link w:val="Footer"/>
+    <w:uiPriority w:val="99"/>
+    <w:rsid w:val="007029C1"/>
   </w:style>
 </w:styles>
 </file>
@@ -4593,7 +6513,7 @@
 </file>
 
 <file path=customXml/itemProps1.xml><?xml version="1.0" encoding="utf-8"?>
-<ds:datastoreItem xmlns:ds="http://schemas.openxmlformats.org/officeDocument/2006/customXml" ds:itemID="{BD1CC2B7-12EA-4A00-9F3D-44277EBF1674}">
+<ds:datastoreItem xmlns:ds="http://schemas.openxmlformats.org/officeDocument/2006/customXml" ds:itemID="{457DB984-8D7C-4CA0-A319-FF1C6E181766}">
   <ds:schemaRefs>
     <ds:schemaRef ds:uri="http://schemas.openxmlformats.org/officeDocument/2006/bibliography"/>
   </ds:schemaRefs>

</xml_diff>

<commit_message>
Code in the footer of the template does not work. Removed the code, then the template preview worked.
</commit_message>
<xml_diff>
--- a/docassemble/CR234OnlineSecuredCashBondPostingAgreement/data/templates/CR234_Online_Secured_Cash_Bond_Posting_Agreement.docx
+++ b/docassemble/CR234OnlineSecuredCashBondPostingAgreement/data/templates/CR234_Online_Secured_Cash_Bond_Posting_Agreement.docx
@@ -4175,14 +4175,14 @@
         </w:rPr>
         <w:t>{%p endif %}</w:t>
       </w:r>
-      <w:bookmarkStart w:id="9" w:name="_GoBack"/>
-      <w:bookmarkEnd w:id="9"/>
     </w:p>
     <w:sectPr>
-      <w:headerReference w:type="default" r:id="rId11"/>
-      <w:footerReference w:type="default" r:id="rId12"/>
-      <w:headerReference w:type="first" r:id="rId13"/>
-      <w:footerReference w:type="first" r:id="rId14"/>
+      <w:headerReference w:type="even" r:id="rId11"/>
+      <w:headerReference w:type="default" r:id="rId12"/>
+      <w:footerReference w:type="even" r:id="rId13"/>
+      <w:footerReference w:type="default" r:id="rId14"/>
+      <w:headerReference w:type="first" r:id="rId15"/>
+      <w:footerReference w:type="first" r:id="rId16"/>
       <w:pgSz w:w="12240" w:h="15840" w:code="1"/>
       <w:pgMar w:top="990" w:right="1440" w:bottom="720" w:left="1440" w:header="720" w:footer="432" w:gutter="0"/>
       <w:cols w:space="720"/>
@@ -4213,6 +4213,16 @@
 </file>
 
 <file path=word/footer1.xml><?xml version="1.0" encoding="utf-8"?>
+<w:ftr xmlns:wpc="http://schemas.microsoft.com/office/word/2010/wordprocessingCanvas" xmlns:cx="http://schemas.microsoft.com/office/drawing/2014/chartex" xmlns:cx1="http://schemas.microsoft.com/office/drawing/2015/9/8/chartex" xmlns:cx2="http://schemas.microsoft.com/office/drawing/2015/10/21/chartex" xmlns:cx3="http://schemas.microsoft.com/office/drawing/2016/5/9/chartex" xmlns:cx4="http://schemas.microsoft.com/office/drawing/2016/5/10/chartex" xmlns:cx5="http://schemas.microsoft.com/office/drawing/2016/5/11/chartex" xmlns:cx6="http://schemas.microsoft.com/office/drawing/2016/5/12/chartex" xmlns:cx7="http://schemas.microsoft.com/office/drawing/2016/5/13/chartex" xmlns:cx8="http://schemas.microsoft.com/office/drawing/2016/5/14/chartex" xmlns:mc="http://schemas.openxmlformats.org/markup-compatibility/2006" xmlns:aink="http://schemas.microsoft.com/office/drawing/2016/ink" xmlns:am3d="http://schemas.microsoft.com/office/drawing/2017/model3d" xmlns:o="urn:schemas-microsoft-com:office:office" xmlns:r="http://schemas.openxmlformats.org/officeDocument/2006/relationships" xmlns:m="http://schemas.openxmlformats.org/officeDocument/2006/math" xmlns:v="urn:schemas-microsoft-com:vml" xmlns:wp14="http://schemas.microsoft.com/office/word/2010/wordprocessingDrawing" xmlns:wp="http://schemas.openxmlformats.org/drawingml/2006/wordprocessingDrawing" xmlns:w10="urn:schemas-microsoft-com:office:word" xmlns:w="http://schemas.openxmlformats.org/wordprocessingml/2006/main" xmlns:w14="http://schemas.microsoft.com/office/word/2010/wordml" xmlns:w15="http://schemas.microsoft.com/office/word/2012/wordml" xmlns:w16cid="http://schemas.microsoft.com/office/word/2016/wordml/cid" xmlns:w16se="http://schemas.microsoft.com/office/word/2015/wordml/symex" xmlns:wpg="http://schemas.microsoft.com/office/word/2010/wordprocessingGroup" xmlns:wpi="http://schemas.microsoft.com/office/word/2010/wordprocessingInk" xmlns:wne="http://schemas.microsoft.com/office/word/2006/wordml" xmlns:wps="http://schemas.microsoft.com/office/word/2010/wordprocessingShape" mc:Ignorable="w14 w15 w16se w16cid wp14">
+  <w:p>
+    <w:pPr>
+      <w:pStyle w:val="Footer"/>
+    </w:pPr>
+  </w:p>
+</w:ftr>
+</file>
+
+<file path=word/footer2.xml><?xml version="1.0" encoding="utf-8"?>
 <w:ftr xmlns:wpc="http://schemas.microsoft.com/office/word/2010/wordprocessingCanvas" xmlns:cx="http://schemas.microsoft.com/office/drawing/2014/chartex" xmlns:cx1="http://schemas.microsoft.com/office/drawing/2015/9/8/chartex" xmlns:cx2="http://schemas.microsoft.com/office/drawing/2015/10/21/chartex" xmlns:cx3="http://schemas.microsoft.com/office/drawing/2016/5/9/chartex" xmlns:cx4="http://schemas.microsoft.com/office/drawing/2016/5/10/chartex" xmlns:cx5="http://schemas.microsoft.com/office/drawing/2016/5/11/chartex" xmlns:cx6="http://schemas.microsoft.com/office/drawing/2016/5/12/chartex" xmlns:cx7="http://schemas.microsoft.com/office/drawing/2016/5/13/chartex" xmlns:cx8="http://schemas.microsoft.com/office/drawing/2016/5/14/chartex" xmlns:mc="http://schemas.openxmlformats.org/markup-compatibility/2006" xmlns:aink="http://schemas.microsoft.com/office/drawing/2016/ink" xmlns:am3d="http://schemas.microsoft.com/office/drawing/2017/model3d" xmlns:o="urn:schemas-microsoft-com:office:office" xmlns:r="http://schemas.openxmlformats.org/officeDocument/2006/relationships" xmlns:m="http://schemas.openxmlformats.org/officeDocument/2006/math" xmlns:v="urn:schemas-microsoft-com:vml" xmlns:wp14="http://schemas.microsoft.com/office/word/2010/wordprocessingDrawing" xmlns:wp="http://schemas.openxmlformats.org/drawingml/2006/wordprocessingDrawing" xmlns:w10="urn:schemas-microsoft-com:office:word" xmlns:w="http://schemas.openxmlformats.org/wordprocessingml/2006/main" xmlns:w14="http://schemas.microsoft.com/office/word/2010/wordml" xmlns:w15="http://schemas.microsoft.com/office/word/2012/wordml" xmlns:w16cid="http://schemas.microsoft.com/office/word/2016/wordml/cid" xmlns:w16se="http://schemas.microsoft.com/office/word/2015/wordml/symex" xmlns:wpg="http://schemas.microsoft.com/office/word/2010/wordprocessingGroup" xmlns:wpi="http://schemas.microsoft.com/office/word/2010/wordprocessingInk" xmlns:wne="http://schemas.microsoft.com/office/word/2006/wordml" xmlns:wps="http://schemas.microsoft.com/office/word/2010/wordprocessingShape" mc:Ignorable="w14 w15 w16se w16cid wp14">
   <w:sdt>
     <w:sdtPr>
@@ -4469,6 +4479,8 @@
       </w:rPr>
       <w:t>AGREEMENT</w:t>
     </w:r>
+    <w:bookmarkStart w:id="9" w:name="_GoBack"/>
+    <w:bookmarkEnd w:id="9"/>
     <w:r>
       <w:rPr>
         <w:rStyle w:val="PageNumber"/>
@@ -4485,66 +4497,11 @@
         <w:t>Administrative Bulletin 93</w:t>
       </w:r>
     </w:hyperlink>
-  </w:p>
-  <w:p>
-    <w:pPr>
-      <w:tabs>
-        <w:tab w:val="left" w:pos="4680"/>
-        <w:tab w:val="left" w:pos="9270"/>
-      </w:tabs>
-      <w:rPr>
-        <w:rFonts w:ascii="Tahoma" w:hAnsi="Tahoma" w:cs="Tahoma"/>
-      </w:rPr>
-    </w:pPr>
-    <w:r>
-      <w:rPr>
-        <w:rFonts w:ascii="Tahoma" w:hAnsi="Tahoma" w:cs="Tahoma"/>
-      </w:rPr>
-      <w:t xml:space="preserve">{%p if </w:t>
-    </w:r>
-    <w:proofErr w:type="spellStart"/>
-    <w:r>
-      <w:rPr>
-        <w:rFonts w:ascii="Tahoma" w:hAnsi="Tahoma" w:cs="Tahoma"/>
-      </w:rPr>
-      <w:t>person_filing</w:t>
-    </w:r>
-    <w:proofErr w:type="spellEnd"/>
-    <w:r>
-      <w:rPr>
-        <w:rFonts w:ascii="Tahoma" w:hAnsi="Tahoma" w:cs="Tahoma"/>
-      </w:rPr>
-      <w:t xml:space="preserve"> == “defendant” %} </w:t>
-    </w:r>
-    <w:r>
-      <w:rPr>
-        <w:rFonts w:ascii="Tahoma" w:hAnsi="Tahoma" w:cs="Tahoma"/>
-      </w:rPr>
-      <w:t>(Defendant Posting Own Bail)</w:t>
-    </w:r>
-    <w:r>
-      <w:rPr>
-        <w:rFonts w:ascii="Tahoma" w:hAnsi="Tahoma" w:cs="Tahoma"/>
-      </w:rPr>
-      <w:t>{%p else %}</w:t>
-    </w:r>
-    <w:r>
-      <w:rPr>
-        <w:rFonts w:ascii="Tahoma" w:hAnsi="Tahoma" w:cs="Tahoma"/>
-      </w:rPr>
-      <w:t>(Third Person Poster)</w:t>
-    </w:r>
-    <w:r>
-      <w:rPr>
-        <w:rFonts w:ascii="Tahoma" w:hAnsi="Tahoma" w:cs="Tahoma"/>
-      </w:rPr>
-      <w:t>{% endif %}</w:t>
-    </w:r>
   </w:p>
 </w:ftr>
 </file>
 
-<file path=word/footer2.xml><?xml version="1.0" encoding="utf-8"?>
+<file path=word/footer3.xml><?xml version="1.0" encoding="utf-8"?>
 <w:ftr xmlns:wpc="http://schemas.microsoft.com/office/word/2010/wordprocessingCanvas" xmlns:cx="http://schemas.microsoft.com/office/drawing/2014/chartex" xmlns:cx1="http://schemas.microsoft.com/office/drawing/2015/9/8/chartex" xmlns:cx2="http://schemas.microsoft.com/office/drawing/2015/10/21/chartex" xmlns:cx3="http://schemas.microsoft.com/office/drawing/2016/5/9/chartex" xmlns:cx4="http://schemas.microsoft.com/office/drawing/2016/5/10/chartex" xmlns:cx5="http://schemas.microsoft.com/office/drawing/2016/5/11/chartex" xmlns:cx6="http://schemas.microsoft.com/office/drawing/2016/5/12/chartex" xmlns:cx7="http://schemas.microsoft.com/office/drawing/2016/5/13/chartex" xmlns:cx8="http://schemas.microsoft.com/office/drawing/2016/5/14/chartex" xmlns:mc="http://schemas.openxmlformats.org/markup-compatibility/2006" xmlns:aink="http://schemas.microsoft.com/office/drawing/2016/ink" xmlns:am3d="http://schemas.microsoft.com/office/drawing/2017/model3d" xmlns:o="urn:schemas-microsoft-com:office:office" xmlns:r="http://schemas.openxmlformats.org/officeDocument/2006/relationships" xmlns:m="http://schemas.openxmlformats.org/officeDocument/2006/math" xmlns:v="urn:schemas-microsoft-com:vml" xmlns:wp14="http://schemas.microsoft.com/office/word/2010/wordprocessingDrawing" xmlns:wp="http://schemas.openxmlformats.org/drawingml/2006/wordprocessingDrawing" xmlns:w10="urn:schemas-microsoft-com:office:word" xmlns:w="http://schemas.openxmlformats.org/wordprocessingml/2006/main" xmlns:w14="http://schemas.microsoft.com/office/word/2010/wordml" xmlns:w15="http://schemas.microsoft.com/office/word/2012/wordml" xmlns:w16cid="http://schemas.microsoft.com/office/word/2016/wordml/cid" xmlns:w16se="http://schemas.microsoft.com/office/word/2015/wordml/symex" xmlns:wpg="http://schemas.microsoft.com/office/word/2010/wordprocessingGroup" xmlns:wpi="http://schemas.microsoft.com/office/word/2010/wordprocessingInk" xmlns:wne="http://schemas.microsoft.com/office/word/2006/wordml" xmlns:wps="http://schemas.microsoft.com/office/word/2010/wordprocessingShape" mc:Ignorable="w14 w15 w16se w16cid wp14">
   <w:p>
     <w:pPr>
@@ -4802,19 +4759,29 @@
 <w:hdr xmlns:wpc="http://schemas.microsoft.com/office/word/2010/wordprocessingCanvas" xmlns:cx="http://schemas.microsoft.com/office/drawing/2014/chartex" xmlns:cx1="http://schemas.microsoft.com/office/drawing/2015/9/8/chartex" xmlns:cx2="http://schemas.microsoft.com/office/drawing/2015/10/21/chartex" xmlns:cx3="http://schemas.microsoft.com/office/drawing/2016/5/9/chartex" xmlns:cx4="http://schemas.microsoft.com/office/drawing/2016/5/10/chartex" xmlns:cx5="http://schemas.microsoft.com/office/drawing/2016/5/11/chartex" xmlns:cx6="http://schemas.microsoft.com/office/drawing/2016/5/12/chartex" xmlns:cx7="http://schemas.microsoft.com/office/drawing/2016/5/13/chartex" xmlns:cx8="http://schemas.microsoft.com/office/drawing/2016/5/14/chartex" xmlns:mc="http://schemas.openxmlformats.org/markup-compatibility/2006" xmlns:aink="http://schemas.microsoft.com/office/drawing/2016/ink" xmlns:am3d="http://schemas.microsoft.com/office/drawing/2017/model3d" xmlns:o="urn:schemas-microsoft-com:office:office" xmlns:r="http://schemas.openxmlformats.org/officeDocument/2006/relationships" xmlns:m="http://schemas.openxmlformats.org/officeDocument/2006/math" xmlns:v="urn:schemas-microsoft-com:vml" xmlns:wp14="http://schemas.microsoft.com/office/word/2010/wordprocessingDrawing" xmlns:wp="http://schemas.openxmlformats.org/drawingml/2006/wordprocessingDrawing" xmlns:w10="urn:schemas-microsoft-com:office:word" xmlns:w="http://schemas.openxmlformats.org/wordprocessingml/2006/main" xmlns:w14="http://schemas.microsoft.com/office/word/2010/wordml" xmlns:w15="http://schemas.microsoft.com/office/word/2012/wordml" xmlns:w16cid="http://schemas.microsoft.com/office/word/2016/wordml/cid" xmlns:w16se="http://schemas.microsoft.com/office/word/2015/wordml/symex" xmlns:wpg="http://schemas.microsoft.com/office/word/2010/wordprocessingGroup" xmlns:wpi="http://schemas.microsoft.com/office/word/2010/wordprocessingInk" xmlns:wne="http://schemas.microsoft.com/office/word/2006/wordml" xmlns:wps="http://schemas.microsoft.com/office/word/2010/wordprocessingShape" mc:Ignorable="w14 w15 w16se w16cid wp14">
   <w:p>
     <w:pPr>
-      <w:tabs>
-        <w:tab w:val="right" w:pos="9360"/>
-      </w:tabs>
-      <w:rPr>
-        <w:rFonts w:ascii="Tahoma" w:hAnsi="Tahoma" w:cs="Tahoma"/>
-        <w:sz w:val="18"/>
-      </w:rPr>
+      <w:pStyle w:val="Header"/>
     </w:pPr>
   </w:p>
 </w:hdr>
 </file>
 
 <file path=word/header2.xml><?xml version="1.0" encoding="utf-8"?>
+<w:hdr xmlns:wpc="http://schemas.microsoft.com/office/word/2010/wordprocessingCanvas" xmlns:cx="http://schemas.microsoft.com/office/drawing/2014/chartex" xmlns:cx1="http://schemas.microsoft.com/office/drawing/2015/9/8/chartex" xmlns:cx2="http://schemas.microsoft.com/office/drawing/2015/10/21/chartex" xmlns:cx3="http://schemas.microsoft.com/office/drawing/2016/5/9/chartex" xmlns:cx4="http://schemas.microsoft.com/office/drawing/2016/5/10/chartex" xmlns:cx5="http://schemas.microsoft.com/office/drawing/2016/5/11/chartex" xmlns:cx6="http://schemas.microsoft.com/office/drawing/2016/5/12/chartex" xmlns:cx7="http://schemas.microsoft.com/office/drawing/2016/5/13/chartex" xmlns:cx8="http://schemas.microsoft.com/office/drawing/2016/5/14/chartex" xmlns:mc="http://schemas.openxmlformats.org/markup-compatibility/2006" xmlns:aink="http://schemas.microsoft.com/office/drawing/2016/ink" xmlns:am3d="http://schemas.microsoft.com/office/drawing/2017/model3d" xmlns:o="urn:schemas-microsoft-com:office:office" xmlns:r="http://schemas.openxmlformats.org/officeDocument/2006/relationships" xmlns:m="http://schemas.openxmlformats.org/officeDocument/2006/math" xmlns:v="urn:schemas-microsoft-com:vml" xmlns:wp14="http://schemas.microsoft.com/office/word/2010/wordprocessingDrawing" xmlns:wp="http://schemas.openxmlformats.org/drawingml/2006/wordprocessingDrawing" xmlns:w10="urn:schemas-microsoft-com:office:word" xmlns:w="http://schemas.openxmlformats.org/wordprocessingml/2006/main" xmlns:w14="http://schemas.microsoft.com/office/word/2010/wordml" xmlns:w15="http://schemas.microsoft.com/office/word/2012/wordml" xmlns:w16cid="http://schemas.microsoft.com/office/word/2016/wordml/cid" xmlns:w16se="http://schemas.microsoft.com/office/word/2015/wordml/symex" xmlns:wpg="http://schemas.microsoft.com/office/word/2010/wordprocessingGroup" xmlns:wpi="http://schemas.microsoft.com/office/word/2010/wordprocessingInk" xmlns:wne="http://schemas.microsoft.com/office/word/2006/wordml" xmlns:wps="http://schemas.microsoft.com/office/word/2010/wordprocessingShape" mc:Ignorable="w14 w15 w16se w16cid wp14">
+  <w:p>
+    <w:pPr>
+      <w:tabs>
+        <w:tab w:val="right" w:pos="9360"/>
+      </w:tabs>
+      <w:rPr>
+        <w:rFonts w:ascii="Tahoma" w:hAnsi="Tahoma" w:cs="Tahoma"/>
+        <w:sz w:val="18"/>
+      </w:rPr>
+    </w:pPr>
+  </w:p>
+</w:hdr>
+</file>
+
+<file path=word/header3.xml><?xml version="1.0" encoding="utf-8"?>
 <w:hdr xmlns:wpc="http://schemas.microsoft.com/office/word/2010/wordprocessingCanvas" xmlns:cx="http://schemas.microsoft.com/office/drawing/2014/chartex" xmlns:cx1="http://schemas.microsoft.com/office/drawing/2015/9/8/chartex" xmlns:cx2="http://schemas.microsoft.com/office/drawing/2015/10/21/chartex" xmlns:cx3="http://schemas.microsoft.com/office/drawing/2016/5/9/chartex" xmlns:cx4="http://schemas.microsoft.com/office/drawing/2016/5/10/chartex" xmlns:cx5="http://schemas.microsoft.com/office/drawing/2016/5/11/chartex" xmlns:cx6="http://schemas.microsoft.com/office/drawing/2016/5/12/chartex" xmlns:cx7="http://schemas.microsoft.com/office/drawing/2016/5/13/chartex" xmlns:cx8="http://schemas.microsoft.com/office/drawing/2016/5/14/chartex" xmlns:mc="http://schemas.openxmlformats.org/markup-compatibility/2006" xmlns:aink="http://schemas.microsoft.com/office/drawing/2016/ink" xmlns:am3d="http://schemas.microsoft.com/office/drawing/2017/model3d" xmlns:o="urn:schemas-microsoft-com:office:office" xmlns:r="http://schemas.openxmlformats.org/officeDocument/2006/relationships" xmlns:m="http://schemas.openxmlformats.org/officeDocument/2006/math" xmlns:v="urn:schemas-microsoft-com:vml" xmlns:wp14="http://schemas.microsoft.com/office/word/2010/wordprocessingDrawing" xmlns:wp="http://schemas.openxmlformats.org/drawingml/2006/wordprocessingDrawing" xmlns:w10="urn:schemas-microsoft-com:office:word" xmlns:w="http://schemas.openxmlformats.org/wordprocessingml/2006/main" xmlns:w14="http://schemas.microsoft.com/office/word/2010/wordml" xmlns:w15="http://schemas.microsoft.com/office/word/2012/wordml" xmlns:w16cid="http://schemas.microsoft.com/office/word/2016/wordml/cid" xmlns:w16se="http://schemas.microsoft.com/office/word/2015/wordml/symex" xmlns:wpg="http://schemas.microsoft.com/office/word/2010/wordprocessingGroup" xmlns:wpi="http://schemas.microsoft.com/office/word/2010/wordprocessingInk" xmlns:wne="http://schemas.microsoft.com/office/word/2006/wordml" xmlns:wps="http://schemas.microsoft.com/office/word/2010/wordprocessingShape" mc:Ignorable="w14 w15 w16se w16cid wp14">
   <w:p>
     <w:pPr>
@@ -6513,7 +6480,7 @@
 </file>
 
 <file path=customXml/itemProps1.xml><?xml version="1.0" encoding="utf-8"?>
-<ds:datastoreItem xmlns:ds="http://schemas.openxmlformats.org/officeDocument/2006/customXml" ds:itemID="{457DB984-8D7C-4CA0-A319-FF1C6E181766}">
+<ds:datastoreItem xmlns:ds="http://schemas.openxmlformats.org/officeDocument/2006/customXml" ds:itemID="{5B13AD4F-4BE3-477E-BE59-DFD99173BA80}">
   <ds:schemaRefs>
     <ds:schemaRef ds:uri="http://schemas.openxmlformats.org/officeDocument/2006/bibliography"/>
   </ds:schemaRefs>

</xml_diff>

<commit_message>
Updated language on ID: CR234 and uploaded an updated Template
</commit_message>
<xml_diff>
--- a/docassemble/CR234OnlineSecuredCashBondPostingAgreement/data/templates/CR234_Online_Secured_Cash_Bond_Posting_Agreement.docx
+++ b/docassemble/CR234OnlineSecuredCashBondPostingAgreement/data/templates/CR234_Online_Secured_Cash_Bond_Posting_Agreement.docx
@@ -573,7 +573,27 @@
           <w:sz w:val="22"/>
           <w:szCs w:val="22"/>
         </w:rPr>
-        <w:t>Notice of Request to Post Secured Cash Bail Online</w:t>
+        <w:t>Notice of Request to Post Secured Cash B</w:t>
+      </w:r>
+      <w:r>
+        <w:rPr>
+          <w:rFonts w:ascii="Tahoma" w:hAnsi="Tahoma" w:cs="Tahoma"/>
+          <w:i/>
+          <w:iCs/>
+          <w:sz w:val="22"/>
+          <w:szCs w:val="22"/>
+        </w:rPr>
+        <w:t>ond</w:t>
+      </w:r>
+      <w:r>
+        <w:rPr>
+          <w:rFonts w:ascii="Tahoma" w:hAnsi="Tahoma" w:cs="Tahoma"/>
+          <w:i/>
+          <w:iCs/>
+          <w:sz w:val="22"/>
+          <w:szCs w:val="22"/>
+        </w:rPr>
+        <w:t xml:space="preserve"> Online</w:t>
       </w:r>
       <w:r>
         <w:rPr>
@@ -2207,7 +2227,7 @@
             <w:sz w:val="22"/>
             <w:szCs w:val="22"/>
           </w:rPr>
-          <w:t>https://public.courts.alaska.gov/web/forms/docs/TF-955.pdf</w:t>
+          <w:t>ak-courts.info/tf955</w:t>
         </w:r>
       </w:hyperlink>
       <w:r>
@@ -2896,13 +2916,8 @@
         </w:rPr>
         <w:tab/>
       </w:r>
-      <w:r>
-        <w:rPr>
-          <w:sz w:val="24"/>
-          <w:szCs w:val="24"/>
-        </w:rPr>
-        <w:t xml:space="preserve"> </w:t>
-      </w:r>
+      <w:bookmarkStart w:id="4" w:name="_GoBack"/>
+      <w:bookmarkEnd w:id="4"/>
       <w:r>
         <w:rPr>
           <w:rFonts w:ascii="Tahoma" w:hAnsi="Tahoma" w:cs="Tahoma"/>
@@ -3191,7 +3206,7 @@
           <w:szCs w:val="22"/>
         </w:rPr>
       </w:pPr>
-      <w:bookmarkStart w:id="4" w:name="_Hlk193959420"/>
+      <w:bookmarkStart w:id="5" w:name="_Hlk193959420"/>
       <w:r>
         <w:rPr>
           <w:rFonts w:ascii="Tahoma" w:hAnsi="Tahoma" w:cs="Tahoma"/>
@@ -3218,7 +3233,7 @@
         </w:rPr>
         <w:t xml:space="preserve"> == “defendant” %}</w:t>
       </w:r>
-      <w:bookmarkEnd w:id="4"/>
+      <w:bookmarkEnd w:id="5"/>
     </w:p>
     <w:p>
       <w:pPr>
@@ -3234,27 +3249,16 @@
           <w:szCs w:val="22"/>
         </w:rPr>
       </w:pPr>
-      <w:bookmarkStart w:id="5" w:name="_Hlk193049304"/>
-      <w:bookmarkStart w:id="6" w:name="_Hlk192677134"/>
-      <w:r>
-        <w:rPr>
-          <w:rFonts w:ascii="Tahoma" w:hAnsi="Tahoma" w:cs="Tahoma"/>
-          <w:sz w:val="22"/>
-          <w:szCs w:val="22"/>
-          <w:highlight w:val="yellow"/>
+      <w:bookmarkStart w:id="6" w:name="_Hlk193049304"/>
+      <w:bookmarkStart w:id="7" w:name="_Hlk192677134"/>
+      <w:r>
+        <w:rPr>
+          <w:rFonts w:ascii="Tahoma" w:hAnsi="Tahoma" w:cs="Tahoma"/>
+          <w:sz w:val="22"/>
+          <w:szCs w:val="22"/>
           <w:u w:val="single"/>
         </w:rPr>
         <w:t>Online bail clerk</w:t>
-      </w:r>
-      <w:r>
-        <w:rPr>
-          <w:rFonts w:ascii="Tahoma" w:hAnsi="Tahoma" w:cs="Tahoma"/>
-          <w:sz w:val="22"/>
-          <w:szCs w:val="22"/>
-          <w:highlight w:val="yellow"/>
-          <w:u w:val="single"/>
-        </w:rPr>
-        <w:t xml:space="preserve"> (only show up for defendant posting on their own behalf)</w:t>
       </w:r>
     </w:p>
     <w:p>
@@ -3271,7 +3275,7 @@
           <w:szCs w:val="22"/>
         </w:rPr>
       </w:pPr>
-      <w:bookmarkStart w:id="7" w:name="_Hlk193048742"/>
+      <w:bookmarkStart w:id="8" w:name="_Hlk193048742"/>
       <w:r>
         <w:rPr>
           <w:rFonts w:ascii="Tahoma" w:hAnsi="Tahoma" w:cs="Tahoma"/>
@@ -3425,8 +3429,8 @@
         <w:t>.</w:t>
       </w:r>
     </w:p>
-    <w:bookmarkEnd w:id="5"/>
-    <w:bookmarkEnd w:id="7"/>
+    <w:bookmarkEnd w:id="6"/>
+    <w:bookmarkEnd w:id="8"/>
     <w:p>
       <w:pPr>
         <w:pStyle w:val="Footer"/>
@@ -3551,7 +3555,7 @@
         </w:rPr>
         <w:t>Email a copy to Pretrial Enforcement Division (PED).</w:t>
       </w:r>
-      <w:bookmarkEnd w:id="6"/>
+      <w:bookmarkEnd w:id="7"/>
     </w:p>
     <w:p>
       <w:pPr>
@@ -3589,56 +3593,15 @@
           <w:szCs w:val="22"/>
         </w:rPr>
       </w:pPr>
-      <w:bookmarkStart w:id="8" w:name="_Hlk193049359"/>
-      <w:r>
-        <w:rPr>
-          <w:rFonts w:ascii="Tahoma" w:hAnsi="Tahoma" w:cs="Tahoma"/>
-          <w:sz w:val="22"/>
-          <w:szCs w:val="22"/>
-          <w:highlight w:val="yellow"/>
+      <w:bookmarkStart w:id="9" w:name="_Hlk193049359"/>
+      <w:r>
+        <w:rPr>
+          <w:rFonts w:ascii="Tahoma" w:hAnsi="Tahoma" w:cs="Tahoma"/>
+          <w:sz w:val="22"/>
+          <w:szCs w:val="22"/>
           <w:u w:val="single"/>
         </w:rPr>
         <w:t>Online bail clerk</w:t>
-      </w:r>
-      <w:r>
-        <w:rPr>
-          <w:rFonts w:ascii="Tahoma" w:hAnsi="Tahoma" w:cs="Tahoma"/>
-          <w:sz w:val="22"/>
-          <w:szCs w:val="22"/>
-          <w:highlight w:val="yellow"/>
-          <w:u w:val="single"/>
-        </w:rPr>
-        <w:t xml:space="preserve"> </w:t>
-      </w:r>
-      <w:r>
-        <w:rPr>
-          <w:rFonts w:ascii="Tahoma" w:hAnsi="Tahoma" w:cs="Tahoma"/>
-          <w:sz w:val="22"/>
-          <w:szCs w:val="22"/>
-          <w:highlight w:val="yellow"/>
-          <w:u w:val="single"/>
-        </w:rPr>
-        <w:t>(only show up for</w:t>
-      </w:r>
-      <w:r>
-        <w:rPr>
-          <w:rFonts w:ascii="Tahoma" w:hAnsi="Tahoma" w:cs="Tahoma"/>
-          <w:sz w:val="22"/>
-          <w:szCs w:val="22"/>
-          <w:highlight w:val="yellow"/>
-          <w:u w:val="single"/>
-        </w:rPr>
-        <w:t xml:space="preserve"> third party, obo</w:t>
-      </w:r>
-      <w:r>
-        <w:rPr>
-          <w:rFonts w:ascii="Tahoma" w:hAnsi="Tahoma" w:cs="Tahoma"/>
-          <w:sz w:val="22"/>
-          <w:szCs w:val="22"/>
-          <w:highlight w:val="yellow"/>
-          <w:u w:val="single"/>
-        </w:rPr>
-        <w:t>)</w:t>
       </w:r>
     </w:p>
     <w:p>
@@ -3861,7 +3824,7 @@
         <w:t>.</w:t>
       </w:r>
     </w:p>
-    <w:bookmarkEnd w:id="8"/>
+    <w:bookmarkEnd w:id="9"/>
     <w:p>
       <w:pPr>
         <w:pStyle w:val="Footer"/>
@@ -4177,12 +4140,10 @@
       </w:r>
     </w:p>
     <w:sectPr>
-      <w:headerReference w:type="even" r:id="rId11"/>
-      <w:headerReference w:type="default" r:id="rId12"/>
-      <w:footerReference w:type="even" r:id="rId13"/>
-      <w:footerReference w:type="default" r:id="rId14"/>
-      <w:headerReference w:type="first" r:id="rId15"/>
-      <w:footerReference w:type="first" r:id="rId16"/>
+      <w:headerReference w:type="default" r:id="rId11"/>
+      <w:footerReference w:type="default" r:id="rId12"/>
+      <w:headerReference w:type="first" r:id="rId13"/>
+      <w:footerReference w:type="first" r:id="rId14"/>
       <w:pgSz w:w="12240" w:h="15840" w:code="1"/>
       <w:pgMar w:top="990" w:right="1440" w:bottom="720" w:left="1440" w:header="720" w:footer="432" w:gutter="0"/>
       <w:cols w:space="720"/>
@@ -4214,16 +4175,6 @@
 
 <file path=word/footer1.xml><?xml version="1.0" encoding="utf-8"?>
 <w:ftr xmlns:wpc="http://schemas.microsoft.com/office/word/2010/wordprocessingCanvas" xmlns:cx="http://schemas.microsoft.com/office/drawing/2014/chartex" xmlns:cx1="http://schemas.microsoft.com/office/drawing/2015/9/8/chartex" xmlns:cx2="http://schemas.microsoft.com/office/drawing/2015/10/21/chartex" xmlns:cx3="http://schemas.microsoft.com/office/drawing/2016/5/9/chartex" xmlns:cx4="http://schemas.microsoft.com/office/drawing/2016/5/10/chartex" xmlns:cx5="http://schemas.microsoft.com/office/drawing/2016/5/11/chartex" xmlns:cx6="http://schemas.microsoft.com/office/drawing/2016/5/12/chartex" xmlns:cx7="http://schemas.microsoft.com/office/drawing/2016/5/13/chartex" xmlns:cx8="http://schemas.microsoft.com/office/drawing/2016/5/14/chartex" xmlns:mc="http://schemas.openxmlformats.org/markup-compatibility/2006" xmlns:aink="http://schemas.microsoft.com/office/drawing/2016/ink" xmlns:am3d="http://schemas.microsoft.com/office/drawing/2017/model3d" xmlns:o="urn:schemas-microsoft-com:office:office" xmlns:r="http://schemas.openxmlformats.org/officeDocument/2006/relationships" xmlns:m="http://schemas.openxmlformats.org/officeDocument/2006/math" xmlns:v="urn:schemas-microsoft-com:vml" xmlns:wp14="http://schemas.microsoft.com/office/word/2010/wordprocessingDrawing" xmlns:wp="http://schemas.openxmlformats.org/drawingml/2006/wordprocessingDrawing" xmlns:w10="urn:schemas-microsoft-com:office:word" xmlns:w="http://schemas.openxmlformats.org/wordprocessingml/2006/main" xmlns:w14="http://schemas.microsoft.com/office/word/2010/wordml" xmlns:w15="http://schemas.microsoft.com/office/word/2012/wordml" xmlns:w16cid="http://schemas.microsoft.com/office/word/2016/wordml/cid" xmlns:w16se="http://schemas.microsoft.com/office/word/2015/wordml/symex" xmlns:wpg="http://schemas.microsoft.com/office/word/2010/wordprocessingGroup" xmlns:wpi="http://schemas.microsoft.com/office/word/2010/wordprocessingInk" xmlns:wne="http://schemas.microsoft.com/office/word/2006/wordml" xmlns:wps="http://schemas.microsoft.com/office/word/2010/wordprocessingShape" mc:Ignorable="w14 w15 w16se w16cid wp14">
-  <w:p>
-    <w:pPr>
-      <w:pStyle w:val="Footer"/>
-    </w:pPr>
-  </w:p>
-</w:ftr>
-</file>
-
-<file path=word/footer2.xml><?xml version="1.0" encoding="utf-8"?>
-<w:ftr xmlns:wpc="http://schemas.microsoft.com/office/word/2010/wordprocessingCanvas" xmlns:cx="http://schemas.microsoft.com/office/drawing/2014/chartex" xmlns:cx1="http://schemas.microsoft.com/office/drawing/2015/9/8/chartex" xmlns:cx2="http://schemas.microsoft.com/office/drawing/2015/10/21/chartex" xmlns:cx3="http://schemas.microsoft.com/office/drawing/2016/5/9/chartex" xmlns:cx4="http://schemas.microsoft.com/office/drawing/2016/5/10/chartex" xmlns:cx5="http://schemas.microsoft.com/office/drawing/2016/5/11/chartex" xmlns:cx6="http://schemas.microsoft.com/office/drawing/2016/5/12/chartex" xmlns:cx7="http://schemas.microsoft.com/office/drawing/2016/5/13/chartex" xmlns:cx8="http://schemas.microsoft.com/office/drawing/2016/5/14/chartex" xmlns:mc="http://schemas.openxmlformats.org/markup-compatibility/2006" xmlns:aink="http://schemas.microsoft.com/office/drawing/2016/ink" xmlns:am3d="http://schemas.microsoft.com/office/drawing/2017/model3d" xmlns:o="urn:schemas-microsoft-com:office:office" xmlns:r="http://schemas.openxmlformats.org/officeDocument/2006/relationships" xmlns:m="http://schemas.openxmlformats.org/officeDocument/2006/math" xmlns:v="urn:schemas-microsoft-com:vml" xmlns:wp14="http://schemas.microsoft.com/office/word/2010/wordprocessingDrawing" xmlns:wp="http://schemas.openxmlformats.org/drawingml/2006/wordprocessingDrawing" xmlns:w10="urn:schemas-microsoft-com:office:word" xmlns:w="http://schemas.openxmlformats.org/wordprocessingml/2006/main" xmlns:w14="http://schemas.microsoft.com/office/word/2010/wordml" xmlns:w15="http://schemas.microsoft.com/office/word/2012/wordml" xmlns:w16cid="http://schemas.microsoft.com/office/word/2016/wordml/cid" xmlns:w16se="http://schemas.microsoft.com/office/word/2015/wordml/symex" xmlns:wpg="http://schemas.microsoft.com/office/word/2010/wordprocessingGroup" xmlns:wpi="http://schemas.microsoft.com/office/word/2010/wordprocessingInk" xmlns:wne="http://schemas.microsoft.com/office/word/2006/wordml" xmlns:wps="http://schemas.microsoft.com/office/word/2010/wordprocessingShape" mc:Ignorable="w14 w15 w16se w16cid wp14">
   <w:sdt>
     <w:sdtPr>
       <w:id w:val="2088504538"/>
@@ -4232,6 +4183,7 @@
         <w:docPartUnique/>
       </w:docPartObj>
     </w:sdtPr>
+    <w:sdtEndPr/>
     <w:sdtContent>
       <w:sdt>
         <w:sdtPr>
@@ -4241,6 +4193,7 @@
             <w:docPartUnique/>
           </w:docPartObj>
         </w:sdtPr>
+        <w:sdtEndPr/>
         <w:sdtContent>
           <w:p>
             <w:pPr>
@@ -4370,7 +4323,7 @@
         <w:rStyle w:val="PageNumber"/>
         <w:rFonts w:ascii="Tahoma" w:hAnsi="Tahoma" w:cs="Tahoma"/>
       </w:rPr>
-      <w:t>234A (3/25)</w:t>
+      <w:t>234 (3/25)</w:t>
     </w:r>
     <w:r>
       <w:rPr>
@@ -4479,8 +4432,6 @@
       </w:rPr>
       <w:t>AGREEMENT</w:t>
     </w:r>
-    <w:bookmarkStart w:id="9" w:name="_GoBack"/>
-    <w:bookmarkEnd w:id="9"/>
     <w:r>
       <w:rPr>
         <w:rStyle w:val="PageNumber"/>
@@ -4501,7 +4452,7 @@
 </w:ftr>
 </file>
 
-<file path=word/footer3.xml><?xml version="1.0" encoding="utf-8"?>
+<file path=word/footer2.xml><?xml version="1.0" encoding="utf-8"?>
 <w:ftr xmlns:wpc="http://schemas.microsoft.com/office/word/2010/wordprocessingCanvas" xmlns:cx="http://schemas.microsoft.com/office/drawing/2014/chartex" xmlns:cx1="http://schemas.microsoft.com/office/drawing/2015/9/8/chartex" xmlns:cx2="http://schemas.microsoft.com/office/drawing/2015/10/21/chartex" xmlns:cx3="http://schemas.microsoft.com/office/drawing/2016/5/9/chartex" xmlns:cx4="http://schemas.microsoft.com/office/drawing/2016/5/10/chartex" xmlns:cx5="http://schemas.microsoft.com/office/drawing/2016/5/11/chartex" xmlns:cx6="http://schemas.microsoft.com/office/drawing/2016/5/12/chartex" xmlns:cx7="http://schemas.microsoft.com/office/drawing/2016/5/13/chartex" xmlns:cx8="http://schemas.microsoft.com/office/drawing/2016/5/14/chartex" xmlns:mc="http://schemas.openxmlformats.org/markup-compatibility/2006" xmlns:aink="http://schemas.microsoft.com/office/drawing/2016/ink" xmlns:am3d="http://schemas.microsoft.com/office/drawing/2017/model3d" xmlns:o="urn:schemas-microsoft-com:office:office" xmlns:r="http://schemas.openxmlformats.org/officeDocument/2006/relationships" xmlns:m="http://schemas.openxmlformats.org/officeDocument/2006/math" xmlns:v="urn:schemas-microsoft-com:vml" xmlns:wp14="http://schemas.microsoft.com/office/word/2010/wordprocessingDrawing" xmlns:wp="http://schemas.openxmlformats.org/drawingml/2006/wordprocessingDrawing" xmlns:w10="urn:schemas-microsoft-com:office:word" xmlns:w="http://schemas.openxmlformats.org/wordprocessingml/2006/main" xmlns:w14="http://schemas.microsoft.com/office/word/2010/wordml" xmlns:w15="http://schemas.microsoft.com/office/word/2012/wordml" xmlns:w16cid="http://schemas.microsoft.com/office/word/2016/wordml/cid" xmlns:w16se="http://schemas.microsoft.com/office/word/2015/wordml/symex" xmlns:wpg="http://schemas.microsoft.com/office/word/2010/wordprocessingGroup" xmlns:wpi="http://schemas.microsoft.com/office/word/2010/wordprocessingInk" xmlns:wne="http://schemas.microsoft.com/office/word/2006/wordml" xmlns:wps="http://schemas.microsoft.com/office/word/2010/wordprocessingShape" mc:Ignorable="w14 w15 w16se w16cid wp14">
   <w:p>
     <w:pPr>
@@ -4606,7 +4557,7 @@
         <w:rStyle w:val="PageNumber"/>
         <w:rFonts w:ascii="Tahoma" w:hAnsi="Tahoma" w:cs="Tahoma"/>
       </w:rPr>
-      <w:t>234A (3/25)</w:t>
+      <w:t>234 (3/25)</w:t>
     </w:r>
     <w:r>
       <w:rPr>
@@ -4759,29 +4710,19 @@
 <w:hdr xmlns:wpc="http://schemas.microsoft.com/office/word/2010/wordprocessingCanvas" xmlns:cx="http://schemas.microsoft.com/office/drawing/2014/chartex" xmlns:cx1="http://schemas.microsoft.com/office/drawing/2015/9/8/chartex" xmlns:cx2="http://schemas.microsoft.com/office/drawing/2015/10/21/chartex" xmlns:cx3="http://schemas.microsoft.com/office/drawing/2016/5/9/chartex" xmlns:cx4="http://schemas.microsoft.com/office/drawing/2016/5/10/chartex" xmlns:cx5="http://schemas.microsoft.com/office/drawing/2016/5/11/chartex" xmlns:cx6="http://schemas.microsoft.com/office/drawing/2016/5/12/chartex" xmlns:cx7="http://schemas.microsoft.com/office/drawing/2016/5/13/chartex" xmlns:cx8="http://schemas.microsoft.com/office/drawing/2016/5/14/chartex" xmlns:mc="http://schemas.openxmlformats.org/markup-compatibility/2006" xmlns:aink="http://schemas.microsoft.com/office/drawing/2016/ink" xmlns:am3d="http://schemas.microsoft.com/office/drawing/2017/model3d" xmlns:o="urn:schemas-microsoft-com:office:office" xmlns:r="http://schemas.openxmlformats.org/officeDocument/2006/relationships" xmlns:m="http://schemas.openxmlformats.org/officeDocument/2006/math" xmlns:v="urn:schemas-microsoft-com:vml" xmlns:wp14="http://schemas.microsoft.com/office/word/2010/wordprocessingDrawing" xmlns:wp="http://schemas.openxmlformats.org/drawingml/2006/wordprocessingDrawing" xmlns:w10="urn:schemas-microsoft-com:office:word" xmlns:w="http://schemas.openxmlformats.org/wordprocessingml/2006/main" xmlns:w14="http://schemas.microsoft.com/office/word/2010/wordml" xmlns:w15="http://schemas.microsoft.com/office/word/2012/wordml" xmlns:w16cid="http://schemas.microsoft.com/office/word/2016/wordml/cid" xmlns:w16se="http://schemas.microsoft.com/office/word/2015/wordml/symex" xmlns:wpg="http://schemas.microsoft.com/office/word/2010/wordprocessingGroup" xmlns:wpi="http://schemas.microsoft.com/office/word/2010/wordprocessingInk" xmlns:wne="http://schemas.microsoft.com/office/word/2006/wordml" xmlns:wps="http://schemas.microsoft.com/office/word/2010/wordprocessingShape" mc:Ignorable="w14 w15 w16se w16cid wp14">
   <w:p>
     <w:pPr>
-      <w:pStyle w:val="Header"/>
+      <w:tabs>
+        <w:tab w:val="right" w:pos="9360"/>
+      </w:tabs>
+      <w:rPr>
+        <w:rFonts w:ascii="Tahoma" w:hAnsi="Tahoma" w:cs="Tahoma"/>
+        <w:sz w:val="18"/>
+      </w:rPr>
     </w:pPr>
   </w:p>
 </w:hdr>
 </file>
 
 <file path=word/header2.xml><?xml version="1.0" encoding="utf-8"?>
-<w:hdr xmlns:wpc="http://schemas.microsoft.com/office/word/2010/wordprocessingCanvas" xmlns:cx="http://schemas.microsoft.com/office/drawing/2014/chartex" xmlns:cx1="http://schemas.microsoft.com/office/drawing/2015/9/8/chartex" xmlns:cx2="http://schemas.microsoft.com/office/drawing/2015/10/21/chartex" xmlns:cx3="http://schemas.microsoft.com/office/drawing/2016/5/9/chartex" xmlns:cx4="http://schemas.microsoft.com/office/drawing/2016/5/10/chartex" xmlns:cx5="http://schemas.microsoft.com/office/drawing/2016/5/11/chartex" xmlns:cx6="http://schemas.microsoft.com/office/drawing/2016/5/12/chartex" xmlns:cx7="http://schemas.microsoft.com/office/drawing/2016/5/13/chartex" xmlns:cx8="http://schemas.microsoft.com/office/drawing/2016/5/14/chartex" xmlns:mc="http://schemas.openxmlformats.org/markup-compatibility/2006" xmlns:aink="http://schemas.microsoft.com/office/drawing/2016/ink" xmlns:am3d="http://schemas.microsoft.com/office/drawing/2017/model3d" xmlns:o="urn:schemas-microsoft-com:office:office" xmlns:r="http://schemas.openxmlformats.org/officeDocument/2006/relationships" xmlns:m="http://schemas.openxmlformats.org/officeDocument/2006/math" xmlns:v="urn:schemas-microsoft-com:vml" xmlns:wp14="http://schemas.microsoft.com/office/word/2010/wordprocessingDrawing" xmlns:wp="http://schemas.openxmlformats.org/drawingml/2006/wordprocessingDrawing" xmlns:w10="urn:schemas-microsoft-com:office:word" xmlns:w="http://schemas.openxmlformats.org/wordprocessingml/2006/main" xmlns:w14="http://schemas.microsoft.com/office/word/2010/wordml" xmlns:w15="http://schemas.microsoft.com/office/word/2012/wordml" xmlns:w16cid="http://schemas.microsoft.com/office/word/2016/wordml/cid" xmlns:w16se="http://schemas.microsoft.com/office/word/2015/wordml/symex" xmlns:wpg="http://schemas.microsoft.com/office/word/2010/wordprocessingGroup" xmlns:wpi="http://schemas.microsoft.com/office/word/2010/wordprocessingInk" xmlns:wne="http://schemas.microsoft.com/office/word/2006/wordml" xmlns:wps="http://schemas.microsoft.com/office/word/2010/wordprocessingShape" mc:Ignorable="w14 w15 w16se w16cid wp14">
-  <w:p>
-    <w:pPr>
-      <w:tabs>
-        <w:tab w:val="right" w:pos="9360"/>
-      </w:tabs>
-      <w:rPr>
-        <w:rFonts w:ascii="Tahoma" w:hAnsi="Tahoma" w:cs="Tahoma"/>
-        <w:sz w:val="18"/>
-      </w:rPr>
-    </w:pPr>
-  </w:p>
-</w:hdr>
-</file>
-
-<file path=word/header3.xml><?xml version="1.0" encoding="utf-8"?>
 <w:hdr xmlns:wpc="http://schemas.microsoft.com/office/word/2010/wordprocessingCanvas" xmlns:cx="http://schemas.microsoft.com/office/drawing/2014/chartex" xmlns:cx1="http://schemas.microsoft.com/office/drawing/2015/9/8/chartex" xmlns:cx2="http://schemas.microsoft.com/office/drawing/2015/10/21/chartex" xmlns:cx3="http://schemas.microsoft.com/office/drawing/2016/5/9/chartex" xmlns:cx4="http://schemas.microsoft.com/office/drawing/2016/5/10/chartex" xmlns:cx5="http://schemas.microsoft.com/office/drawing/2016/5/11/chartex" xmlns:cx6="http://schemas.microsoft.com/office/drawing/2016/5/12/chartex" xmlns:cx7="http://schemas.microsoft.com/office/drawing/2016/5/13/chartex" xmlns:cx8="http://schemas.microsoft.com/office/drawing/2016/5/14/chartex" xmlns:mc="http://schemas.openxmlformats.org/markup-compatibility/2006" xmlns:aink="http://schemas.microsoft.com/office/drawing/2016/ink" xmlns:am3d="http://schemas.microsoft.com/office/drawing/2017/model3d" xmlns:o="urn:schemas-microsoft-com:office:office" xmlns:r="http://schemas.openxmlformats.org/officeDocument/2006/relationships" xmlns:m="http://schemas.openxmlformats.org/officeDocument/2006/math" xmlns:v="urn:schemas-microsoft-com:vml" xmlns:wp14="http://schemas.microsoft.com/office/word/2010/wordprocessingDrawing" xmlns:wp="http://schemas.openxmlformats.org/drawingml/2006/wordprocessingDrawing" xmlns:w10="urn:schemas-microsoft-com:office:word" xmlns:w="http://schemas.openxmlformats.org/wordprocessingml/2006/main" xmlns:w14="http://schemas.microsoft.com/office/word/2010/wordml" xmlns:w15="http://schemas.microsoft.com/office/word/2012/wordml" xmlns:w16cid="http://schemas.microsoft.com/office/word/2016/wordml/cid" xmlns:w16se="http://schemas.microsoft.com/office/word/2015/wordml/symex" xmlns:wpg="http://schemas.microsoft.com/office/word/2010/wordprocessingGroup" xmlns:wpi="http://schemas.microsoft.com/office/word/2010/wordprocessingInk" xmlns:wne="http://schemas.microsoft.com/office/word/2006/wordml" xmlns:wps="http://schemas.microsoft.com/office/word/2010/wordprocessingShape" mc:Ignorable="w14 w15 w16se w16cid wp14">
   <w:p>
     <w:pPr>
@@ -6480,7 +6421,7 @@
 </file>
 
 <file path=customXml/itemProps1.xml><?xml version="1.0" encoding="utf-8"?>
-<ds:datastoreItem xmlns:ds="http://schemas.openxmlformats.org/officeDocument/2006/customXml" ds:itemID="{5B13AD4F-4BE3-477E-BE59-DFD99173BA80}">
+<ds:datastoreItem xmlns:ds="http://schemas.openxmlformats.org/officeDocument/2006/customXml" ds:itemID="{B4814FE9-28A0-4FD1-9D1B-10EA584A3388}">
   <ds:schemaRefs>
     <ds:schemaRef ds:uri="http://schemas.openxmlformats.org/officeDocument/2006/bibliography"/>
   </ds:schemaRefs>

</xml_diff>

<commit_message>
Updated template and adjusted text size of question on ID Money Deposit
</commit_message>
<xml_diff>
--- a/docassemble/CR234OnlineSecuredCashBondPostingAgreement/data/templates/CR234_Online_Secured_Cash_Bond_Posting_Agreement.docx
+++ b/docassemble/CR234OnlineSecuredCashBondPostingAgreement/data/templates/CR234_Online_Secured_Cash_Bond_Posting_Agreement.docx
@@ -1139,8 +1139,100 @@
           <w:sz w:val="22"/>
           <w:szCs w:val="22"/>
         </w:rPr>
+        <w:t>,</w:t>
+      </w:r>
+      <w:r>
+        <w:rPr>
+          <w:rFonts w:ascii="Tahoma" w:hAnsi="Tahoma" w:cs="Tahoma"/>
+          <w:sz w:val="22"/>
+          <w:szCs w:val="22"/>
+        </w:rPr>
+        <w:t xml:space="preserve"> </w:t>
+      </w:r>
+      <w:r>
+        <w:rPr>
+          <w:rFonts w:ascii="Tahoma" w:hAnsi="Tahoma" w:cs="Tahoma"/>
+          <w:sz w:val="22"/>
+          <w:szCs w:val="22"/>
+        </w:rPr>
+        <w:t xml:space="preserve">{% if </w:t>
+      </w:r>
+      <w:proofErr w:type="spellStart"/>
+      <w:r>
+        <w:rPr>
+          <w:rFonts w:ascii="Tahoma" w:hAnsi="Tahoma" w:cs="Tahoma"/>
+          <w:sz w:val="22"/>
+          <w:szCs w:val="22"/>
+        </w:rPr>
+        <w:t>person_filing</w:t>
+      </w:r>
+      <w:proofErr w:type="spellEnd"/>
+      <w:r>
+        <w:rPr>
+          <w:rFonts w:ascii="Tahoma" w:hAnsi="Tahoma" w:cs="Tahoma"/>
+          <w:sz w:val="22"/>
+          <w:szCs w:val="22"/>
+        </w:rPr>
+        <w:t xml:space="preserve"> == “defendant” %}</w:t>
+      </w:r>
+      <w:r>
+        <w:rPr>
+          <w:rFonts w:ascii="Tahoma" w:hAnsi="Tahoma" w:cs="Tahoma"/>
+          <w:sz w:val="22"/>
+          <w:szCs w:val="22"/>
+        </w:rPr>
+        <w:t>and if I am convicted of the offense</w:t>
+      </w:r>
+      <w:r>
+        <w:rPr>
+          <w:rFonts w:ascii="Tahoma" w:hAnsi="Tahoma" w:cs="Tahoma"/>
+          <w:sz w:val="22"/>
+          <w:szCs w:val="22"/>
+        </w:rPr>
+        <w:t xml:space="preserve">{% else %}and </w:t>
+      </w:r>
+      <w:r>
+        <w:rPr>
+          <w:rFonts w:ascii="Tahoma" w:hAnsi="Tahoma" w:cs="Tahoma"/>
+          <w:bCs/>
+          <w:sz w:val="22"/>
+          <w:szCs w:val="22"/>
+        </w:rPr>
+        <w:t>if the defendant is convicted of the offense</w:t>
+      </w:r>
+      <w:r>
+        <w:rPr>
+          <w:rFonts w:ascii="Tahoma" w:hAnsi="Tahoma" w:cs="Tahoma"/>
+          <w:sz w:val="22"/>
+          <w:szCs w:val="22"/>
+        </w:rPr>
+        <w:t>{% endif %}</w:t>
+      </w:r>
+      <w:r>
+        <w:rPr>
+          <w:rFonts w:ascii="Tahoma" w:hAnsi="Tahoma" w:cs="Tahoma"/>
+          <w:sz w:val="22"/>
+          <w:szCs w:val="22"/>
+        </w:rPr>
         <w:t>:</w:t>
       </w:r>
+    </w:p>
+    <w:p>
+      <w:pPr>
+        <w:pStyle w:val="ListParagraph"/>
+        <w:tabs>
+          <w:tab w:val="left" w:pos="4680"/>
+          <w:tab w:val="left" w:pos="9270"/>
+        </w:tabs>
+        <w:spacing w:before="120" w:after="120"/>
+        <w:ind w:left="360"/>
+        <w:contextualSpacing w:val="0"/>
+        <w:rPr>
+          <w:rFonts w:ascii="Tahoma" w:hAnsi="Tahoma" w:cs="Tahoma"/>
+          <w:sz w:val="22"/>
+          <w:szCs w:val="22"/>
+        </w:rPr>
+      </w:pPr>
       <w:r>
         <w:rPr>
           <w:rFonts w:ascii="Tahoma" w:hAnsi="Tahoma" w:cs="Tahoma"/>
@@ -1410,14 +1502,7 @@
           <w:sz w:val="24"/>
           <w:szCs w:val="24"/>
         </w:rPr>
-        <w:t>name</w:t>
-      </w:r>
-      <w:r>
-        <w:rPr>
-          <w:sz w:val="24"/>
-          <w:szCs w:val="24"/>
-        </w:rPr>
-        <w:t>.first</w:t>
+        <w:t>name.first</w:t>
       </w:r>
       <w:proofErr w:type="spellEnd"/>
       <w:r>
@@ -1847,15 +1932,15 @@
           <w:sz w:val="22"/>
           <w:szCs w:val="22"/>
         </w:rPr>
-        <w:t xml:space="preserve">the mailing </w:t>
-      </w:r>
-      <w:r>
-        <w:rPr>
-          <w:rFonts w:ascii="Tahoma" w:hAnsi="Tahoma" w:cs="Tahoma"/>
-          <w:sz w:val="22"/>
-          <w:szCs w:val="22"/>
-        </w:rPr>
-        <w:t xml:space="preserve">or email </w:t>
+        <w:t xml:space="preserve">the </w:t>
+      </w:r>
+      <w:r>
+        <w:rPr>
+          <w:rFonts w:ascii="Tahoma" w:hAnsi="Tahoma" w:cs="Tahoma"/>
+          <w:sz w:val="22"/>
+          <w:szCs w:val="22"/>
+        </w:rPr>
+        <w:t xml:space="preserve">email </w:t>
       </w:r>
       <w:r>
         <w:rPr>
@@ -1963,7 +2048,31 @@
           <w:sz w:val="22"/>
           <w:szCs w:val="22"/>
         </w:rPr>
-        <w:t xml:space="preserve">, the jail will not release me until the full bond amount has been posted for every case that has a bond requirement.  The court will only notify the jail of bond payments made during </w:t>
+        <w:t xml:space="preserve">, the jail will not release me until the full bond amount has been posted for every case that has a bond requirement.  The court will only notify the jail </w:t>
+      </w:r>
+      <w:r>
+        <w:rPr>
+          <w:rFonts w:ascii="Tahoma" w:hAnsi="Tahoma" w:cs="Tahoma"/>
+          <w:sz w:val="22"/>
+          <w:szCs w:val="22"/>
+        </w:rPr>
+        <w:t>when full bond payment has been made</w:t>
+      </w:r>
+      <w:r>
+        <w:rPr>
+          <w:rFonts w:ascii="Tahoma" w:hAnsi="Tahoma" w:cs="Tahoma"/>
+          <w:sz w:val="22"/>
+          <w:szCs w:val="22"/>
+        </w:rPr>
+        <w:t>,</w:t>
+      </w:r>
+      <w:r>
+        <w:rPr>
+          <w:rFonts w:ascii="Tahoma" w:hAnsi="Tahoma" w:cs="Tahoma"/>
+          <w:sz w:val="22"/>
+          <w:szCs w:val="22"/>
+        </w:rPr>
+        <w:t xml:space="preserve"> during </w:t>
       </w:r>
       <w:hyperlink r:id="rId8" w:history="1">
         <w:r>
@@ -2007,6 +2116,7 @@
           <w:sz w:val="22"/>
           <w:szCs w:val="22"/>
         </w:rPr>
+        <w:lastRenderedPageBreak/>
         <w:t>{%p else %}</w:t>
       </w:r>
     </w:p>
@@ -2031,8 +2141,39 @@
           <w:sz w:val="22"/>
           <w:szCs w:val="22"/>
         </w:rPr>
-        <w:lastRenderedPageBreak/>
-        <w:t xml:space="preserve">If the defendant is in custody, the jail will not release them until the full bond amount has been posted for every case that has a bond requirement.  The court will only notify the jail of bond payments made during </w:t>
+        <w:t xml:space="preserve">If the defendant is in custody, the jail will not release them until the full bond amount has been posted for every case that has a bond requirement.  The court will only notify the jail </w:t>
+      </w:r>
+      <w:r>
+        <w:rPr>
+          <w:rFonts w:ascii="Tahoma" w:hAnsi="Tahoma" w:cs="Tahoma"/>
+          <w:sz w:val="22"/>
+          <w:szCs w:val="22"/>
+        </w:rPr>
+        <w:t xml:space="preserve">when full bond payment has been </w:t>
+      </w:r>
+      <w:r>
+        <w:rPr>
+          <w:rFonts w:ascii="Tahoma" w:hAnsi="Tahoma" w:cs="Tahoma"/>
+          <w:sz w:val="22"/>
+          <w:szCs w:val="22"/>
+        </w:rPr>
+        <w:t>made</w:t>
+      </w:r>
+      <w:r>
+        <w:rPr>
+          <w:rFonts w:ascii="Tahoma" w:hAnsi="Tahoma" w:cs="Tahoma"/>
+          <w:sz w:val="22"/>
+          <w:szCs w:val="22"/>
+        </w:rPr>
+        <w:t>,</w:t>
+      </w:r>
+      <w:r>
+        <w:rPr>
+          <w:rFonts w:ascii="Tahoma" w:hAnsi="Tahoma" w:cs="Tahoma"/>
+          <w:sz w:val="22"/>
+          <w:szCs w:val="22"/>
+        </w:rPr>
+        <w:t xml:space="preserve"> during </w:t>
       </w:r>
       <w:hyperlink r:id="rId9" w:history="1">
         <w:r>
@@ -2916,8 +3057,6 @@
         </w:rPr>
         <w:tab/>
       </w:r>
-      <w:bookmarkStart w:id="4" w:name="_GoBack"/>
-      <w:bookmarkEnd w:id="4"/>
       <w:r>
         <w:rPr>
           <w:rFonts w:ascii="Tahoma" w:hAnsi="Tahoma" w:cs="Tahoma"/>
@@ -3152,61 +3291,14 @@
           <w:tab w:val="clear" w:pos="8640"/>
         </w:tabs>
         <w:spacing w:before="120" w:line="220" w:lineRule="exact"/>
-        <w:jc w:val="center"/>
-        <w:rPr>
-          <w:rFonts w:ascii="Tahoma" w:hAnsi="Tahoma" w:cs="Tahoma"/>
-          <w:b/>
+        <w:rPr>
+          <w:rFonts w:ascii="Tahoma" w:hAnsi="Tahoma" w:cs="Tahoma"/>
           <w:bCs/>
           <w:sz w:val="22"/>
           <w:szCs w:val="22"/>
         </w:rPr>
       </w:pPr>
-      <w:r>
-        <w:rPr>
-          <w:rFonts w:ascii="Tahoma" w:hAnsi="Tahoma" w:cs="Tahoma"/>
-          <w:b/>
-          <w:bCs/>
-          <w:sz w:val="22"/>
-          <w:szCs w:val="22"/>
-        </w:rPr>
-        <w:t xml:space="preserve">Distribution Instructions for </w:t>
-      </w:r>
-      <w:r>
-        <w:rPr>
-          <w:rFonts w:ascii="Tahoma" w:hAnsi="Tahoma" w:cs="Tahoma"/>
-          <w:b/>
-          <w:bCs/>
-          <w:sz w:val="22"/>
-          <w:szCs w:val="22"/>
-        </w:rPr>
-        <w:t>t</w:t>
-      </w:r>
-      <w:r>
-        <w:rPr>
-          <w:rFonts w:ascii="Tahoma" w:hAnsi="Tahoma" w:cs="Tahoma"/>
-          <w:b/>
-          <w:bCs/>
-          <w:sz w:val="22"/>
-          <w:szCs w:val="22"/>
-        </w:rPr>
-        <w:t>his Form</w:t>
-      </w:r>
-    </w:p>
-    <w:p>
-      <w:pPr>
-        <w:pStyle w:val="Footer"/>
-        <w:tabs>
-          <w:tab w:val="clear" w:pos="8640"/>
-        </w:tabs>
-        <w:spacing w:before="120" w:line="220" w:lineRule="exact"/>
-        <w:rPr>
-          <w:rFonts w:ascii="Tahoma" w:hAnsi="Tahoma" w:cs="Tahoma"/>
-          <w:bCs/>
-          <w:sz w:val="22"/>
-          <w:szCs w:val="22"/>
-        </w:rPr>
-      </w:pPr>
-      <w:bookmarkStart w:id="5" w:name="_Hlk193959420"/>
+      <w:bookmarkStart w:id="4" w:name="_Hlk193959420"/>
       <w:r>
         <w:rPr>
           <w:rFonts w:ascii="Tahoma" w:hAnsi="Tahoma" w:cs="Tahoma"/>
@@ -3233,7 +3325,7 @@
         </w:rPr>
         <w:t xml:space="preserve"> == “defendant” %}</w:t>
       </w:r>
-      <w:bookmarkEnd w:id="5"/>
+      <w:bookmarkEnd w:id="4"/>
     </w:p>
     <w:p>
       <w:pPr>
@@ -3249,16 +3341,52 @@
           <w:szCs w:val="22"/>
         </w:rPr>
       </w:pPr>
-      <w:bookmarkStart w:id="6" w:name="_Hlk193049304"/>
-      <w:bookmarkStart w:id="7" w:name="_Hlk192677134"/>
-      <w:r>
-        <w:rPr>
-          <w:rFonts w:ascii="Tahoma" w:hAnsi="Tahoma" w:cs="Tahoma"/>
-          <w:sz w:val="22"/>
-          <w:szCs w:val="22"/>
-          <w:u w:val="single"/>
-        </w:rPr>
-        <w:t>Online bail clerk</w:t>
+      <w:bookmarkStart w:id="5" w:name="_Hlk193049304"/>
+      <w:bookmarkStart w:id="6" w:name="_Hlk192677134"/>
+      <w:r>
+        <w:rPr>
+          <w:rFonts w:ascii="Tahoma" w:hAnsi="Tahoma" w:cs="Tahoma"/>
+          <w:sz w:val="22"/>
+          <w:szCs w:val="22"/>
+          <w:u w:val="single"/>
+        </w:rPr>
+        <w:t xml:space="preserve">Online </w:t>
+      </w:r>
+      <w:r>
+        <w:rPr>
+          <w:rFonts w:ascii="Tahoma" w:hAnsi="Tahoma" w:cs="Tahoma"/>
+          <w:sz w:val="22"/>
+          <w:szCs w:val="22"/>
+          <w:u w:val="single"/>
+        </w:rPr>
+        <w:t>B</w:t>
+      </w:r>
+      <w:r>
+        <w:rPr>
+          <w:rFonts w:ascii="Tahoma" w:hAnsi="Tahoma" w:cs="Tahoma"/>
+          <w:sz w:val="22"/>
+          <w:szCs w:val="22"/>
+          <w:u w:val="single"/>
+        </w:rPr>
+        <w:t xml:space="preserve">ail </w:t>
+      </w:r>
+      <w:r>
+        <w:rPr>
+          <w:rFonts w:ascii="Tahoma" w:hAnsi="Tahoma" w:cs="Tahoma"/>
+          <w:sz w:val="22"/>
+          <w:szCs w:val="22"/>
+          <w:u w:val="single"/>
+        </w:rPr>
+        <w:t>Cl</w:t>
+      </w:r>
+      <w:r>
+        <w:rPr>
+          <w:rFonts w:ascii="Tahoma" w:hAnsi="Tahoma" w:cs="Tahoma"/>
+          <w:sz w:val="22"/>
+          <w:szCs w:val="22"/>
+          <w:u w:val="single"/>
+        </w:rPr>
+        <w:t>erk</w:t>
       </w:r>
     </w:p>
     <w:p>
@@ -3275,7 +3403,7 @@
           <w:szCs w:val="22"/>
         </w:rPr>
       </w:pPr>
-      <w:bookmarkStart w:id="8" w:name="_Hlk193048742"/>
+      <w:bookmarkStart w:id="7" w:name="_Hlk193048742"/>
       <w:r>
         <w:rPr>
           <w:rFonts w:ascii="Tahoma" w:hAnsi="Tahoma" w:cs="Tahoma"/>
@@ -3309,39 +3437,7 @@
           <w:sz w:val="22"/>
           <w:szCs w:val="22"/>
         </w:rPr>
-        <w:t>a full b</w:t>
-      </w:r>
-      <w:r>
-        <w:rPr>
-          <w:rFonts w:ascii="Tahoma" w:hAnsi="Tahoma" w:cs="Tahoma"/>
-          <w:sz w:val="22"/>
-          <w:szCs w:val="22"/>
-        </w:rPr>
-        <w:t>ond</w:t>
-      </w:r>
-      <w:r>
-        <w:rPr>
-          <w:rFonts w:ascii="Tahoma" w:hAnsi="Tahoma" w:cs="Tahoma"/>
-          <w:sz w:val="22"/>
-          <w:szCs w:val="22"/>
-        </w:rPr>
-        <w:t xml:space="preserve"> payment is made</w:t>
-      </w:r>
-      <w:r>
-        <w:rPr>
-          <w:rFonts w:ascii="Tahoma" w:hAnsi="Tahoma" w:cs="Tahoma"/>
-          <w:sz w:val="22"/>
-          <w:szCs w:val="22"/>
-        </w:rPr>
-        <w:t>,</w:t>
-      </w:r>
-      <w:r>
-        <w:rPr>
-          <w:rFonts w:ascii="Tahoma" w:hAnsi="Tahoma" w:cs="Tahoma"/>
-          <w:sz w:val="22"/>
-          <w:szCs w:val="22"/>
-        </w:rPr>
-        <w:t xml:space="preserve"> </w:t>
+        <w:t xml:space="preserve">a full bond payment is made, </w:t>
       </w:r>
       <w:r>
         <w:rPr>
@@ -3396,41 +3492,9 @@
           <w:sz w:val="22"/>
           <w:szCs w:val="22"/>
         </w:rPr>
-        <w:t>and the due date for posting b</w:t>
-      </w:r>
-      <w:r>
-        <w:rPr>
-          <w:rFonts w:ascii="Tahoma" w:hAnsi="Tahoma" w:cs="Tahoma"/>
-          <w:b/>
-          <w:bCs/>
-          <w:sz w:val="22"/>
-          <w:szCs w:val="22"/>
-        </w:rPr>
-        <w:t>ond</w:t>
-      </w:r>
-      <w:r>
-        <w:rPr>
-          <w:rFonts w:ascii="Tahoma" w:hAnsi="Tahoma" w:cs="Tahoma"/>
-          <w:b/>
-          <w:bCs/>
-          <w:sz w:val="22"/>
-          <w:szCs w:val="22"/>
-        </w:rPr>
-        <w:t xml:space="preserve"> has passed</w:t>
-      </w:r>
-      <w:r>
-        <w:rPr>
-          <w:rFonts w:ascii="Tahoma" w:hAnsi="Tahoma" w:cs="Tahoma"/>
-          <w:b/>
-          <w:bCs/>
-          <w:sz w:val="22"/>
-          <w:szCs w:val="22"/>
-        </w:rPr>
-        <w:t>.</w:t>
-      </w:r>
-    </w:p>
-    <w:bookmarkEnd w:id="6"/>
-    <w:bookmarkEnd w:id="8"/>
+        <w:t>and the due date for posting bond has passed.</w:t>
+      </w:r>
+    </w:p>
     <w:p>
       <w:pPr>
         <w:pStyle w:val="Footer"/>
@@ -3445,16 +3509,56 @@
           <w:szCs w:val="22"/>
         </w:rPr>
       </w:pPr>
-      <w:r>
-        <w:rPr>
-          <w:rFonts w:ascii="Tahoma" w:hAnsi="Tahoma" w:cs="Tahoma"/>
-          <w:sz w:val="22"/>
-          <w:szCs w:val="22"/>
-          <w:u w:val="single"/>
-        </w:rPr>
-        <w:t>Trial court clerk</w:t>
-      </w:r>
-    </w:p>
+      <w:bookmarkStart w:id="8" w:name="_Hlk199503133"/>
+      <w:bookmarkEnd w:id="5"/>
+      <w:bookmarkEnd w:id="7"/>
+      <w:r>
+        <w:rPr>
+          <w:rFonts w:ascii="Tahoma" w:hAnsi="Tahoma" w:cs="Tahoma"/>
+          <w:sz w:val="22"/>
+          <w:szCs w:val="22"/>
+          <w:u w:val="single"/>
+        </w:rPr>
+        <w:t xml:space="preserve">Trial </w:t>
+      </w:r>
+      <w:r>
+        <w:rPr>
+          <w:rFonts w:ascii="Tahoma" w:hAnsi="Tahoma" w:cs="Tahoma"/>
+          <w:sz w:val="22"/>
+          <w:szCs w:val="22"/>
+          <w:u w:val="single"/>
+        </w:rPr>
+        <w:t>C</w:t>
+      </w:r>
+      <w:r>
+        <w:rPr>
+          <w:rFonts w:ascii="Tahoma" w:hAnsi="Tahoma" w:cs="Tahoma"/>
+          <w:sz w:val="22"/>
+          <w:szCs w:val="22"/>
+          <w:u w:val="single"/>
+        </w:rPr>
+        <w:t xml:space="preserve">ourt </w:t>
+      </w:r>
+      <w:r>
+        <w:rPr>
+          <w:rFonts w:ascii="Tahoma" w:hAnsi="Tahoma" w:cs="Tahoma"/>
+          <w:sz w:val="22"/>
+          <w:szCs w:val="22"/>
+          <w:u w:val="single"/>
+        </w:rPr>
+        <w:t>C</w:t>
+      </w:r>
+      <w:r>
+        <w:rPr>
+          <w:rFonts w:ascii="Tahoma" w:hAnsi="Tahoma" w:cs="Tahoma"/>
+          <w:sz w:val="22"/>
+          <w:szCs w:val="22"/>
+          <w:u w:val="single"/>
+        </w:rPr>
+        <w:t>lerk</w:t>
+      </w:r>
+    </w:p>
+    <w:bookmarkEnd w:id="8"/>
     <w:p>
       <w:pPr>
         <w:pStyle w:val="Footer"/>
@@ -3507,11 +3611,15 @@
         <w:contextualSpacing w:val="0"/>
         <w:rPr>
           <w:rFonts w:ascii="Tahoma" w:hAnsi="Tahoma" w:cs="Tahoma"/>
-        </w:rPr>
-      </w:pPr>
-      <w:r>
-        <w:rPr>
-          <w:rFonts w:ascii="Tahoma" w:hAnsi="Tahoma" w:cs="Tahoma"/>
+          <w:sz w:val="22"/>
+          <w:szCs w:val="22"/>
+        </w:rPr>
+      </w:pPr>
+      <w:r>
+        <w:rPr>
+          <w:rFonts w:ascii="Tahoma" w:hAnsi="Tahoma" w:cs="Tahoma"/>
+          <w:sz w:val="22"/>
+          <w:szCs w:val="22"/>
         </w:rPr>
         <w:t>If the defendant has an attorney, email a copy to the attorney.</w:t>
       </w:r>
@@ -3527,11 +3635,15 @@
         <w:contextualSpacing w:val="0"/>
         <w:rPr>
           <w:rFonts w:ascii="Tahoma" w:hAnsi="Tahoma" w:cs="Tahoma"/>
-        </w:rPr>
-      </w:pPr>
-      <w:r>
-        <w:rPr>
-          <w:rFonts w:ascii="Tahoma" w:hAnsi="Tahoma" w:cs="Tahoma"/>
+          <w:sz w:val="22"/>
+          <w:szCs w:val="22"/>
+        </w:rPr>
+      </w:pPr>
+      <w:r>
+        <w:rPr>
+          <w:rFonts w:ascii="Tahoma" w:hAnsi="Tahoma" w:cs="Tahoma"/>
+          <w:sz w:val="22"/>
+          <w:szCs w:val="22"/>
         </w:rPr>
         <w:t>If self-represented, email a copy to the defendant.  If the defendant has not provided an email address, use regular mail instead.</w:t>
       </w:r>
@@ -3547,15 +3659,19 @@
         <w:contextualSpacing w:val="0"/>
         <w:rPr>
           <w:rFonts w:ascii="Tahoma" w:hAnsi="Tahoma" w:cs="Tahoma"/>
-        </w:rPr>
-      </w:pPr>
-      <w:r>
-        <w:rPr>
-          <w:rFonts w:ascii="Tahoma" w:hAnsi="Tahoma" w:cs="Tahoma"/>
+          <w:sz w:val="22"/>
+          <w:szCs w:val="22"/>
+        </w:rPr>
+      </w:pPr>
+      <w:r>
+        <w:rPr>
+          <w:rFonts w:ascii="Tahoma" w:hAnsi="Tahoma" w:cs="Tahoma"/>
+          <w:sz w:val="22"/>
+          <w:szCs w:val="22"/>
         </w:rPr>
         <w:t>Email a copy to Pretrial Enforcement Division (PED).</w:t>
       </w:r>
-      <w:bookmarkEnd w:id="7"/>
+      <w:bookmarkEnd w:id="6"/>
     </w:p>
     <w:p>
       <w:pPr>
@@ -3601,7 +3717,43 @@
           <w:szCs w:val="22"/>
           <w:u w:val="single"/>
         </w:rPr>
-        <w:t>Online bail clerk</w:t>
+        <w:t xml:space="preserve">Online </w:t>
+      </w:r>
+      <w:r>
+        <w:rPr>
+          <w:rFonts w:ascii="Tahoma" w:hAnsi="Tahoma" w:cs="Tahoma"/>
+          <w:sz w:val="22"/>
+          <w:szCs w:val="22"/>
+          <w:u w:val="single"/>
+        </w:rPr>
+        <w:t>B</w:t>
+      </w:r>
+      <w:r>
+        <w:rPr>
+          <w:rFonts w:ascii="Tahoma" w:hAnsi="Tahoma" w:cs="Tahoma"/>
+          <w:sz w:val="22"/>
+          <w:szCs w:val="22"/>
+          <w:u w:val="single"/>
+        </w:rPr>
+        <w:t xml:space="preserve">ail </w:t>
+      </w:r>
+      <w:r>
+        <w:rPr>
+          <w:rFonts w:ascii="Tahoma" w:hAnsi="Tahoma" w:cs="Tahoma"/>
+          <w:sz w:val="22"/>
+          <w:szCs w:val="22"/>
+          <w:u w:val="single"/>
+        </w:rPr>
+        <w:t>C</w:t>
+      </w:r>
+      <w:r>
+        <w:rPr>
+          <w:rFonts w:ascii="Tahoma" w:hAnsi="Tahoma" w:cs="Tahoma"/>
+          <w:sz w:val="22"/>
+          <w:szCs w:val="22"/>
+          <w:u w:val="single"/>
+        </w:rPr>
+        <w:t>lerk</w:t>
       </w:r>
     </w:p>
     <w:p>
@@ -3667,15 +3819,7 @@
           <w:sz w:val="22"/>
           <w:szCs w:val="22"/>
         </w:rPr>
-        <w:t xml:space="preserve">(2) </w:t>
-      </w:r>
-      <w:r>
-        <w:rPr>
-          <w:rFonts w:ascii="Tahoma" w:hAnsi="Tahoma" w:cs="Tahoma"/>
-          <w:sz w:val="22"/>
-          <w:szCs w:val="22"/>
-        </w:rPr>
-        <w:t xml:space="preserve">Email a copy to the trial court for upload into OnBase when </w:t>
+        <w:t xml:space="preserve">(2) Email a copy to the trial court for upload into OnBase when </w:t>
       </w:r>
     </w:p>
     <w:p>
@@ -3703,39 +3847,7 @@
           <w:sz w:val="22"/>
           <w:szCs w:val="22"/>
         </w:rPr>
-        <w:t>a full b</w:t>
-      </w:r>
-      <w:r>
-        <w:rPr>
-          <w:rFonts w:ascii="Tahoma" w:hAnsi="Tahoma" w:cs="Tahoma"/>
-          <w:sz w:val="22"/>
-          <w:szCs w:val="22"/>
-        </w:rPr>
-        <w:t>ond</w:t>
-      </w:r>
-      <w:r>
-        <w:rPr>
-          <w:rFonts w:ascii="Tahoma" w:hAnsi="Tahoma" w:cs="Tahoma"/>
-          <w:sz w:val="22"/>
-          <w:szCs w:val="22"/>
-        </w:rPr>
-        <w:t xml:space="preserve"> payment is made</w:t>
-      </w:r>
-      <w:r>
-        <w:rPr>
-          <w:rFonts w:ascii="Tahoma" w:hAnsi="Tahoma" w:cs="Tahoma"/>
-          <w:sz w:val="22"/>
-          <w:szCs w:val="22"/>
-        </w:rPr>
-        <w:t>,</w:t>
-      </w:r>
-      <w:r>
-        <w:rPr>
-          <w:rFonts w:ascii="Tahoma" w:hAnsi="Tahoma" w:cs="Tahoma"/>
-          <w:sz w:val="22"/>
-          <w:szCs w:val="22"/>
-        </w:rPr>
-        <w:t xml:space="preserve"> </w:t>
+        <w:t xml:space="preserve">a full bond payment is made, </w:t>
       </w:r>
       <w:r>
         <w:rPr>
@@ -3791,40 +3903,9 @@
           <w:sz w:val="22"/>
           <w:szCs w:val="22"/>
         </w:rPr>
-        <w:t>and the due date for posting b</w:t>
-      </w:r>
-      <w:r>
-        <w:rPr>
-          <w:rFonts w:ascii="Tahoma" w:hAnsi="Tahoma" w:cs="Tahoma"/>
-          <w:b/>
-          <w:bCs/>
-          <w:sz w:val="22"/>
-          <w:szCs w:val="22"/>
-        </w:rPr>
-        <w:t>ond</w:t>
-      </w:r>
-      <w:r>
-        <w:rPr>
-          <w:rFonts w:ascii="Tahoma" w:hAnsi="Tahoma" w:cs="Tahoma"/>
-          <w:b/>
-          <w:bCs/>
-          <w:sz w:val="22"/>
-          <w:szCs w:val="22"/>
-        </w:rPr>
-        <w:t xml:space="preserve"> has passed</w:t>
-      </w:r>
-      <w:r>
-        <w:rPr>
-          <w:rFonts w:ascii="Tahoma" w:hAnsi="Tahoma" w:cs="Tahoma"/>
-          <w:b/>
-          <w:bCs/>
-          <w:sz w:val="22"/>
-          <w:szCs w:val="22"/>
-        </w:rPr>
-        <w:t>.</w:t>
-      </w:r>
-    </w:p>
-    <w:bookmarkEnd w:id="9"/>
+        <w:t>and the due date for posting bond has passed.</w:t>
+      </w:r>
+    </w:p>
     <w:p>
       <w:pPr>
         <w:pStyle w:val="Footer"/>
@@ -3832,12 +3913,12 @@
           <w:tab w:val="clear" w:pos="8640"/>
           <w:tab w:val="right" w:pos="9450"/>
         </w:tabs>
-        <w:rPr>
-          <w:rFonts w:ascii="Tahoma" w:hAnsi="Tahoma" w:cs="Tahoma"/>
-          <w:b/>
-          <w:bCs/>
-          <w:sz w:val="22"/>
-          <w:szCs w:val="22"/>
+        <w:spacing w:before="120"/>
+        <w:rPr>
+          <w:rFonts w:ascii="Tahoma" w:hAnsi="Tahoma" w:cs="Tahoma"/>
+          <w:sz w:val="22"/>
+          <w:szCs w:val="22"/>
+          <w:u w:val="single"/>
         </w:rPr>
       </w:pPr>
     </w:p>
@@ -3848,6 +3929,31 @@
           <w:tab w:val="clear" w:pos="8640"/>
           <w:tab w:val="right" w:pos="9450"/>
         </w:tabs>
+        <w:spacing w:before="120"/>
+        <w:rPr>
+          <w:rFonts w:ascii="Tahoma" w:hAnsi="Tahoma" w:cs="Tahoma"/>
+          <w:sz w:val="22"/>
+          <w:szCs w:val="22"/>
+        </w:rPr>
+      </w:pPr>
+      <w:r>
+        <w:rPr>
+          <w:rFonts w:ascii="Tahoma" w:hAnsi="Tahoma" w:cs="Tahoma"/>
+          <w:sz w:val="22"/>
+          <w:szCs w:val="22"/>
+          <w:u w:val="single"/>
+        </w:rPr>
+        <w:t>Trial Court Clerk</w:t>
+      </w:r>
+      <w:bookmarkEnd w:id="9"/>
+    </w:p>
+    <w:p>
+      <w:pPr>
+        <w:pStyle w:val="Footer"/>
+        <w:tabs>
+          <w:tab w:val="clear" w:pos="8640"/>
+          <w:tab w:val="right" w:pos="9450"/>
+        </w:tabs>
         <w:rPr>
           <w:rFonts w:ascii="Tahoma" w:hAnsi="Tahoma" w:cs="Tahoma"/>
           <w:sz w:val="22"/>
@@ -3862,48 +3968,191 @@
           <w:sz w:val="22"/>
           <w:szCs w:val="22"/>
         </w:rPr>
-        <w:t>If the defendant is in custody</w:t>
-      </w:r>
-      <w:r>
-        <w:rPr>
-          <w:rFonts w:ascii="Tahoma" w:hAnsi="Tahoma" w:cs="Tahoma"/>
-          <w:sz w:val="22"/>
-          <w:szCs w:val="22"/>
-        </w:rPr>
-        <w:t xml:space="preserve">, </w:t>
-      </w:r>
-      <w:r>
-        <w:rPr>
-          <w:rFonts w:ascii="Tahoma" w:hAnsi="Tahoma" w:cs="Tahoma"/>
-          <w:sz w:val="22"/>
-          <w:szCs w:val="22"/>
-          <w:u w:val="single"/>
-        </w:rPr>
-        <w:t>jail or DOC staff</w:t>
-      </w:r>
-      <w:r>
-        <w:rPr>
-          <w:rFonts w:ascii="Tahoma" w:hAnsi="Tahoma" w:cs="Tahoma"/>
-          <w:sz w:val="22"/>
-          <w:szCs w:val="22"/>
-        </w:rPr>
-        <w:t xml:space="preserve"> </w:t>
-      </w:r>
-      <w:r>
-        <w:rPr>
-          <w:rFonts w:ascii="Tahoma" w:hAnsi="Tahoma" w:cs="Tahoma"/>
-          <w:sz w:val="22"/>
-          <w:szCs w:val="22"/>
-        </w:rPr>
-        <w:t>distribute</w:t>
-      </w:r>
-      <w:r>
-        <w:rPr>
-          <w:rFonts w:ascii="Tahoma" w:hAnsi="Tahoma" w:cs="Tahoma"/>
-          <w:sz w:val="22"/>
-          <w:szCs w:val="22"/>
-        </w:rPr>
-        <w:t xml:space="preserve"> as follows:</w:t>
+        <w:t>If the defendant is not in custody</w:t>
+      </w:r>
+      <w:r>
+        <w:rPr>
+          <w:rFonts w:ascii="Tahoma" w:hAnsi="Tahoma" w:cs="Tahoma"/>
+          <w:sz w:val="22"/>
+          <w:szCs w:val="22"/>
+        </w:rPr>
+        <w:t>, distribute as follows:</w:t>
+      </w:r>
+    </w:p>
+    <w:p>
+      <w:pPr>
+        <w:pStyle w:val="ListParagraph"/>
+        <w:numPr>
+          <w:ilvl w:val="0"/>
+          <w:numId w:val="10"/>
+        </w:numPr>
+        <w:spacing w:before="60"/>
+        <w:contextualSpacing w:val="0"/>
+        <w:rPr>
+          <w:rFonts w:ascii="Tahoma" w:hAnsi="Tahoma" w:cs="Tahoma"/>
+          <w:sz w:val="22"/>
+          <w:szCs w:val="22"/>
+        </w:rPr>
+      </w:pPr>
+      <w:r>
+        <w:rPr>
+          <w:rFonts w:ascii="Tahoma" w:hAnsi="Tahoma" w:cs="Tahoma"/>
+          <w:sz w:val="22"/>
+          <w:szCs w:val="22"/>
+        </w:rPr>
+        <w:t>If the defendant has an attorney, email a copy to the attorney.</w:t>
+      </w:r>
+    </w:p>
+    <w:p>
+      <w:pPr>
+        <w:pStyle w:val="ListParagraph"/>
+        <w:numPr>
+          <w:ilvl w:val="0"/>
+          <w:numId w:val="10"/>
+        </w:numPr>
+        <w:spacing w:before="60"/>
+        <w:contextualSpacing w:val="0"/>
+        <w:rPr>
+          <w:rFonts w:ascii="Tahoma" w:hAnsi="Tahoma" w:cs="Tahoma"/>
+          <w:sz w:val="22"/>
+          <w:szCs w:val="22"/>
+        </w:rPr>
+      </w:pPr>
+      <w:r>
+        <w:rPr>
+          <w:rFonts w:ascii="Tahoma" w:hAnsi="Tahoma" w:cs="Tahoma"/>
+          <w:sz w:val="22"/>
+          <w:szCs w:val="22"/>
+        </w:rPr>
+        <w:t>If self-represented, email a copy to the defendant.  If the defendant has not provided an email address, use regular mail instead.</w:t>
+      </w:r>
+    </w:p>
+    <w:p>
+      <w:pPr>
+        <w:pStyle w:val="ListParagraph"/>
+        <w:numPr>
+          <w:ilvl w:val="0"/>
+          <w:numId w:val="10"/>
+        </w:numPr>
+        <w:spacing w:before="60"/>
+        <w:contextualSpacing w:val="0"/>
+        <w:rPr>
+          <w:rFonts w:ascii="Tahoma" w:hAnsi="Tahoma" w:cs="Tahoma"/>
+          <w:sz w:val="22"/>
+          <w:szCs w:val="22"/>
+        </w:rPr>
+      </w:pPr>
+      <w:r>
+        <w:rPr>
+          <w:rFonts w:ascii="Tahoma" w:hAnsi="Tahoma" w:cs="Tahoma"/>
+          <w:sz w:val="22"/>
+          <w:szCs w:val="22"/>
+        </w:rPr>
+        <w:t>Email a copy to Pretrial Enforcement Division (PED).</w:t>
+      </w:r>
+    </w:p>
+    <w:p>
+      <w:pPr>
+        <w:spacing w:before="60"/>
+        <w:ind w:left="360"/>
+        <w:rPr>
+          <w:rFonts w:ascii="Tahoma" w:hAnsi="Tahoma" w:cs="Tahoma"/>
+          <w:sz w:val="22"/>
+          <w:szCs w:val="22"/>
+        </w:rPr>
+      </w:pPr>
+    </w:p>
+    <w:p>
+      <w:pPr>
+        <w:pStyle w:val="Footer"/>
+        <w:tabs>
+          <w:tab w:val="clear" w:pos="8640"/>
+          <w:tab w:val="right" w:pos="9450"/>
+        </w:tabs>
+        <w:jc w:val="center"/>
+        <w:rPr>
+          <w:rFonts w:ascii="Tahoma" w:hAnsi="Tahoma" w:cs="Tahoma"/>
+          <w:b/>
+          <w:bCs/>
+          <w:sz w:val="22"/>
+          <w:szCs w:val="22"/>
+        </w:rPr>
+      </w:pPr>
+      <w:r>
+        <w:rPr>
+          <w:rFonts w:ascii="Tahoma" w:hAnsi="Tahoma" w:cs="Tahoma"/>
+          <w:b/>
+          <w:bCs/>
+          <w:sz w:val="22"/>
+          <w:szCs w:val="22"/>
+        </w:rPr>
+        <w:t>Instructions to Jail or DOC Staff</w:t>
+      </w:r>
+    </w:p>
+    <w:p>
+      <w:pPr>
+        <w:pStyle w:val="Footer"/>
+        <w:tabs>
+          <w:tab w:val="clear" w:pos="8640"/>
+          <w:tab w:val="right" w:pos="9450"/>
+        </w:tabs>
+        <w:jc w:val="center"/>
+        <w:rPr>
+          <w:rFonts w:ascii="Tahoma" w:hAnsi="Tahoma" w:cs="Tahoma"/>
+          <w:b/>
+          <w:bCs/>
+          <w:sz w:val="22"/>
+          <w:szCs w:val="22"/>
+        </w:rPr>
+      </w:pPr>
+      <w:r>
+        <w:rPr>
+          <w:rFonts w:ascii="Tahoma" w:hAnsi="Tahoma" w:cs="Tahoma"/>
+          <w:b/>
+          <w:bCs/>
+          <w:sz w:val="22"/>
+          <w:szCs w:val="22"/>
+        </w:rPr>
+        <w:t>(For In-Custody Defendants)</w:t>
+      </w:r>
+    </w:p>
+    <w:p>
+      <w:pPr>
+        <w:pStyle w:val="Footer"/>
+        <w:tabs>
+          <w:tab w:val="clear" w:pos="8640"/>
+          <w:tab w:val="right" w:pos="9450"/>
+        </w:tabs>
+        <w:jc w:val="center"/>
+        <w:rPr>
+          <w:rFonts w:ascii="Tahoma" w:hAnsi="Tahoma" w:cs="Tahoma"/>
+          <w:b/>
+          <w:bCs/>
+          <w:sz w:val="22"/>
+          <w:szCs w:val="22"/>
+        </w:rPr>
+      </w:pPr>
+    </w:p>
+    <w:p>
+      <w:pPr>
+        <w:pStyle w:val="Footer"/>
+        <w:tabs>
+          <w:tab w:val="clear" w:pos="8640"/>
+          <w:tab w:val="right" w:pos="9450"/>
+        </w:tabs>
+        <w:rPr>
+          <w:rFonts w:ascii="Tahoma" w:hAnsi="Tahoma" w:cs="Tahoma"/>
+          <w:sz w:val="22"/>
+          <w:szCs w:val="22"/>
+        </w:rPr>
+      </w:pPr>
+      <w:r>
+        <w:rPr>
+          <w:rFonts w:ascii="Tahoma" w:hAnsi="Tahoma" w:cs="Tahoma"/>
+          <w:sz w:val="22"/>
+          <w:szCs w:val="22"/>
+        </w:rPr>
+        <w:t>Jail or DOC staff distribute as follows:</w:t>
       </w:r>
     </w:p>
     <w:p>
@@ -3917,11 +4166,15 @@
         <w:contextualSpacing w:val="0"/>
         <w:rPr>
           <w:rFonts w:ascii="Tahoma" w:hAnsi="Tahoma" w:cs="Tahoma"/>
-        </w:rPr>
-      </w:pPr>
-      <w:r>
-        <w:rPr>
-          <w:rFonts w:ascii="Tahoma" w:hAnsi="Tahoma" w:cs="Tahoma"/>
+          <w:sz w:val="22"/>
+          <w:szCs w:val="22"/>
+        </w:rPr>
+      </w:pPr>
+      <w:r>
+        <w:rPr>
+          <w:rFonts w:ascii="Tahoma" w:hAnsi="Tahoma" w:cs="Tahoma"/>
+          <w:sz w:val="22"/>
+          <w:szCs w:val="22"/>
         </w:rPr>
         <w:t>Give a copy to the defendant prior to release.</w:t>
       </w:r>
@@ -3937,184 +4190,20 @@
         <w:contextualSpacing w:val="0"/>
         <w:rPr>
           <w:rFonts w:ascii="Tahoma" w:hAnsi="Tahoma" w:cs="Tahoma"/>
-        </w:rPr>
-      </w:pPr>
-      <w:r>
-        <w:rPr>
-          <w:rFonts w:ascii="Tahoma" w:hAnsi="Tahoma" w:cs="Tahoma"/>
+          <w:sz w:val="22"/>
+          <w:szCs w:val="22"/>
+        </w:rPr>
+      </w:pPr>
+      <w:r>
+        <w:rPr>
+          <w:rFonts w:ascii="Tahoma" w:hAnsi="Tahoma" w:cs="Tahoma"/>
+          <w:sz w:val="22"/>
+          <w:szCs w:val="22"/>
         </w:rPr>
         <w:t>Give a copy to Pretrial Enforcement Division (PED).</w:t>
       </w:r>
-    </w:p>
-    <w:p>
-      <w:pPr>
-        <w:pStyle w:val="Footer"/>
-        <w:tabs>
-          <w:tab w:val="clear" w:pos="8640"/>
-          <w:tab w:val="right" w:pos="9450"/>
-        </w:tabs>
-        <w:rPr>
-          <w:rFonts w:ascii="Tahoma" w:hAnsi="Tahoma" w:cs="Tahoma"/>
-          <w:b/>
-          <w:bCs/>
-          <w:sz w:val="22"/>
-          <w:szCs w:val="22"/>
-        </w:rPr>
-      </w:pPr>
-    </w:p>
-    <w:p>
-      <w:pPr>
-        <w:pStyle w:val="Footer"/>
-        <w:tabs>
-          <w:tab w:val="clear" w:pos="8640"/>
-          <w:tab w:val="right" w:pos="9450"/>
-        </w:tabs>
-        <w:rPr>
-          <w:rFonts w:ascii="Tahoma" w:hAnsi="Tahoma" w:cs="Tahoma"/>
-          <w:sz w:val="22"/>
-          <w:szCs w:val="22"/>
-        </w:rPr>
-      </w:pPr>
-      <w:r>
-        <w:rPr>
-          <w:rFonts w:ascii="Tahoma" w:hAnsi="Tahoma" w:cs="Tahoma"/>
-          <w:b/>
-          <w:bCs/>
-          <w:sz w:val="22"/>
-          <w:szCs w:val="22"/>
-        </w:rPr>
-        <w:t xml:space="preserve">If the defendant is </w:t>
-      </w:r>
-      <w:r>
-        <w:rPr>
-          <w:rFonts w:ascii="Tahoma" w:hAnsi="Tahoma" w:cs="Tahoma"/>
-          <w:b/>
-          <w:bCs/>
-          <w:sz w:val="22"/>
-          <w:szCs w:val="22"/>
-        </w:rPr>
-        <w:t>not</w:t>
-      </w:r>
-      <w:r>
-        <w:rPr>
-          <w:rFonts w:ascii="Tahoma" w:hAnsi="Tahoma" w:cs="Tahoma"/>
-          <w:b/>
-          <w:bCs/>
-          <w:sz w:val="22"/>
-          <w:szCs w:val="22"/>
-        </w:rPr>
-        <w:t xml:space="preserve"> in custody</w:t>
-      </w:r>
-      <w:r>
-        <w:rPr>
-          <w:rFonts w:ascii="Tahoma" w:hAnsi="Tahoma" w:cs="Tahoma"/>
-          <w:sz w:val="22"/>
-          <w:szCs w:val="22"/>
-        </w:rPr>
-        <w:t xml:space="preserve">, </w:t>
-      </w:r>
-      <w:r>
-        <w:rPr>
-          <w:rFonts w:ascii="Tahoma" w:hAnsi="Tahoma" w:cs="Tahoma"/>
-          <w:sz w:val="22"/>
-          <w:szCs w:val="22"/>
-          <w:u w:val="single"/>
-        </w:rPr>
-        <w:t>trial court</w:t>
-      </w:r>
-      <w:r>
-        <w:rPr>
-          <w:rFonts w:ascii="Tahoma" w:hAnsi="Tahoma" w:cs="Tahoma"/>
-          <w:sz w:val="22"/>
-          <w:szCs w:val="22"/>
-          <w:u w:val="single"/>
-        </w:rPr>
-        <w:t xml:space="preserve"> clerk</w:t>
-      </w:r>
-      <w:r>
-        <w:rPr>
-          <w:rFonts w:ascii="Tahoma" w:hAnsi="Tahoma" w:cs="Tahoma"/>
-          <w:sz w:val="22"/>
-          <w:szCs w:val="22"/>
-        </w:rPr>
-        <w:t xml:space="preserve"> </w:t>
-      </w:r>
-      <w:r>
-        <w:rPr>
-          <w:rFonts w:ascii="Tahoma" w:hAnsi="Tahoma" w:cs="Tahoma"/>
-          <w:sz w:val="22"/>
-          <w:szCs w:val="22"/>
-        </w:rPr>
-        <w:t>distribute</w:t>
-      </w:r>
-      <w:r>
-        <w:rPr>
-          <w:rFonts w:ascii="Tahoma" w:hAnsi="Tahoma" w:cs="Tahoma"/>
-          <w:sz w:val="22"/>
-          <w:szCs w:val="22"/>
-        </w:rPr>
-        <w:t xml:space="preserve"> as follows:</w:t>
-      </w:r>
-    </w:p>
-    <w:p>
-      <w:pPr>
-        <w:pStyle w:val="ListParagraph"/>
-        <w:numPr>
-          <w:ilvl w:val="0"/>
-          <w:numId w:val="7"/>
-        </w:numPr>
-        <w:spacing w:before="60"/>
-        <w:contextualSpacing w:val="0"/>
-        <w:rPr>
-          <w:rFonts w:ascii="Tahoma" w:hAnsi="Tahoma" w:cs="Tahoma"/>
-        </w:rPr>
-      </w:pPr>
-      <w:r>
-        <w:rPr>
-          <w:rFonts w:ascii="Tahoma" w:hAnsi="Tahoma" w:cs="Tahoma"/>
-        </w:rPr>
-        <w:t>If the defendant has an attorney, email a copy to the attorney.</w:t>
-      </w:r>
-    </w:p>
-    <w:p>
-      <w:pPr>
-        <w:pStyle w:val="ListParagraph"/>
-        <w:numPr>
-          <w:ilvl w:val="0"/>
-          <w:numId w:val="7"/>
-        </w:numPr>
-        <w:spacing w:before="60"/>
-        <w:contextualSpacing w:val="0"/>
-        <w:rPr>
-          <w:rFonts w:ascii="Tahoma" w:hAnsi="Tahoma" w:cs="Tahoma"/>
-        </w:rPr>
-      </w:pPr>
-      <w:r>
-        <w:rPr>
-          <w:rFonts w:ascii="Tahoma" w:hAnsi="Tahoma" w:cs="Tahoma"/>
-        </w:rPr>
-        <w:t>If self-represented, email a copy to the defendant.  If the defendant has not provided an email address, use regular mail instead.</w:t>
-      </w:r>
-    </w:p>
-    <w:p>
-      <w:pPr>
-        <w:pStyle w:val="ListParagraph"/>
-        <w:numPr>
-          <w:ilvl w:val="0"/>
-          <w:numId w:val="7"/>
-        </w:numPr>
-        <w:spacing w:before="60"/>
-        <w:contextualSpacing w:val="0"/>
-        <w:rPr>
-          <w:rFonts w:ascii="Tahoma" w:hAnsi="Tahoma" w:cs="Tahoma"/>
-        </w:rPr>
-      </w:pPr>
-      <w:r>
-        <w:rPr>
-          <w:rFonts w:ascii="Tahoma" w:hAnsi="Tahoma" w:cs="Tahoma"/>
-        </w:rPr>
-        <w:t>Email a copy to Pretrial Enforcement Division (PED).</w:t>
-      </w:r>
+      <w:bookmarkStart w:id="10" w:name="_GoBack"/>
+      <w:bookmarkEnd w:id="10"/>
     </w:p>
     <w:p>
       <w:pPr>
@@ -4323,7 +4412,21 @@
         <w:rStyle w:val="PageNumber"/>
         <w:rFonts w:ascii="Tahoma" w:hAnsi="Tahoma" w:cs="Tahoma"/>
       </w:rPr>
-      <w:t>234 (3/25)</w:t>
+      <w:t>234 (</w:t>
+    </w:r>
+    <w:r>
+      <w:rPr>
+        <w:rStyle w:val="PageNumber"/>
+        <w:rFonts w:ascii="Tahoma" w:hAnsi="Tahoma" w:cs="Tahoma"/>
+      </w:rPr>
+      <w:t>5</w:t>
+    </w:r>
+    <w:r>
+      <w:rPr>
+        <w:rStyle w:val="PageNumber"/>
+        <w:rFonts w:ascii="Tahoma" w:hAnsi="Tahoma" w:cs="Tahoma"/>
+      </w:rPr>
+      <w:t>/25)</w:t>
     </w:r>
     <w:r>
       <w:rPr>
@@ -4439,15 +4542,12 @@
       </w:rPr>
       <w:tab/>
     </w:r>
-    <w:hyperlink r:id="rId1" w:history="1">
-      <w:r>
-        <w:rPr>
-          <w:rStyle w:val="Hyperlink"/>
-          <w:rFonts w:ascii="Tahoma" w:hAnsi="Tahoma" w:cs="Tahoma"/>
-        </w:rPr>
-        <w:t>Administrative Bulletin 93</w:t>
-      </w:r>
-    </w:hyperlink>
+    <w:r>
+      <w:rPr>
+        <w:rFonts w:ascii="Tahoma" w:hAnsi="Tahoma" w:cs="Tahoma"/>
+      </w:rPr>
+      <w:t>Administrative Bulletin 93</w:t>
+    </w:r>
   </w:p>
 </w:ftr>
 </file>
@@ -5013,6 +5113,119 @@
     </w:lvl>
   </w:abstractNum>
   <w:abstractNum w:abstractNumId="4" w15:restartNumberingAfterBreak="0">
+    <w:nsid w:val="3101301F"/>
+    <w:multiLevelType w:val="hybridMultilevel"/>
+    <w:tmpl w:val="5A3C22F4"/>
+    <w:lvl w:ilvl="0" w:tplc="E48A1D74">
+      <w:start w:val="1"/>
+      <w:numFmt w:val="decimal"/>
+      <w:lvlText w:val="(%1)"/>
+      <w:lvlJc w:val="left"/>
+      <w:pPr>
+        <w:ind w:left="720" w:hanging="360"/>
+      </w:pPr>
+      <w:rPr>
+        <w:rFonts w:hint="default"/>
+      </w:rPr>
+    </w:lvl>
+    <w:lvl w:ilvl="1" w:tplc="04090003">
+      <w:start w:val="1"/>
+      <w:numFmt w:val="bullet"/>
+      <w:lvlText w:val="o"/>
+      <w:lvlJc w:val="left"/>
+      <w:pPr>
+        <w:ind w:left="1440" w:hanging="360"/>
+      </w:pPr>
+      <w:rPr>
+        <w:rFonts w:ascii="Courier New" w:hAnsi="Courier New" w:cs="Courier New" w:hint="default"/>
+      </w:rPr>
+    </w:lvl>
+    <w:lvl w:ilvl="2" w:tplc="04090005">
+      <w:start w:val="1"/>
+      <w:numFmt w:val="bullet"/>
+      <w:lvlText w:val=""/>
+      <w:lvlJc w:val="left"/>
+      <w:pPr>
+        <w:ind w:left="2160" w:hanging="360"/>
+      </w:pPr>
+      <w:rPr>
+        <w:rFonts w:ascii="Wingdings" w:hAnsi="Wingdings" w:hint="default"/>
+      </w:rPr>
+    </w:lvl>
+    <w:lvl w:ilvl="3" w:tplc="04090001">
+      <w:start w:val="1"/>
+      <w:numFmt w:val="bullet"/>
+      <w:lvlText w:val=""/>
+      <w:lvlJc w:val="left"/>
+      <w:pPr>
+        <w:ind w:left="2880" w:hanging="360"/>
+      </w:pPr>
+      <w:rPr>
+        <w:rFonts w:ascii="Symbol" w:hAnsi="Symbol" w:hint="default"/>
+      </w:rPr>
+    </w:lvl>
+    <w:lvl w:ilvl="4" w:tplc="04090003">
+      <w:start w:val="1"/>
+      <w:numFmt w:val="bullet"/>
+      <w:lvlText w:val="o"/>
+      <w:lvlJc w:val="left"/>
+      <w:pPr>
+        <w:ind w:left="3600" w:hanging="360"/>
+      </w:pPr>
+      <w:rPr>
+        <w:rFonts w:ascii="Courier New" w:hAnsi="Courier New" w:cs="Courier New" w:hint="default"/>
+      </w:rPr>
+    </w:lvl>
+    <w:lvl w:ilvl="5" w:tplc="04090005">
+      <w:start w:val="1"/>
+      <w:numFmt w:val="bullet"/>
+      <w:lvlText w:val=""/>
+      <w:lvlJc w:val="left"/>
+      <w:pPr>
+        <w:ind w:left="4320" w:hanging="360"/>
+      </w:pPr>
+      <w:rPr>
+        <w:rFonts w:ascii="Wingdings" w:hAnsi="Wingdings" w:hint="default"/>
+      </w:rPr>
+    </w:lvl>
+    <w:lvl w:ilvl="6" w:tplc="04090001">
+      <w:start w:val="1"/>
+      <w:numFmt w:val="bullet"/>
+      <w:lvlText w:val=""/>
+      <w:lvlJc w:val="left"/>
+      <w:pPr>
+        <w:ind w:left="5040" w:hanging="360"/>
+      </w:pPr>
+      <w:rPr>
+        <w:rFonts w:ascii="Symbol" w:hAnsi="Symbol" w:hint="default"/>
+      </w:rPr>
+    </w:lvl>
+    <w:lvl w:ilvl="7" w:tplc="04090003">
+      <w:start w:val="1"/>
+      <w:numFmt w:val="bullet"/>
+      <w:lvlText w:val="o"/>
+      <w:lvlJc w:val="left"/>
+      <w:pPr>
+        <w:ind w:left="5760" w:hanging="360"/>
+      </w:pPr>
+      <w:rPr>
+        <w:rFonts w:ascii="Courier New" w:hAnsi="Courier New" w:cs="Courier New" w:hint="default"/>
+      </w:rPr>
+    </w:lvl>
+    <w:lvl w:ilvl="8" w:tplc="04090005">
+      <w:start w:val="1"/>
+      <w:numFmt w:val="bullet"/>
+      <w:lvlText w:val=""/>
+      <w:lvlJc w:val="left"/>
+      <w:pPr>
+        <w:ind w:left="6480" w:hanging="360"/>
+      </w:pPr>
+      <w:rPr>
+        <w:rFonts w:ascii="Wingdings" w:hAnsi="Wingdings" w:hint="default"/>
+      </w:rPr>
+    </w:lvl>
+  </w:abstractNum>
+  <w:abstractNum w:abstractNumId="5" w15:restartNumberingAfterBreak="0">
     <w:nsid w:val="3569344F"/>
     <w:multiLevelType w:val="hybridMultilevel"/>
     <w:tmpl w:val="E0AA90A0"/>
@@ -5098,7 +5311,7 @@
       </w:pPr>
     </w:lvl>
   </w:abstractNum>
-  <w:abstractNum w:abstractNumId="5" w15:restartNumberingAfterBreak="0">
+  <w:abstractNum w:abstractNumId="6" w15:restartNumberingAfterBreak="0">
     <w:nsid w:val="40500DA5"/>
     <w:multiLevelType w:val="hybridMultilevel"/>
     <w:tmpl w:val="088E80BC"/>
@@ -5184,7 +5397,7 @@
       </w:pPr>
     </w:lvl>
   </w:abstractNum>
-  <w:abstractNum w:abstractNumId="6" w15:restartNumberingAfterBreak="0">
+  <w:abstractNum w:abstractNumId="7" w15:restartNumberingAfterBreak="0">
     <w:nsid w:val="5EB47059"/>
     <w:multiLevelType w:val="hybridMultilevel"/>
     <w:tmpl w:val="68504EB6"/>
@@ -5270,7 +5483,7 @@
       </w:pPr>
     </w:lvl>
   </w:abstractNum>
-  <w:abstractNum w:abstractNumId="7" w15:restartNumberingAfterBreak="0">
+  <w:abstractNum w:abstractNumId="8" w15:restartNumberingAfterBreak="0">
     <w:nsid w:val="60415A0F"/>
     <w:multiLevelType w:val="hybridMultilevel"/>
     <w:tmpl w:val="B74EDE38"/>
@@ -5359,7 +5572,7 @@
       </w:pPr>
     </w:lvl>
   </w:abstractNum>
-  <w:abstractNum w:abstractNumId="8" w15:restartNumberingAfterBreak="0">
+  <w:abstractNum w:abstractNumId="9" w15:restartNumberingAfterBreak="0">
     <w:nsid w:val="78D96756"/>
     <w:multiLevelType w:val="hybridMultilevel"/>
     <w:tmpl w:val="5A3C22F4"/>
@@ -5479,16 +5692,16 @@
     <w:abstractNumId w:val="2"/>
   </w:num>
   <w:num w:numId="3">
-    <w:abstractNumId w:val="6"/>
+    <w:abstractNumId w:val="7"/>
   </w:num>
   <w:num w:numId="4">
-    <w:abstractNumId w:val="4"/>
+    <w:abstractNumId w:val="5"/>
   </w:num>
   <w:num w:numId="5">
-    <w:abstractNumId w:val="7"/>
+    <w:abstractNumId w:val="8"/>
   </w:num>
   <w:num w:numId="6">
-    <w:abstractNumId w:val="5"/>
+    <w:abstractNumId w:val="6"/>
     <w:lvlOverride w:ilvl="0">
       <w:startOverride w:val="1"/>
     </w:lvlOverride>
@@ -5518,13 +5731,16 @@
     </w:lvlOverride>
   </w:num>
   <w:num w:numId="7">
-    <w:abstractNumId w:val="8"/>
+    <w:abstractNumId w:val="9"/>
   </w:num>
   <w:num w:numId="8">
     <w:abstractNumId w:val="3"/>
   </w:num>
   <w:num w:numId="9">
     <w:abstractNumId w:val="0"/>
+  </w:num>
+  <w:num w:numId="10">
+    <w:abstractNumId w:val="4"/>
   </w:num>
 </w:numbering>
 </file>
@@ -6421,7 +6637,7 @@
 </file>
 
 <file path=customXml/itemProps1.xml><?xml version="1.0" encoding="utf-8"?>
-<ds:datastoreItem xmlns:ds="http://schemas.openxmlformats.org/officeDocument/2006/customXml" ds:itemID="{B4814FE9-28A0-4FD1-9D1B-10EA584A3388}">
+<ds:datastoreItem xmlns:ds="http://schemas.openxmlformats.org/officeDocument/2006/customXml" ds:itemID="{04D64CDC-A8B8-4642-BDFC-7CD3228FB906}">
   <ds:schemaRefs>
     <ds:schemaRef ds:uri="http://schemas.openxmlformats.org/officeDocument/2006/bibliography"/>
   </ds:schemaRefs>

</xml_diff>

<commit_message>
bolded text on ID Money Deposit
</commit_message>
<xml_diff>
--- a/docassemble/CR234OnlineSecuredCashBondPostingAgreement/data/templates/CR234_Online_Secured_Cash_Bond_Posting_Agreement.docx
+++ b/docassemble/CR234OnlineSecuredCashBondPostingAgreement/data/templates/CR234_Online_Secured_Cash_Bond_Posting_Agreement.docx
@@ -1173,23 +1173,7 @@
           <w:sz w:val="22"/>
           <w:szCs w:val="22"/>
         </w:rPr>
-        <w:t xml:space="preserve"> == “defendant” %}</w:t>
-      </w:r>
-      <w:r>
-        <w:rPr>
-          <w:rFonts w:ascii="Tahoma" w:hAnsi="Tahoma" w:cs="Tahoma"/>
-          <w:sz w:val="22"/>
-          <w:szCs w:val="22"/>
-        </w:rPr>
-        <w:t>and if I am convicted of the offense</w:t>
-      </w:r>
-      <w:r>
-        <w:rPr>
-          <w:rFonts w:ascii="Tahoma" w:hAnsi="Tahoma" w:cs="Tahoma"/>
-          <w:sz w:val="22"/>
-          <w:szCs w:val="22"/>
-        </w:rPr>
-        <w:t xml:space="preserve">{% else %}and </w:t>
+        <w:t xml:space="preserve"> == “defendant” %}and if I am convicted of the offense{% else %}and </w:t>
       </w:r>
       <w:r>
         <w:rPr>
@@ -1233,14 +1217,8 @@
           <w:szCs w:val="22"/>
         </w:rPr>
       </w:pPr>
-      <w:r>
-        <w:rPr>
-          <w:rFonts w:ascii="Tahoma" w:hAnsi="Tahoma" w:cs="Tahoma"/>
-          <w:sz w:val="22"/>
-          <w:szCs w:val="22"/>
-        </w:rPr>
-        <w:br/>
-      </w:r>
+      <w:bookmarkStart w:id="4" w:name="_GoBack"/>
+      <w:bookmarkEnd w:id="4"/>
       <w:r>
         <w:rPr>
           <w:sz w:val="24"/>
@@ -2116,7 +2094,6 @@
           <w:sz w:val="22"/>
           <w:szCs w:val="22"/>
         </w:rPr>
-        <w:lastRenderedPageBreak/>
         <w:t>{%p else %}</w:t>
       </w:r>
     </w:p>
@@ -2141,6 +2118,7 @@
           <w:sz w:val="22"/>
           <w:szCs w:val="22"/>
         </w:rPr>
+        <w:lastRenderedPageBreak/>
         <w:t xml:space="preserve">If the defendant is in custody, the jail will not release them until the full bond amount has been posted for every case that has a bond requirement.  The court will only notify the jail </w:t>
       </w:r>
       <w:r>
@@ -3298,7 +3276,7 @@
           <w:szCs w:val="22"/>
         </w:rPr>
       </w:pPr>
-      <w:bookmarkStart w:id="4" w:name="_Hlk193959420"/>
+      <w:bookmarkStart w:id="5" w:name="_Hlk193959420"/>
       <w:r>
         <w:rPr>
           <w:rFonts w:ascii="Tahoma" w:hAnsi="Tahoma" w:cs="Tahoma"/>
@@ -3325,7 +3303,7 @@
         </w:rPr>
         <w:t xml:space="preserve"> == “defendant” %}</w:t>
       </w:r>
-      <w:bookmarkEnd w:id="4"/>
+      <w:bookmarkEnd w:id="5"/>
     </w:p>
     <w:p>
       <w:pPr>
@@ -3341,8 +3319,8 @@
           <w:szCs w:val="22"/>
         </w:rPr>
       </w:pPr>
-      <w:bookmarkStart w:id="5" w:name="_Hlk193049304"/>
-      <w:bookmarkStart w:id="6" w:name="_Hlk192677134"/>
+      <w:bookmarkStart w:id="6" w:name="_Hlk193049304"/>
+      <w:bookmarkStart w:id="7" w:name="_Hlk192677134"/>
       <w:r>
         <w:rPr>
           <w:rFonts w:ascii="Tahoma" w:hAnsi="Tahoma" w:cs="Tahoma"/>
@@ -3403,7 +3381,7 @@
           <w:szCs w:val="22"/>
         </w:rPr>
       </w:pPr>
-      <w:bookmarkStart w:id="7" w:name="_Hlk193048742"/>
+      <w:bookmarkStart w:id="8" w:name="_Hlk193048742"/>
       <w:r>
         <w:rPr>
           <w:rFonts w:ascii="Tahoma" w:hAnsi="Tahoma" w:cs="Tahoma"/>
@@ -3509,9 +3487,9 @@
           <w:szCs w:val="22"/>
         </w:rPr>
       </w:pPr>
-      <w:bookmarkStart w:id="8" w:name="_Hlk199503133"/>
-      <w:bookmarkEnd w:id="5"/>
-      <w:bookmarkEnd w:id="7"/>
+      <w:bookmarkStart w:id="9" w:name="_Hlk199503133"/>
+      <w:bookmarkEnd w:id="6"/>
+      <w:bookmarkEnd w:id="8"/>
       <w:r>
         <w:rPr>
           <w:rFonts w:ascii="Tahoma" w:hAnsi="Tahoma" w:cs="Tahoma"/>
@@ -3558,7 +3536,7 @@
         <w:t>lerk</w:t>
       </w:r>
     </w:p>
-    <w:bookmarkEnd w:id="8"/>
+    <w:bookmarkEnd w:id="9"/>
     <w:p>
       <w:pPr>
         <w:pStyle w:val="Footer"/>
@@ -3671,7 +3649,7 @@
         </w:rPr>
         <w:t>Email a copy to Pretrial Enforcement Division (PED).</w:t>
       </w:r>
-      <w:bookmarkEnd w:id="6"/>
+      <w:bookmarkEnd w:id="7"/>
     </w:p>
     <w:p>
       <w:pPr>
@@ -3709,7 +3687,7 @@
           <w:szCs w:val="22"/>
         </w:rPr>
       </w:pPr>
-      <w:bookmarkStart w:id="9" w:name="_Hlk193049359"/>
+      <w:bookmarkStart w:id="10" w:name="_Hlk193049359"/>
       <w:r>
         <w:rPr>
           <w:rFonts w:ascii="Tahoma" w:hAnsi="Tahoma" w:cs="Tahoma"/>
@@ -3945,7 +3923,7 @@
         </w:rPr>
         <w:t>Trial Court Clerk</w:t>
       </w:r>
-      <w:bookmarkEnd w:id="9"/>
+      <w:bookmarkEnd w:id="10"/>
     </w:p>
     <w:p>
       <w:pPr>
@@ -4202,8 +4180,6 @@
         </w:rPr>
         <w:t>Give a copy to Pretrial Enforcement Division (PED).</w:t>
       </w:r>
-      <w:bookmarkStart w:id="10" w:name="_GoBack"/>
-      <w:bookmarkEnd w:id="10"/>
     </w:p>
     <w:p>
       <w:pPr>
@@ -4236,7 +4212,6 @@
       <w:pgSz w:w="12240" w:h="15840" w:code="1"/>
       <w:pgMar w:top="990" w:right="1440" w:bottom="720" w:left="1440" w:header="720" w:footer="432" w:gutter="0"/>
       <w:cols w:space="720"/>
-      <w:titlePg/>
       <w:docGrid w:linePitch="272"/>
     </w:sectPr>
   </w:body>
@@ -4266,13 +4241,12 @@
 <w:ftr xmlns:wpc="http://schemas.microsoft.com/office/word/2010/wordprocessingCanvas" xmlns:cx="http://schemas.microsoft.com/office/drawing/2014/chartex" xmlns:cx1="http://schemas.microsoft.com/office/drawing/2015/9/8/chartex" xmlns:cx2="http://schemas.microsoft.com/office/drawing/2015/10/21/chartex" xmlns:cx3="http://schemas.microsoft.com/office/drawing/2016/5/9/chartex" xmlns:cx4="http://schemas.microsoft.com/office/drawing/2016/5/10/chartex" xmlns:cx5="http://schemas.microsoft.com/office/drawing/2016/5/11/chartex" xmlns:cx6="http://schemas.microsoft.com/office/drawing/2016/5/12/chartex" xmlns:cx7="http://schemas.microsoft.com/office/drawing/2016/5/13/chartex" xmlns:cx8="http://schemas.microsoft.com/office/drawing/2016/5/14/chartex" xmlns:mc="http://schemas.openxmlformats.org/markup-compatibility/2006" xmlns:aink="http://schemas.microsoft.com/office/drawing/2016/ink" xmlns:am3d="http://schemas.microsoft.com/office/drawing/2017/model3d" xmlns:o="urn:schemas-microsoft-com:office:office" xmlns:r="http://schemas.openxmlformats.org/officeDocument/2006/relationships" xmlns:m="http://schemas.openxmlformats.org/officeDocument/2006/math" xmlns:v="urn:schemas-microsoft-com:vml" xmlns:wp14="http://schemas.microsoft.com/office/word/2010/wordprocessingDrawing" xmlns:wp="http://schemas.openxmlformats.org/drawingml/2006/wordprocessingDrawing" xmlns:w10="urn:schemas-microsoft-com:office:word" xmlns:w="http://schemas.openxmlformats.org/wordprocessingml/2006/main" xmlns:w14="http://schemas.microsoft.com/office/word/2010/wordml" xmlns:w15="http://schemas.microsoft.com/office/word/2012/wordml" xmlns:w16cid="http://schemas.microsoft.com/office/word/2016/wordml/cid" xmlns:w16se="http://schemas.microsoft.com/office/word/2015/wordml/symex" xmlns:wpg="http://schemas.microsoft.com/office/word/2010/wordprocessingGroup" xmlns:wpi="http://schemas.microsoft.com/office/word/2010/wordprocessingInk" xmlns:wne="http://schemas.microsoft.com/office/word/2006/wordml" xmlns:wps="http://schemas.microsoft.com/office/word/2010/wordprocessingShape" mc:Ignorable="w14 w15 w16se w16cid wp14">
   <w:sdt>
     <w:sdtPr>
-      <w:id w:val="2088504538"/>
+      <w:id w:val="-2101874562"/>
       <w:docPartObj>
         <w:docPartGallery w:val="Page Numbers (Bottom of Page)"/>
         <w:docPartUnique/>
       </w:docPartObj>
     </w:sdtPr>
-    <w:sdtEndPr/>
     <w:sdtContent>
       <w:sdt>
         <w:sdtPr>
@@ -4282,7 +4256,6 @@
             <w:docPartUnique/>
           </w:docPartObj>
         </w:sdtPr>
-        <w:sdtEndPr/>
         <w:sdtContent>
           <w:p>
             <w:pPr>
@@ -4297,7 +4270,6 @@
             <w:r>
               <w:rPr>
                 <w:rFonts w:ascii="Tahoma" w:hAnsi="Tahoma" w:cs="Tahoma"/>
-                <w:b/>
                 <w:bCs/>
               </w:rPr>
               <w:fldChar w:fldCharType="begin"/>
@@ -4305,7 +4277,6 @@
             <w:r>
               <w:rPr>
                 <w:rFonts w:ascii="Tahoma" w:hAnsi="Tahoma" w:cs="Tahoma"/>
-                <w:b/>
                 <w:bCs/>
               </w:rPr>
               <w:instrText xml:space="preserve"> PAGE </w:instrText>
@@ -4313,7 +4284,6 @@
             <w:r>
               <w:rPr>
                 <w:rFonts w:ascii="Tahoma" w:hAnsi="Tahoma" w:cs="Tahoma"/>
-                <w:b/>
                 <w:bCs/>
               </w:rPr>
               <w:fldChar w:fldCharType="separate"/>
@@ -4321,7 +4291,6 @@
             <w:r>
               <w:rPr>
                 <w:rFonts w:ascii="Tahoma" w:hAnsi="Tahoma" w:cs="Tahoma"/>
-                <w:b/>
                 <w:bCs/>
                 <w:noProof/>
               </w:rPr>
@@ -4330,7 +4299,6 @@
             <w:r>
               <w:rPr>
                 <w:rFonts w:ascii="Tahoma" w:hAnsi="Tahoma" w:cs="Tahoma"/>
-                <w:b/>
                 <w:bCs/>
               </w:rPr>
               <w:fldChar w:fldCharType="end"/>
@@ -4344,7 +4312,6 @@
             <w:r>
               <w:rPr>
                 <w:rFonts w:ascii="Tahoma" w:hAnsi="Tahoma" w:cs="Tahoma"/>
-                <w:b/>
                 <w:bCs/>
               </w:rPr>
               <w:fldChar w:fldCharType="begin"/>
@@ -4352,7 +4319,6 @@
             <w:r>
               <w:rPr>
                 <w:rFonts w:ascii="Tahoma" w:hAnsi="Tahoma" w:cs="Tahoma"/>
-                <w:b/>
                 <w:bCs/>
               </w:rPr>
               <w:instrText xml:space="preserve"> NUMPAGES  </w:instrText>
@@ -4360,7 +4326,6 @@
             <w:r>
               <w:rPr>
                 <w:rFonts w:ascii="Tahoma" w:hAnsi="Tahoma" w:cs="Tahoma"/>
-                <w:b/>
                 <w:bCs/>
               </w:rPr>
               <w:fldChar w:fldCharType="separate"/>
@@ -4368,7 +4333,6 @@
             <w:r>
               <w:rPr>
                 <w:rFonts w:ascii="Tahoma" w:hAnsi="Tahoma" w:cs="Tahoma"/>
-                <w:b/>
                 <w:bCs/>
                 <w:noProof/>
               </w:rPr>
@@ -4377,7 +4341,6 @@
             <w:r>
               <w:rPr>
                 <w:rFonts w:ascii="Tahoma" w:hAnsi="Tahoma" w:cs="Tahoma"/>
-                <w:b/>
                 <w:bCs/>
               </w:rPr>
               <w:fldChar w:fldCharType="end"/>
@@ -4412,21 +4375,7 @@
         <w:rStyle w:val="PageNumber"/>
         <w:rFonts w:ascii="Tahoma" w:hAnsi="Tahoma" w:cs="Tahoma"/>
       </w:rPr>
-      <w:t>234 (</w:t>
-    </w:r>
-    <w:r>
-      <w:rPr>
-        <w:rStyle w:val="PageNumber"/>
-        <w:rFonts w:ascii="Tahoma" w:hAnsi="Tahoma" w:cs="Tahoma"/>
-      </w:rPr>
-      <w:t>5</w:t>
-    </w:r>
-    <w:r>
-      <w:rPr>
-        <w:rStyle w:val="PageNumber"/>
-        <w:rFonts w:ascii="Tahoma" w:hAnsi="Tahoma" w:cs="Tahoma"/>
-      </w:rPr>
-      <w:t>/25)</w:t>
+      <w:t>234 (5/25)</w:t>
     </w:r>
     <w:r>
       <w:rPr>
@@ -4517,8 +4466,9 @@
       </w:tabs>
       <w:spacing w:line="220" w:lineRule="exact"/>
       <w:rPr>
-        <w:rStyle w:val="Hyperlink"/>
         <w:rFonts w:ascii="Tahoma" w:hAnsi="Tahoma" w:cs="Tahoma"/>
+        <w:color w:val="0000FF" w:themeColor="hyperlink"/>
+        <w:u w:val="single"/>
       </w:rPr>
     </w:pPr>
     <w:r>
@@ -4657,7 +4607,7 @@
         <w:rStyle w:val="PageNumber"/>
         <w:rFonts w:ascii="Tahoma" w:hAnsi="Tahoma" w:cs="Tahoma"/>
       </w:rPr>
-      <w:t>234 (3/25)</w:t>
+      <w:t>234 (5/25)</w:t>
     </w:r>
     <w:r>
       <w:rPr>
@@ -6637,7 +6587,7 @@
 </file>
 
 <file path=customXml/itemProps1.xml><?xml version="1.0" encoding="utf-8"?>
-<ds:datastoreItem xmlns:ds="http://schemas.openxmlformats.org/officeDocument/2006/customXml" ds:itemID="{04D64CDC-A8B8-4642-BDFC-7CD3228FB906}">
+<ds:datastoreItem xmlns:ds="http://schemas.openxmlformats.org/officeDocument/2006/customXml" ds:itemID="{E5E12C09-718C-41AF-AB9B-A839C2A893E6}">
   <ds:schemaRefs>
     <ds:schemaRef ds:uri="http://schemas.openxmlformats.org/officeDocument/2006/bibliography"/>
   </ds:schemaRefs>

</xml_diff>